<commit_message>
scripts: one-command server install (Windows + macOS) + guide rework
Add Install-OpenTrackServer.ps1 (PowerShell/Task Scheduler) and
install-opentrack-server.sh (bash/launchd): install prereqs, get source, build
Web (5035) + API (5003), point both at one shared SQLite DB, open firewall,
register boot auto-start, optional local AI (Ollama), print finish-up steps;
re-run to update. Shared opentrack-server.sample.conf (same keys both OSes).

Rework the Installation Guide: Chapter 2 now leads with the one-command script
(On Windows / On a Mac), by-hand steps kept as a fallback; Chapter 1 lists a Mac
mini as a server option (great for local AI). All screenshot placeholders removed.

Co-Authored-By: Claude Opus 4.8 <noreply@anthropic.com>
</commit_message>
<xml_diff>
--- a/docs/guides/OpenTrack_Installation_Guide.docx
+++ b/docs/guides/OpenTrack_Installation_Guide.docx
@@ -152,7 +152,7 @@
                 <w:color w:val="9FB3CC"/>
                 <w:sz w:val="20"/>
               </w:rPr>
-              <w:t>August 11, 2026</w:t>
+              <w:t>August 12, 2026</w:t>
             </w:r>
           </w:p>
         </w:tc>
@@ -572,7 +572,7 @@
                 <w:b/>
                 <w:sz w:val="19"/>
               </w:rPr>
-              <w:t>mini-PC</w:t>
+              <w:t>mini-PC or Mac mini</w:t>
             </w:r>
             <w:r>
               <w:rPr>
@@ -1101,7 +1101,25 @@
         <w:t>any always-on computer</w:t>
       </w:r>
       <w:r>
-        <w:t xml:space="preserve"> that meets the modest requirements below — a mini-PC (the author uses a Beelink EQi12, but any brand works), a small desktop, or even a spare laptop. It just needs to stay powered on and on your network. This guide runs Windows on it.</w:t>
+        <w:t xml:space="preserve"> that meets the modest requirements below — a Windows mini-PC (the author uses a Beelink EQi12, but any brand works), a small desktop, a spare laptop, or a </w:t>
+      </w:r>
+      <w:r>
+        <w:rPr>
+          <w:b/>
+        </w:rPr>
+        <w:t>Mac mini</w:t>
+      </w:r>
+      <w:r>
+        <w:t xml:space="preserve">. It just needs to stay powered on and on your network. This guide sets it up on </w:t>
+      </w:r>
+      <w:r>
+        <w:rPr>
+          <w:b/>
+        </w:rPr>
+        <w:t>Windows or macOS</w:t>
+      </w:r>
+      <w:r>
+        <w:t xml:space="preserve"> — pick whichever you have.</w:t>
       </w:r>
     </w:p>
     <w:tbl>
@@ -1545,7 +1563,20 @@
               <w:rPr>
                 <w:sz w:val="19"/>
               </w:rPr>
-              <w:t>Windows 10/11 (64-bit)</w:t>
+              <w:t xml:space="preserve">Windows 10/11 (64-bit) </w:t>
+            </w:r>
+            <w:r>
+              <w:rPr>
+                <w:b/>
+                <w:sz w:val="19"/>
+              </w:rPr>
+              <w:t>or</w:t>
+            </w:r>
+            <w:r>
+              <w:rPr>
+                <w:sz w:val="19"/>
+              </w:rPr>
+              <w:t xml:space="preserve"> macOS 13+</w:t>
             </w:r>
           </w:p>
         </w:tc>
@@ -1570,7 +1601,7 @@
               <w:rPr>
                 <w:sz w:val="19"/>
               </w:rPr>
-              <w:t>Windows 11</w:t>
+              <w:t>Windows 11, or macOS on Apple Silicon</w:t>
             </w:r>
           </w:p>
         </w:tc>
@@ -1701,13 +1732,26 @@
                 <w:color w:val="1F3A5F"/>
                 <w:sz w:val="21"/>
               </w:rPr>
-              <w:t xml:space="preserve">PICK ANY BRAND   </w:t>
+              <w:t xml:space="preserve">WINDOWS PC OR MAC MINI — EITHER WORKS   </w:t>
             </w:r>
             <w:r>
               <w:rPr>
                 <w:color w:val="222B38"/>
               </w:rPr>
-              <w:t>There's nothing special about a Beelink — it's just a quiet, low-power mini-PC that's easy to leave on. Any machine meeting the specs above works the same way. More RAM only matters if you also host the optional local AI (Chapter 3).</w:t>
+              <w:t xml:space="preserve">There's nothing special about a Beelink — it's just a quiet, low-power mini-PC that's easy to leave on. Any machine meeting the specs above works the same way. A </w:t>
+            </w:r>
+            <w:r>
+              <w:rPr>
+                <w:b/>
+                <w:color w:val="222B38"/>
+              </w:rPr>
+              <w:t>Mac mini (Apple Silicon)</w:t>
+            </w:r>
+            <w:r>
+              <w:rPr>
+                <w:color w:val="222B38"/>
+              </w:rPr>
+              <w:t xml:space="preserve"> is an excellent choice too, and its unified memory makes the optional local AI (Chapter 3) notably faster. More RAM only matters if you also host that local AI.</w:t>
             </w:r>
           </w:p>
         </w:tc>
@@ -2097,7 +2141,7 @@
                 <w:color w:val="1F3A5F"/>
                 <w:sz w:val="44"/>
               </w:rPr>
-              <w:t>Set Up the Server (Your Mini-PC)</w:t>
+              <w:t>Set Up the Server (Windows or a Mac)</w:t>
             </w:r>
           </w:p>
         </w:tc>
@@ -2118,7 +2162,7 @@
           <w:color w:val="64748B"/>
           <w:sz w:val="23"/>
         </w:rPr>
-        <w:t>Prepare Windows, put the data on the D: drive, build OpenTrack, and run it for the whole network.</w:t>
+        <w:t>Run one setup script that installs, builds, and starts the whole server — with by-hand steps as a fallback.</w:t>
       </w:r>
     </w:p>
     <w:p>
@@ -2150,7 +2194,7 @@
           <w:color w:val="222B38"/>
           <w:sz w:val="20"/>
         </w:rPr>
-        <w:t>•  Prepare Windows and the two drives (app on C:, data on D:)</w:t>
+        <w:t>•  The easy way: run the one-command setup script</w:t>
       </w:r>
     </w:p>
     <w:p>
@@ -2163,7 +2207,7 @@
           <w:color w:val="222B38"/>
           <w:sz w:val="20"/>
         </w:rPr>
-        <w:t>•  Install the free .NET tools and download OpenTrack</w:t>
+        <w:t>•  Change ports, the data location, or add the AI with a settings file</w:t>
       </w:r>
     </w:p>
     <w:p>
@@ -2176,7 +2220,7 @@
           <w:color w:val="222B38"/>
           <w:sz w:val="20"/>
         </w:rPr>
-        <w:t>•  Build and run the server so the whole LAN can reach it</w:t>
+        <w:t>•  Create the first administrator</w:t>
       </w:r>
     </w:p>
     <w:p>
@@ -2189,12 +2233,1260 @@
           <w:color w:val="222B38"/>
           <w:sz w:val="20"/>
         </w:rPr>
-        <w:t>•  Open the firewall, auto-start at boot, and create the first administrator</w:t>
+        <w:t>•  The by-hand alternative, step by step, if you'd rather not use the script</w:t>
       </w:r>
     </w:p>
     <w:p>
       <w:pPr>
         <w:spacing w:after="40"/>
+      </w:pPr>
+    </w:p>
+    <w:p>
+      <w:pPr>
+        <w:pStyle w:val="Heading1"/>
+      </w:pPr>
+      <w:r>
+        <w:t>The easy way: one setup script</w:t>
+      </w:r>
+    </w:p>
+    <w:p>
+      <w:r>
+        <w:t xml:space="preserve">Almost everything in this chapter is automated by a </w:t>
+      </w:r>
+      <w:r>
+        <w:rPr>
+          <w:b/>
+        </w:rPr>
+        <w:t>setup script</w:t>
+      </w:r>
+      <w:r>
+        <w:t xml:space="preserve"> that ships with OpenTrack — a PowerShell script for </w:t>
+      </w:r>
+      <w:r>
+        <w:rPr>
+          <w:b/>
+        </w:rPr>
+        <w:t>Windows</w:t>
+      </w:r>
+      <w:r>
+        <w:t xml:space="preserve"> (</w:t>
+      </w:r>
+      <w:r>
+        <w:rPr>
+          <w:rFonts w:ascii="Consolas" w:hAnsi="Consolas"/>
+          <w:sz w:val="19"/>
+        </w:rPr>
+        <w:t>Install-OpenTrackServer.ps1</w:t>
+      </w:r>
+      <w:r>
+        <w:t xml:space="preserve">) and a bash script for </w:t>
+      </w:r>
+      <w:r>
+        <w:rPr>
+          <w:b/>
+        </w:rPr>
+        <w:t>macOS</w:t>
+      </w:r>
+      <w:r>
+        <w:t xml:space="preserve"> (</w:t>
+      </w:r>
+      <w:r>
+        <w:rPr>
+          <w:rFonts w:ascii="Consolas" w:hAnsi="Consolas"/>
+          <w:sz w:val="19"/>
+        </w:rPr>
+        <w:t>install-opentrack-server.sh</w:t>
+      </w:r>
+      <w:r>
+        <w:t xml:space="preserve">), both in the </w:t>
+      </w:r>
+      <w:r>
+        <w:rPr>
+          <w:rFonts w:ascii="Consolas" w:hAnsi="Consolas"/>
+          <w:sz w:val="19"/>
+        </w:rPr>
+        <w:t>scripts</w:t>
+      </w:r>
+      <w:r>
+        <w:t xml:space="preserve"> folder. Either one installs the tools it needs (the .NET 10 Software Development Kit and Git), downloads and builds OpenTrack, points the web app and the API at one shared database, sets up networking, and registers both programs to start automatically at boot. You run it once; re-run it anytime to update.</w:t>
+      </w:r>
+    </w:p>
+    <w:tbl>
+      <w:tblPr>
+        <w:tblW w:type="auto" w:w="0"/>
+        <w:jc w:val="center"/>
+        <w:tblLayout w:type="fixed"/>
+        <w:tblLook w:firstColumn="1" w:firstRow="1" w:lastColumn="0" w:lastRow="0" w:noHBand="0" w:noVBand="1" w:val="04A0"/>
+      </w:tblPr>
+      <w:tblGrid>
+        <w:gridCol w:w="9360"/>
+      </w:tblGrid>
+      <w:tr>
+        <w:trPr>
+          <w:cantSplit/>
+        </w:trPr>
+        <w:tc>
+          <w:tcPr>
+            <w:tcW w:type="dxa" w:w="9360"/>
+            <w:shd w:val="clear" w:color="auto" w:fill="E7F0FA"/>
+            <w:tcBorders>
+              <w:top w:val="single" w:sz="4" w:space="0" w:color="2E6DA4"/>
+              <w:left w:val="single" w:sz="30" w:space="0" w:color="2E6DA4"/>
+              <w:bottom w:val="single" w:sz="4" w:space="0" w:color="2E6DA4"/>
+              <w:right w:val="single" w:sz="4" w:space="0" w:color="2E6DA4"/>
+            </w:tcBorders>
+            <w:tcMar>
+              <w:top w:w="110" w:type="dxa"/>
+              <w:start w:w="170" w:type="dxa"/>
+              <w:bottom w:w="110" w:type="dxa"/>
+              <w:end w:w="170" w:type="dxa"/>
+            </w:tcMar>
+          </w:tcPr>
+          <w:p>
+            <w:pPr>
+              <w:spacing w:after="0"/>
+            </w:pPr>
+            <w:r>
+              <w:rPr>
+                <w:b/>
+                <w:color w:val="1F3A5F"/>
+                <w:sz w:val="21"/>
+              </w:rPr>
+              <w:t xml:space="preserve">WHAT YOU NEED FIRST   </w:t>
+            </w:r>
+            <w:r>
+              <w:rPr>
+                <w:color w:val="222B38"/>
+              </w:rPr>
+              <w:t xml:space="preserve">A Windows 10/11 </w:t>
+            </w:r>
+            <w:r>
+              <w:rPr>
+                <w:b/>
+                <w:color w:val="222B38"/>
+              </w:rPr>
+              <w:t>or</w:t>
+            </w:r>
+            <w:r>
+              <w:rPr>
+                <w:color w:val="222B38"/>
+              </w:rPr>
+              <w:t xml:space="preserve"> macOS 13+ machine, an internet connection, and about 10–15 minutes. The script needs elevated rights (it runs as </w:t>
+            </w:r>
+            <w:r>
+              <w:rPr>
+                <w:b/>
+                <w:color w:val="222B38"/>
+              </w:rPr>
+              <w:t>Administrator</w:t>
+            </w:r>
+            <w:r>
+              <w:rPr>
+                <w:color w:val="222B38"/>
+              </w:rPr>
+              <w:t xml:space="preserve"> on Windows, or asks for your password for </w:t>
+            </w:r>
+            <w:r>
+              <w:rPr>
+                <w:rFonts w:ascii="Consolas" w:hAnsi="Consolas"/>
+                <w:color w:val="222B38"/>
+                <w:sz w:val="19"/>
+              </w:rPr>
+              <w:t>sudo</w:t>
+            </w:r>
+            <w:r>
+              <w:rPr>
+                <w:color w:val="222B38"/>
+              </w:rPr>
+              <w:t xml:space="preserve"> on a Mac) to set up networking and auto-start. It installs the .NET SDK and Git for you if they're missing.</w:t>
+            </w:r>
+          </w:p>
+        </w:tc>
+      </w:tr>
+    </w:tbl>
+    <w:p>
+      <w:pPr>
+        <w:spacing w:after="80"/>
+      </w:pPr>
+    </w:p>
+    <w:p>
+      <w:pPr>
+        <w:pStyle w:val="Heading2"/>
+      </w:pPr>
+      <w:r>
+        <w:t>On Windows</w:t>
+      </w:r>
+    </w:p>
+    <w:p>
+      <w:pPr>
+        <w:tabs>
+          <w:tab w:pos="547" w:val="left"/>
+        </w:tabs>
+        <w:spacing w:after="100"/>
+        <w:ind w:left="547" w:hanging="547"/>
+      </w:pPr>
+      <w:r>
+        <w:rPr>
+          <w:b/>
+          <w:color w:val="1F3A5F"/>
+        </w:rPr>
+        <w:t>1.</w:t>
+        <w:tab/>
+      </w:r>
+      <w:r>
+        <w:t xml:space="preserve">Get the OpenTrack code onto the server: on the project's GitHub page click the green </w:t>
+      </w:r>
+      <w:r>
+        <w:rPr>
+          <w:b/>
+        </w:rPr>
+        <w:t>Code</w:t>
+      </w:r>
+      <w:r>
+        <w:t xml:space="preserve"> button → </w:t>
+      </w:r>
+      <w:r>
+        <w:rPr>
+          <w:b/>
+        </w:rPr>
+        <w:t>Download ZIP</w:t>
+      </w:r>
+      <w:r>
+        <w:t xml:space="preserve">, then unzip it (for example to </w:t>
+      </w:r>
+      <w:r>
+        <w:rPr>
+          <w:rFonts w:ascii="Consolas" w:hAnsi="Consolas"/>
+          <w:sz w:val="19"/>
+        </w:rPr>
+        <w:t>C:\OpenTrack</w:t>
+      </w:r>
+      <w:r>
+        <w:t xml:space="preserve">). Or, if you already have Git, </w:t>
+      </w:r>
+      <w:r>
+        <w:rPr>
+          <w:rFonts w:ascii="Consolas" w:hAnsi="Consolas"/>
+          <w:sz w:val="19"/>
+        </w:rPr>
+        <w:t>git clone https://github.com/KE4CON/OpenTrack.git</w:t>
+      </w:r>
+      <w:r>
+        <w:t>.</w:t>
+      </w:r>
+    </w:p>
+    <w:p>
+      <w:pPr>
+        <w:tabs>
+          <w:tab w:pos="547" w:val="left"/>
+        </w:tabs>
+        <w:spacing w:after="100"/>
+        <w:ind w:left="547" w:hanging="547"/>
+      </w:pPr>
+      <w:r>
+        <w:rPr>
+          <w:b/>
+          <w:color w:val="1F3A5F"/>
+        </w:rPr>
+        <w:t>2.</w:t>
+        <w:tab/>
+      </w:r>
+      <w:r>
+        <w:t xml:space="preserve">Open </w:t>
+      </w:r>
+      <w:r>
+        <w:rPr>
+          <w:b/>
+        </w:rPr>
+        <w:t>PowerShell as Administrator</w:t>
+      </w:r>
+      <w:r>
+        <w:t xml:space="preserve">: right-click the Start button → </w:t>
+      </w:r>
+      <w:r>
+        <w:rPr>
+          <w:b/>
+        </w:rPr>
+        <w:t>Terminal (Admin)</w:t>
+      </w:r>
+      <w:r>
+        <w:t xml:space="preserve"> (or </w:t>
+      </w:r>
+      <w:r>
+        <w:rPr>
+          <w:b/>
+        </w:rPr>
+        <w:t>Windows PowerShell (Admin)</w:t>
+      </w:r>
+      <w:r>
+        <w:t>).</w:t>
+      </w:r>
+    </w:p>
+    <w:p>
+      <w:pPr>
+        <w:tabs>
+          <w:tab w:pos="547" w:val="left"/>
+        </w:tabs>
+        <w:spacing w:after="100"/>
+        <w:ind w:left="547" w:hanging="547"/>
+      </w:pPr>
+      <w:r>
+        <w:rPr>
+          <w:b/>
+          <w:color w:val="1F3A5F"/>
+        </w:rPr>
+        <w:t>3.</w:t>
+        <w:tab/>
+      </w:r>
+      <w:r>
+        <w:t xml:space="preserve">Go to the </w:t>
+      </w:r>
+      <w:r>
+        <w:rPr>
+          <w:rFonts w:ascii="Consolas" w:hAnsi="Consolas"/>
+          <w:sz w:val="19"/>
+        </w:rPr>
+        <w:t>scripts</w:t>
+      </w:r>
+      <w:r>
+        <w:t xml:space="preserve"> folder inside the code you just unzipped, and run the setup script:</w:t>
+      </w:r>
+    </w:p>
+    <w:tbl>
+      <w:tblPr>
+        <w:tblW w:type="auto" w:w="0"/>
+        <w:jc w:val="center"/>
+        <w:tblLayout w:type="fixed"/>
+        <w:tblLook w:firstColumn="1" w:firstRow="1" w:lastColumn="0" w:lastRow="0" w:noHBand="0" w:noVBand="1" w:val="04A0"/>
+      </w:tblPr>
+      <w:tblGrid>
+        <w:gridCol w:w="9360"/>
+      </w:tblGrid>
+      <w:tr>
+        <w:trPr>
+          <w:cantSplit/>
+        </w:trPr>
+        <w:tc>
+          <w:tcPr>
+            <w:tcW w:type="dxa" w:w="9360"/>
+            <w:shd w:val="clear" w:color="auto" w:fill="F3F4F6"/>
+            <w:tcBorders>
+              <w:top w:val="single" w:sz="2" w:space="0" w:color="CBD5E1"/>
+              <w:left w:val="single" w:sz="18" w:space="0" w:color="B7C0CC"/>
+              <w:bottom w:val="single" w:sz="2" w:space="0" w:color="CBD5E1"/>
+              <w:right w:val="single" w:sz="2" w:space="0" w:color="CBD5E1"/>
+            </w:tcBorders>
+            <w:tcMar>
+              <w:top w:w="80" w:type="dxa"/>
+              <w:start w:w="150" w:type="dxa"/>
+              <w:bottom w:w="80" w:type="dxa"/>
+              <w:end w:w="150" w:type="dxa"/>
+            </w:tcMar>
+          </w:tcPr>
+          <w:p>
+            <w:pPr>
+              <w:spacing w:after="0"/>
+            </w:pPr>
+            <w:r>
+              <w:rPr>
+                <w:rFonts w:ascii="Consolas" w:hAnsi="Consolas"/>
+                <w:color w:val="222B38"/>
+                <w:sz w:val="19"/>
+              </w:rPr>
+              <w:t>cd C:\OpenTrack\OpenTrack\scripts</w:t>
+            </w:r>
+          </w:p>
+          <w:p>
+            <w:pPr>
+              <w:spacing w:after="0"/>
+            </w:pPr>
+            <w:r>
+              <w:rPr>
+                <w:rFonts w:ascii="Consolas" w:hAnsi="Consolas"/>
+                <w:color w:val="222B38"/>
+                <w:sz w:val="19"/>
+              </w:rPr>
+              <w:t>powershell -ExecutionPolicy Bypass -File .\Install-OpenTrackServer.ps1</w:t>
+            </w:r>
+          </w:p>
+        </w:tc>
+      </w:tr>
+    </w:tbl>
+    <w:p>
+      <w:pPr>
+        <w:spacing w:after="60"/>
+      </w:pPr>
+    </w:p>
+    <w:p>
+      <w:pPr>
+        <w:pStyle w:val="Heading2"/>
+      </w:pPr>
+      <w:r>
+        <w:t>On a Mac</w:t>
+      </w:r>
+    </w:p>
+    <w:p>
+      <w:pPr>
+        <w:tabs>
+          <w:tab w:pos="547" w:val="left"/>
+        </w:tabs>
+        <w:spacing w:after="100"/>
+        <w:ind w:left="547" w:hanging="547"/>
+      </w:pPr>
+      <w:r>
+        <w:rPr>
+          <w:b/>
+          <w:color w:val="1F3A5F"/>
+        </w:rPr>
+        <w:t>1.</w:t>
+        <w:tab/>
+      </w:r>
+      <w:r>
+        <w:t xml:space="preserve">Get the OpenTrack code onto the Mac the same way — </w:t>
+      </w:r>
+      <w:r>
+        <w:rPr>
+          <w:b/>
+        </w:rPr>
+        <w:t>Download ZIP</w:t>
+      </w:r>
+      <w:r>
+        <w:t xml:space="preserve"> from the GitHub </w:t>
+      </w:r>
+      <w:r>
+        <w:rPr>
+          <w:b/>
+        </w:rPr>
+        <w:t>Code</w:t>
+      </w:r>
+      <w:r>
+        <w:t xml:space="preserve"> button and unzip it (into your home folder, say), or </w:t>
+      </w:r>
+      <w:r>
+        <w:rPr>
+          <w:rFonts w:ascii="Consolas" w:hAnsi="Consolas"/>
+          <w:sz w:val="19"/>
+        </w:rPr>
+        <w:t>git clone</w:t>
+      </w:r>
+      <w:r>
+        <w:t xml:space="preserve"> it if you have Git.</w:t>
+      </w:r>
+    </w:p>
+    <w:p>
+      <w:pPr>
+        <w:tabs>
+          <w:tab w:pos="547" w:val="left"/>
+        </w:tabs>
+        <w:spacing w:after="100"/>
+        <w:ind w:left="547" w:hanging="547"/>
+      </w:pPr>
+      <w:r>
+        <w:rPr>
+          <w:b/>
+          <w:color w:val="1F3A5F"/>
+        </w:rPr>
+        <w:t>2.</w:t>
+        <w:tab/>
+      </w:r>
+      <w:r>
+        <w:t xml:space="preserve">Open the </w:t>
+      </w:r>
+      <w:r>
+        <w:rPr>
+          <w:b/>
+        </w:rPr>
+        <w:t>Terminal</w:t>
+      </w:r>
+      <w:r>
+        <w:t xml:space="preserve"> app (Applications → Utilities → Terminal).</w:t>
+      </w:r>
+    </w:p>
+    <w:p>
+      <w:pPr>
+        <w:tabs>
+          <w:tab w:pos="547" w:val="left"/>
+        </w:tabs>
+        <w:spacing w:after="100"/>
+        <w:ind w:left="547" w:hanging="547"/>
+      </w:pPr>
+      <w:r>
+        <w:rPr>
+          <w:b/>
+          <w:color w:val="1F3A5F"/>
+        </w:rPr>
+        <w:t>3.</w:t>
+        <w:tab/>
+      </w:r>
+      <w:r>
+        <w:t xml:space="preserve">Go to the </w:t>
+      </w:r>
+      <w:r>
+        <w:rPr>
+          <w:rFonts w:ascii="Consolas" w:hAnsi="Consolas"/>
+          <w:sz w:val="19"/>
+        </w:rPr>
+        <w:t>scripts</w:t>
+      </w:r>
+      <w:r>
+        <w:t xml:space="preserve"> folder, make the script executable, and run it. It asks for your password once, for the always-on setup:</w:t>
+      </w:r>
+    </w:p>
+    <w:tbl>
+      <w:tblPr>
+        <w:tblW w:type="auto" w:w="0"/>
+        <w:jc w:val="center"/>
+        <w:tblLayout w:type="fixed"/>
+        <w:tblLook w:firstColumn="1" w:firstRow="1" w:lastColumn="0" w:lastRow="0" w:noHBand="0" w:noVBand="1" w:val="04A0"/>
+      </w:tblPr>
+      <w:tblGrid>
+        <w:gridCol w:w="9360"/>
+      </w:tblGrid>
+      <w:tr>
+        <w:trPr>
+          <w:cantSplit/>
+        </w:trPr>
+        <w:tc>
+          <w:tcPr>
+            <w:tcW w:type="dxa" w:w="9360"/>
+            <w:shd w:val="clear" w:color="auto" w:fill="F3F4F6"/>
+            <w:tcBorders>
+              <w:top w:val="single" w:sz="2" w:space="0" w:color="CBD5E1"/>
+              <w:left w:val="single" w:sz="18" w:space="0" w:color="B7C0CC"/>
+              <w:bottom w:val="single" w:sz="2" w:space="0" w:color="CBD5E1"/>
+              <w:right w:val="single" w:sz="2" w:space="0" w:color="CBD5E1"/>
+            </w:tcBorders>
+            <w:tcMar>
+              <w:top w:w="80" w:type="dxa"/>
+              <w:start w:w="150" w:type="dxa"/>
+              <w:bottom w:w="80" w:type="dxa"/>
+              <w:end w:w="150" w:type="dxa"/>
+            </w:tcMar>
+          </w:tcPr>
+          <w:p>
+            <w:pPr>
+              <w:spacing w:after="0"/>
+            </w:pPr>
+            <w:r>
+              <w:rPr>
+                <w:rFonts w:ascii="Consolas" w:hAnsi="Consolas"/>
+                <w:color w:val="222B38"/>
+                <w:sz w:val="19"/>
+              </w:rPr>
+              <w:t>cd ~/OpenTrack/OpenTrack/scripts</w:t>
+            </w:r>
+          </w:p>
+          <w:p>
+            <w:pPr>
+              <w:spacing w:after="0"/>
+            </w:pPr>
+            <w:r>
+              <w:rPr>
+                <w:rFonts w:ascii="Consolas" w:hAnsi="Consolas"/>
+                <w:color w:val="222B38"/>
+                <w:sz w:val="19"/>
+              </w:rPr>
+              <w:t>chmod +x install-opentrack-server.sh</w:t>
+            </w:r>
+          </w:p>
+          <w:p>
+            <w:pPr>
+              <w:spacing w:after="0"/>
+            </w:pPr>
+            <w:r>
+              <w:rPr>
+                <w:rFonts w:ascii="Consolas" w:hAnsi="Consolas"/>
+                <w:color w:val="222B38"/>
+                <w:sz w:val="19"/>
+              </w:rPr>
+              <w:t>./install-opentrack-server.sh</w:t>
+            </w:r>
+          </w:p>
+        </w:tc>
+      </w:tr>
+    </w:tbl>
+    <w:p>
+      <w:pPr>
+        <w:spacing w:after="60"/>
+      </w:pPr>
+    </w:p>
+    <w:p>
+      <w:r>
+        <w:t xml:space="preserve">Watch it work. When it finishes, it prints the </w:t>
+      </w:r>
+      <w:r>
+        <w:rPr>
+          <w:b/>
+        </w:rPr>
+        <w:t>web address</w:t>
+      </w:r>
+      <w:r>
+        <w:t xml:space="preserve"> to open and how to create the </w:t>
+      </w:r>
+      <w:r>
+        <w:rPr>
+          <w:b/>
+        </w:rPr>
+        <w:t>first administrator</w:t>
+      </w:r>
+      <w:r>
+        <w:t xml:space="preserve"> — skip to “Create the first administrator” below.</w:t>
+      </w:r>
+    </w:p>
+    <w:tbl>
+      <w:tblPr>
+        <w:tblW w:type="auto" w:w="0"/>
+        <w:jc w:val="center"/>
+        <w:tblLayout w:type="fixed"/>
+        <w:tblLook w:firstColumn="1" w:firstRow="1" w:lastColumn="0" w:lastRow="0" w:noHBand="0" w:noVBand="1" w:val="04A0"/>
+      </w:tblPr>
+      <w:tblGrid>
+        <w:gridCol w:w="9360"/>
+      </w:tblGrid>
+      <w:tr>
+        <w:trPr>
+          <w:cantSplit/>
+        </w:trPr>
+        <w:tc>
+          <w:tcPr>
+            <w:tcW w:type="dxa" w:w="9360"/>
+            <w:shd w:val="clear" w:color="auto" w:fill="E8F5E9"/>
+            <w:tcBorders>
+              <w:top w:val="single" w:sz="4" w:space="0" w:color="43A047"/>
+              <w:left w:val="single" w:sz="30" w:space="0" w:color="43A047"/>
+              <w:bottom w:val="single" w:sz="4" w:space="0" w:color="43A047"/>
+              <w:right w:val="single" w:sz="4" w:space="0" w:color="43A047"/>
+            </w:tcBorders>
+            <w:tcMar>
+              <w:top w:w="110" w:type="dxa"/>
+              <w:start w:w="170" w:type="dxa"/>
+              <w:bottom w:w="110" w:type="dxa"/>
+              <w:end w:w="170" w:type="dxa"/>
+            </w:tcMar>
+          </w:tcPr>
+          <w:p>
+            <w:pPr>
+              <w:spacing w:after="0"/>
+            </w:pPr>
+            <w:r>
+              <w:rPr>
+                <w:b/>
+                <w:color w:val="2E7D32"/>
+                <w:sz w:val="21"/>
+              </w:rPr>
+              <w:t xml:space="preserve">CHANGE PORTS, DATA LOCATION, OR ADD AI   </w:t>
+            </w:r>
+            <w:r>
+              <w:rPr>
+                <w:color w:val="222B38"/>
+              </w:rPr>
+              <w:t xml:space="preserve">To change anything — the ports, where the database lives (for example put it on a D: drive), or to install the local AI at the same time — copy </w:t>
+            </w:r>
+            <w:r>
+              <w:rPr>
+                <w:rFonts w:ascii="Consolas" w:hAnsi="Consolas"/>
+                <w:color w:val="222B38"/>
+                <w:sz w:val="19"/>
+              </w:rPr>
+              <w:t>opentrack-server.sample.conf</w:t>
+            </w:r>
+            <w:r>
+              <w:rPr>
+                <w:color w:val="222B38"/>
+              </w:rPr>
+              <w:t xml:space="preserve"> to </w:t>
+            </w:r>
+            <w:r>
+              <w:rPr>
+                <w:rFonts w:ascii="Consolas" w:hAnsi="Consolas"/>
+                <w:color w:val="222B38"/>
+                <w:sz w:val="19"/>
+              </w:rPr>
+              <w:t>opentrack-server.conf</w:t>
+            </w:r>
+            <w:r>
+              <w:rPr>
+                <w:color w:val="222B38"/>
+              </w:rPr>
+              <w:t xml:space="preserve">, edit the values, and add </w:t>
+            </w:r>
+            <w:r>
+              <w:rPr>
+                <w:rFonts w:ascii="Consolas" w:hAnsi="Consolas"/>
+                <w:color w:val="222B38"/>
+                <w:sz w:val="19"/>
+              </w:rPr>
+              <w:t>-ConfigFile .\opentrack-server.conf</w:t>
+            </w:r>
+            <w:r>
+              <w:rPr>
+                <w:color w:val="222B38"/>
+              </w:rPr>
+              <w:t xml:space="preserve"> to the command. For example set </w:t>
+            </w:r>
+            <w:r>
+              <w:rPr>
+                <w:rFonts w:ascii="Consolas" w:hAnsi="Consolas"/>
+                <w:color w:val="222B38"/>
+                <w:sz w:val="19"/>
+              </w:rPr>
+              <w:t>DataDir = D:\OpenTrackData</w:t>
+            </w:r>
+            <w:r>
+              <w:rPr>
+                <w:color w:val="222B38"/>
+              </w:rPr>
+              <w:t xml:space="preserve"> to keep data on the D: drive, or </w:t>
+            </w:r>
+            <w:r>
+              <w:rPr>
+                <w:rFonts w:ascii="Consolas" w:hAnsi="Consolas"/>
+                <w:color w:val="222B38"/>
+                <w:sz w:val="19"/>
+              </w:rPr>
+              <w:t>InstallAi = true</w:t>
+            </w:r>
+            <w:r>
+              <w:rPr>
+                <w:color w:val="222B38"/>
+              </w:rPr>
+              <w:t xml:space="preserve"> to also set up the free local AI (Chapter 3). On Windows add the </w:t>
+            </w:r>
+            <w:r>
+              <w:rPr>
+                <w:rFonts w:ascii="Consolas" w:hAnsi="Consolas"/>
+                <w:color w:val="222B38"/>
+                <w:sz w:val="19"/>
+              </w:rPr>
+              <w:t>-InstallAi</w:t>
+            </w:r>
+            <w:r>
+              <w:rPr>
+                <w:color w:val="222B38"/>
+              </w:rPr>
+              <w:t xml:space="preserve"> switch; on a Mac use </w:t>
+            </w:r>
+            <w:r>
+              <w:rPr>
+                <w:rFonts w:ascii="Consolas" w:hAnsi="Consolas"/>
+                <w:color w:val="222B38"/>
+                <w:sz w:val="19"/>
+              </w:rPr>
+              <w:t>--install-ai</w:t>
+            </w:r>
+            <w:r>
+              <w:rPr>
+                <w:color w:val="222B38"/>
+              </w:rPr>
+              <w:t xml:space="preserve"> (and </w:t>
+            </w:r>
+            <w:r>
+              <w:rPr>
+                <w:rFonts w:ascii="Consolas" w:hAnsi="Consolas"/>
+                <w:color w:val="222B38"/>
+                <w:sz w:val="19"/>
+              </w:rPr>
+              <w:t>--config</w:t>
+            </w:r>
+            <w:r>
+              <w:rPr>
+                <w:color w:val="222B38"/>
+              </w:rPr>
+              <w:t xml:space="preserve"> instead of </w:t>
+            </w:r>
+            <w:r>
+              <w:rPr>
+                <w:rFonts w:ascii="Consolas" w:hAnsi="Consolas"/>
+                <w:color w:val="222B38"/>
+                <w:sz w:val="19"/>
+              </w:rPr>
+              <w:t>-ConfigFile</w:t>
+            </w:r>
+            <w:r>
+              <w:rPr>
+                <w:color w:val="222B38"/>
+              </w:rPr>
+              <w:t>). The same settings file works for both.</w:t>
+            </w:r>
+          </w:p>
+        </w:tc>
+      </w:tr>
+    </w:tbl>
+    <w:p>
+      <w:pPr>
+        <w:spacing w:after="80"/>
+      </w:pPr>
+    </w:p>
+    <w:p>
+      <w:pPr>
+        <w:pStyle w:val="Heading2"/>
+      </w:pPr>
+      <w:r>
+        <w:t>What the script set up</w:t>
+      </w:r>
+    </w:p>
+    <w:p>
+      <w:pPr>
+        <w:tabs>
+          <w:tab w:pos="547" w:val="left"/>
+        </w:tabs>
+        <w:spacing w:after="80"/>
+        <w:ind w:left="547" w:hanging="288"/>
+      </w:pPr>
+      <w:r>
+        <w:rPr>
+          <w:color w:val="2E6DA4"/>
+        </w:rPr>
+        <w:t>▪</w:t>
+        <w:tab/>
+      </w:r>
+      <w:r>
+        <w:t xml:space="preserve">The </w:t>
+      </w:r>
+      <w:r>
+        <w:rPr>
+          <w:b/>
+        </w:rPr>
+        <w:t>two server programs</w:t>
+      </w:r>
+      <w:r>
+        <w:t xml:space="preserve"> built and running — the </w:t>
+      </w:r>
+      <w:r>
+        <w:rPr>
+          <w:b/>
+        </w:rPr>
+        <w:t>web app</w:t>
+      </w:r>
+      <w:r>
+        <w:t xml:space="preserve"> on port </w:t>
+      </w:r>
+      <w:r>
+        <w:rPr>
+          <w:b/>
+        </w:rPr>
+        <w:t>5035</w:t>
+      </w:r>
+      <w:r>
+        <w:t xml:space="preserve"> (browsers) and the </w:t>
+      </w:r>
+      <w:r>
+        <w:rPr>
+          <w:b/>
+        </w:rPr>
+        <w:t>API</w:t>
+      </w:r>
+      <w:r>
+        <w:t xml:space="preserve"> on port </w:t>
+      </w:r>
+      <w:r>
+        <w:rPr>
+          <w:b/>
+        </w:rPr>
+        <w:t>5003</w:t>
+      </w:r>
+      <w:r>
+        <w:t xml:space="preserve"> (desktop apps).</w:t>
+      </w:r>
+    </w:p>
+    <w:p>
+      <w:pPr>
+        <w:tabs>
+          <w:tab w:pos="547" w:val="left"/>
+        </w:tabs>
+        <w:spacing w:after="80"/>
+        <w:ind w:left="547" w:hanging="288"/>
+      </w:pPr>
+      <w:r>
+        <w:rPr>
+          <w:color w:val="2E6DA4"/>
+        </w:rPr>
+        <w:t>▪</w:t>
+        <w:tab/>
+      </w:r>
+      <w:r>
+        <w:rPr>
+          <w:b/>
+        </w:rPr>
+        <w:t>One shared database</w:t>
+      </w:r>
+      <w:r>
+        <w:t xml:space="preserve"> in your data folder (default </w:t>
+      </w:r>
+      <w:r>
+        <w:rPr>
+          <w:rFonts w:ascii="Consolas" w:hAnsi="Consolas"/>
+          <w:sz w:val="19"/>
+        </w:rPr>
+        <w:t>C:\OpenTrack\data</w:t>
+      </w:r>
+      <w:r>
+        <w:t xml:space="preserve"> — change it with </w:t>
+      </w:r>
+      <w:r>
+        <w:rPr>
+          <w:rFonts w:ascii="Consolas" w:hAnsi="Consolas"/>
+          <w:sz w:val="19"/>
+        </w:rPr>
+        <w:t>DataDir</w:t>
+      </w:r>
+      <w:r>
+        <w:t>).</w:t>
+      </w:r>
+    </w:p>
+    <w:p>
+      <w:pPr>
+        <w:tabs>
+          <w:tab w:pos="547" w:val="left"/>
+        </w:tabs>
+        <w:spacing w:after="80"/>
+        <w:ind w:left="547" w:hanging="288"/>
+      </w:pPr>
+      <w:r>
+        <w:rPr>
+          <w:color w:val="2E6DA4"/>
+        </w:rPr>
+        <w:t>▪</w:t>
+        <w:tab/>
+      </w:r>
+      <w:r>
+        <w:t xml:space="preserve">On Windows, the </w:t>
+      </w:r>
+      <w:r>
+        <w:rPr>
+          <w:b/>
+        </w:rPr>
+        <w:t>Firewall</w:t>
+      </w:r>
+      <w:r>
+        <w:t xml:space="preserve"> opened for both ports so other devices can connect (a Mac on a trusted network needs nothing here).</w:t>
+      </w:r>
+    </w:p>
+    <w:p>
+      <w:pPr>
+        <w:tabs>
+          <w:tab w:pos="547" w:val="left"/>
+        </w:tabs>
+        <w:spacing w:after="80"/>
+        <w:ind w:left="547" w:hanging="288"/>
+      </w:pPr>
+      <w:r>
+        <w:rPr>
+          <w:color w:val="2E6DA4"/>
+        </w:rPr>
+        <w:t>▪</w:t>
+        <w:tab/>
+      </w:r>
+      <w:r>
+        <w:t xml:space="preserve">Both programs </w:t>
+      </w:r>
+      <w:r>
+        <w:rPr>
+          <w:b/>
+        </w:rPr>
+        <w:t>registered to start at boot</w:t>
+      </w:r>
+      <w:r>
+        <w:t xml:space="preserve"> — a scheduled task on Windows, a launchd service on a Mac — and started now.</w:t>
+      </w:r>
+    </w:p>
+    <w:p>
+      <w:pPr>
+        <w:tabs>
+          <w:tab w:pos="547" w:val="left"/>
+        </w:tabs>
+        <w:spacing w:after="80"/>
+        <w:ind w:left="547" w:hanging="288"/>
+      </w:pPr>
+      <w:r>
+        <w:rPr>
+          <w:color w:val="2E6DA4"/>
+        </w:rPr>
+        <w:t>▪</w:t>
+        <w:tab/>
+      </w:r>
+      <w:r>
+        <w:t xml:space="preserve">The </w:t>
+      </w:r>
+      <w:r>
+        <w:rPr>
+          <w:b/>
+        </w:rPr>
+        <w:t>local AI</w:t>
+      </w:r>
+      <w:r>
+        <w:t xml:space="preserve"> as well, if you asked for it.</w:t>
+      </w:r>
+    </w:p>
+    <w:p>
+      <w:pPr>
+        <w:pStyle w:val="Heading1"/>
+      </w:pPr>
+      <w:r>
+        <w:t>Create the first administrator</w:t>
+      </w:r>
+    </w:p>
+    <w:p>
+      <w:pPr>
+        <w:tabs>
+          <w:tab w:pos="547" w:val="left"/>
+        </w:tabs>
+        <w:spacing w:after="100"/>
+        <w:ind w:left="547" w:hanging="547"/>
+      </w:pPr>
+      <w:r>
+        <w:rPr>
+          <w:b/>
+          <w:color w:val="1F3A5F"/>
+        </w:rPr>
+        <w:t>1.</w:t>
+        <w:tab/>
+      </w:r>
+      <w:r>
+        <w:t xml:space="preserve">On any computer on the network, open the web address the script printed: </w:t>
+      </w:r>
+      <w:r>
+        <w:rPr>
+          <w:b/>
+        </w:rPr>
+        <w:t>http://SERVER-IP:5035</w:t>
+      </w:r>
+      <w:r>
+        <w:t>.</w:t>
+      </w:r>
+    </w:p>
+    <w:p>
+      <w:pPr>
+        <w:tabs>
+          <w:tab w:pos="547" w:val="left"/>
+        </w:tabs>
+        <w:spacing w:after="100"/>
+        <w:ind w:left="547" w:hanging="547"/>
+      </w:pPr>
+      <w:r>
+        <w:rPr>
+          <w:b/>
+          <w:color w:val="1F3A5F"/>
+        </w:rPr>
+        <w:t>2.</w:t>
+        <w:tab/>
+      </w:r>
+      <w:r>
+        <w:t xml:space="preserve">Choose </w:t>
+      </w:r>
+      <w:r>
+        <w:rPr>
+          <w:b/>
+        </w:rPr>
+        <w:t>Register</w:t>
+      </w:r>
+      <w:r>
+        <w:t xml:space="preserve"> and create your account — the </w:t>
+      </w:r>
+      <w:r>
+        <w:rPr>
+          <w:b/>
+        </w:rPr>
+        <w:t>first</w:t>
+      </w:r>
+      <w:r>
+        <w:t xml:space="preserve"> account registered becomes the </w:t>
+      </w:r>
+      <w:r>
+        <w:rPr>
+          <w:b/>
+        </w:rPr>
+        <w:t>Administrator</w:t>
+      </w:r>
+      <w:r>
+        <w:t>. Do this soon, before anyone else.</w:t>
+      </w:r>
+    </w:p>
+    <w:tbl>
+      <w:tblPr>
+        <w:tblW w:type="auto" w:w="0"/>
+        <w:jc w:val="center"/>
+        <w:tblLayout w:type="fixed"/>
+        <w:tblLook w:firstColumn="1" w:firstRow="1" w:lastColumn="0" w:lastRow="0" w:noHBand="0" w:noVBand="1" w:val="04A0"/>
+      </w:tblPr>
+      <w:tblGrid>
+        <w:gridCol w:w="9360"/>
+      </w:tblGrid>
+      <w:tr>
+        <w:trPr>
+          <w:cantSplit/>
+        </w:trPr>
+        <w:tc>
+          <w:tcPr>
+            <w:tcW w:type="dxa" w:w="9360"/>
+            <w:shd w:val="clear" w:color="auto" w:fill="E8F5E9"/>
+            <w:tcBorders>
+              <w:top w:val="single" w:sz="4" w:space="0" w:color="43A047"/>
+              <w:left w:val="single" w:sz="30" w:space="0" w:color="43A047"/>
+              <w:bottom w:val="single" w:sz="4" w:space="0" w:color="43A047"/>
+              <w:right w:val="single" w:sz="4" w:space="0" w:color="43A047"/>
+            </w:tcBorders>
+            <w:tcMar>
+              <w:top w:w="110" w:type="dxa"/>
+              <w:start w:w="170" w:type="dxa"/>
+              <w:bottom w:w="110" w:type="dxa"/>
+              <w:end w:w="170" w:type="dxa"/>
+            </w:tcMar>
+          </w:tcPr>
+          <w:p>
+            <w:pPr>
+              <w:spacing w:after="0"/>
+            </w:pPr>
+            <w:r>
+              <w:rPr>
+                <w:b/>
+                <w:color w:val="2E7D32"/>
+                <w:sz w:val="21"/>
+              </w:rPr>
+              <w:t xml:space="preserve">OR SET THE ADMIN AUTOMATICALLY   </w:t>
+            </w:r>
+            <w:r>
+              <w:rPr>
+                <w:color w:val="222B38"/>
+              </w:rPr>
+              <w:t xml:space="preserve">Put </w:t>
+            </w:r>
+            <w:r>
+              <w:rPr>
+                <w:rFonts w:ascii="Consolas" w:hAnsi="Consolas"/>
+                <w:color w:val="222B38"/>
+                <w:sz w:val="19"/>
+              </w:rPr>
+              <w:t>AdminEmail</w:t>
+            </w:r>
+            <w:r>
+              <w:rPr>
+                <w:color w:val="222B38"/>
+              </w:rPr>
+              <w:t xml:space="preserve"> and </w:t>
+            </w:r>
+            <w:r>
+              <w:rPr>
+                <w:rFonts w:ascii="Consolas" w:hAnsi="Consolas"/>
+                <w:color w:val="222B38"/>
+                <w:sz w:val="19"/>
+              </w:rPr>
+              <w:t>AdminPassword</w:t>
+            </w:r>
+            <w:r>
+              <w:rPr>
+                <w:color w:val="222B38"/>
+              </w:rPr>
+              <w:t xml:space="preserve"> in the settings file and the script hands those to the server, which creates/promotes that account to Administrator at startup — so you never rely on “first to register wins.”</w:t>
+            </w:r>
+          </w:p>
+        </w:tc>
+      </w:tr>
+    </w:tbl>
+    <w:p>
+      <w:pPr>
+        <w:spacing w:after="80"/>
+      </w:pPr>
+    </w:p>
+    <w:p>
+      <w:pPr>
+        <w:pStyle w:val="Heading1"/>
+      </w:pPr>
+      <w:r>
+        <w:t>Updating later</w:t>
+      </w:r>
+    </w:p>
+    <w:p>
+      <w:r>
+        <w:t xml:space="preserve">To update OpenTrack, just </w:t>
+      </w:r>
+      <w:r>
+        <w:rPr>
+          <w:b/>
+        </w:rPr>
+        <w:t>re-run the same script</w:t>
+      </w:r>
+      <w:r>
+        <w:t>. It pulls the latest code, rebuilds both programs, and restarts them. Your database and settings are untouched.</w:t>
+      </w:r>
+    </w:p>
+    <w:p>
+      <w:pPr>
+        <w:pStyle w:val="Heading1"/>
+      </w:pPr>
+      <w:r>
+        <w:t>The by-hand alternative (optional)</w:t>
+      </w:r>
+    </w:p>
+    <w:tbl>
+      <w:tblPr>
+        <w:tblW w:type="auto" w:w="0"/>
+        <w:jc w:val="center"/>
+        <w:tblLayout w:type="fixed"/>
+        <w:tblLook w:firstColumn="1" w:firstRow="1" w:lastColumn="0" w:lastRow="0" w:noHBand="0" w:noVBand="1" w:val="04A0"/>
+      </w:tblPr>
+      <w:tblGrid>
+        <w:gridCol w:w="9360"/>
+      </w:tblGrid>
+      <w:tr>
+        <w:trPr>
+          <w:cantSplit/>
+        </w:trPr>
+        <w:tc>
+          <w:tcPr>
+            <w:tcW w:type="dxa" w:w="9360"/>
+            <w:shd w:val="clear" w:color="auto" w:fill="E7F0FA"/>
+            <w:tcBorders>
+              <w:top w:val="single" w:sz="4" w:space="0" w:color="2E6DA4"/>
+              <w:left w:val="single" w:sz="30" w:space="0" w:color="2E6DA4"/>
+              <w:bottom w:val="single" w:sz="4" w:space="0" w:color="2E6DA4"/>
+              <w:right w:val="single" w:sz="4" w:space="0" w:color="2E6DA4"/>
+            </w:tcBorders>
+            <w:tcMar>
+              <w:top w:w="110" w:type="dxa"/>
+              <w:start w:w="170" w:type="dxa"/>
+              <w:bottom w:w="110" w:type="dxa"/>
+              <w:end w:w="170" w:type="dxa"/>
+            </w:tcMar>
+          </w:tcPr>
+          <w:p>
+            <w:pPr>
+              <w:spacing w:after="0"/>
+            </w:pPr>
+            <w:r>
+              <w:rPr>
+                <w:b/>
+                <w:color w:val="1F3A5F"/>
+                <w:sz w:val="21"/>
+              </w:rPr>
+              <w:t xml:space="preserve">YOU CAN SKIP THIS   </w:t>
+            </w:r>
+            <w:r>
+              <w:rPr>
+                <w:color w:val="222B38"/>
+              </w:rPr>
+              <w:t xml:space="preserve">The steps below do the same work as the script, by hand, and are written for </w:t>
+            </w:r>
+            <w:r>
+              <w:rPr>
+                <w:b/>
+                <w:color w:val="222B38"/>
+              </w:rPr>
+              <w:t>Windows</w:t>
+            </w:r>
+            <w:r>
+              <w:rPr>
+                <w:color w:val="222B38"/>
+              </w:rPr>
+              <w:t xml:space="preserve"> (on a Mac the script does the equivalent using Homebrew and launchd). You only need them if you want to understand or customize the setup, or the script doesn't fit your environment. If the script worked, you're done — go on to Chapter 3 (AI) or Chapter 4 (desktop app).</w:t>
+            </w:r>
+          </w:p>
+        </w:tc>
+      </w:tr>
+    </w:tbl>
+    <w:p>
+      <w:pPr>
+        <w:spacing w:after="80"/>
       </w:pPr>
     </w:p>
     <w:p>
@@ -3430,73 +4722,6 @@
       <w:r>
         <w:t xml:space="preserve"> — you should see the OpenTrack sign-in page.</w:t>
       </w:r>
-    </w:p>
-    <w:tbl>
-      <w:tblPr>
-        <w:tblW w:type="auto" w:w="0"/>
-        <w:jc w:val="center"/>
-        <w:tblLayout w:type="fixed"/>
-        <w:tblLook w:firstColumn="1" w:firstRow="1" w:lastColumn="0" w:lastRow="0" w:noHBand="0" w:noVBand="1" w:val="04A0"/>
-      </w:tblPr>
-      <w:tblGrid>
-        <w:gridCol w:w="9360"/>
-      </w:tblGrid>
-      <w:tr>
-        <w:trPr>
-          <w:cantSplit/>
-        </w:trPr>
-        <w:tc>
-          <w:tcPr>
-            <w:tcW w:type="dxa" w:w="9360"/>
-            <w:shd w:val="clear" w:color="auto" w:fill="F1F5F9"/>
-            <w:tcBorders>
-              <w:top w:val="dashed" w:sz="8" w:space="0" w:color="94A3B8"/>
-              <w:left w:val="dashed" w:sz="8" w:space="0" w:color="94A3B8"/>
-              <w:bottom w:val="dashed" w:sz="8" w:space="0" w:color="94A3B8"/>
-              <w:right w:val="dashed" w:sz="8" w:space="0" w:color="94A3B8"/>
-            </w:tcBorders>
-            <w:tcMar>
-              <w:top w:w="220" w:type="dxa"/>
-              <w:start w:w="170" w:type="dxa"/>
-              <w:bottom w:w="220" w:type="dxa"/>
-              <w:end w:w="170" w:type="dxa"/>
-            </w:tcMar>
-          </w:tcPr>
-          <w:p>
-            <w:pPr>
-              <w:spacing w:after="40"/>
-              <w:jc w:val="center"/>
-            </w:pPr>
-            <w:r>
-              <w:rPr>
-                <w:b/>
-                <w:color w:val="64748B"/>
-                <w:sz w:val="18"/>
-              </w:rPr>
-              <w:t>SCREENSHOT</w:t>
-            </w:r>
-          </w:p>
-          <w:p>
-            <w:pPr>
-              <w:spacing w:after="0"/>
-              <w:jc w:val="center"/>
-            </w:pPr>
-            <w:r>
-              <w:rPr>
-                <w:i/>
-                <w:color w:val="64748B"/>
-                <w:sz w:val="20"/>
-              </w:rPr>
-              <w:t>The OpenTrack web app sign-in / register page on first run</w:t>
-            </w:r>
-          </w:p>
-        </w:tc>
-      </w:tr>
-    </w:tbl>
-    <w:p>
-      <w:pPr>
-        <w:spacing w:after="80"/>
-      </w:pPr>
     </w:p>
     <w:p>
       <w:pPr>
@@ -4394,6 +5619,92 @@
     <w:p>
       <w:pPr>
         <w:spacing w:after="40"/>
+      </w:pPr>
+    </w:p>
+    <w:tbl>
+      <w:tblPr>
+        <w:tblW w:type="auto" w:w="0"/>
+        <w:jc w:val="center"/>
+        <w:tblLayout w:type="fixed"/>
+        <w:tblLook w:firstColumn="1" w:firstRow="1" w:lastColumn="0" w:lastRow="0" w:noHBand="0" w:noVBand="1" w:val="04A0"/>
+      </w:tblPr>
+      <w:tblGrid>
+        <w:gridCol w:w="9360"/>
+      </w:tblGrid>
+      <w:tr>
+        <w:trPr>
+          <w:cantSplit/>
+        </w:trPr>
+        <w:tc>
+          <w:tcPr>
+            <w:tcW w:type="dxa" w:w="9360"/>
+            <w:shd w:val="clear" w:color="auto" w:fill="E8F5E9"/>
+            <w:tcBorders>
+              <w:top w:val="single" w:sz="4" w:space="0" w:color="43A047"/>
+              <w:left w:val="single" w:sz="30" w:space="0" w:color="43A047"/>
+              <w:bottom w:val="single" w:sz="4" w:space="0" w:color="43A047"/>
+              <w:right w:val="single" w:sz="4" w:space="0" w:color="43A047"/>
+            </w:tcBorders>
+            <w:tcMar>
+              <w:top w:w="110" w:type="dxa"/>
+              <w:start w:w="170" w:type="dxa"/>
+              <w:bottom w:w="110" w:type="dxa"/>
+              <w:end w:w="170" w:type="dxa"/>
+            </w:tcMar>
+          </w:tcPr>
+          <w:p>
+            <w:pPr>
+              <w:spacing w:after="0"/>
+            </w:pPr>
+            <w:r>
+              <w:rPr>
+                <w:b/>
+                <w:color w:val="2E7D32"/>
+                <w:sz w:val="21"/>
+              </w:rPr>
+              <w:t xml:space="preserve">THE SETUP SCRIPT CAN DO ALL OF THIS   </w:t>
+            </w:r>
+            <w:r>
+              <w:rPr>
+                <w:color w:val="222B38"/>
+              </w:rPr>
+              <w:t xml:space="preserve">If you ran Chapter 2's setup script with </w:t>
+            </w:r>
+            <w:r>
+              <w:rPr>
+                <w:rFonts w:ascii="Consolas" w:hAnsi="Consolas"/>
+                <w:color w:val="222B38"/>
+                <w:sz w:val="19"/>
+              </w:rPr>
+              <w:t>InstallAi = true</w:t>
+            </w:r>
+            <w:r>
+              <w:rPr>
+                <w:color w:val="222B38"/>
+              </w:rPr>
+              <w:t xml:space="preserve"> (or the </w:t>
+            </w:r>
+            <w:r>
+              <w:rPr>
+                <w:rFonts w:ascii="Consolas" w:hAnsi="Consolas"/>
+                <w:color w:val="222B38"/>
+                <w:sz w:val="19"/>
+              </w:rPr>
+              <w:t>-InstallAi</w:t>
+            </w:r>
+            <w:r>
+              <w:rPr>
+                <w:color w:val="222B38"/>
+              </w:rPr>
+              <w:t xml:space="preserve"> switch), the local AI below is already installed and turned on — you can skip this chapter. The steps here are the by-hand version, and the place to look if you want the cloud option instead.</w:t>
+            </w:r>
+          </w:p>
+        </w:tc>
+      </w:tr>
+    </w:tbl>
+    <w:p>
+      <w:pPr>
+        <w:spacing w:after="80"/>
       </w:pPr>
     </w:p>
     <w:p>
@@ -5198,73 +6509,6 @@
         <w:t xml:space="preserve"> button. Type a title and click it to confirm the model responds.</w:t>
       </w:r>
     </w:p>
-    <w:tbl>
-      <w:tblPr>
-        <w:tblW w:type="auto" w:w="0"/>
-        <w:jc w:val="center"/>
-        <w:tblLayout w:type="fixed"/>
-        <w:tblLook w:firstColumn="1" w:firstRow="1" w:lastColumn="0" w:lastRow="0" w:noHBand="0" w:noVBand="1" w:val="04A0"/>
-      </w:tblPr>
-      <w:tblGrid>
-        <w:gridCol w:w="9360"/>
-      </w:tblGrid>
-      <w:tr>
-        <w:trPr>
-          <w:cantSplit/>
-        </w:trPr>
-        <w:tc>
-          <w:tcPr>
-            <w:tcW w:type="dxa" w:w="9360"/>
-            <w:shd w:val="clear" w:color="auto" w:fill="F1F5F9"/>
-            <w:tcBorders>
-              <w:top w:val="dashed" w:sz="8" w:space="0" w:color="94A3B8"/>
-              <w:left w:val="dashed" w:sz="8" w:space="0" w:color="94A3B8"/>
-              <w:bottom w:val="dashed" w:sz="8" w:space="0" w:color="94A3B8"/>
-              <w:right w:val="dashed" w:sz="8" w:space="0" w:color="94A3B8"/>
-            </w:tcBorders>
-            <w:tcMar>
-              <w:top w:w="220" w:type="dxa"/>
-              <w:start w:w="170" w:type="dxa"/>
-              <w:bottom w:w="220" w:type="dxa"/>
-              <w:end w:w="170" w:type="dxa"/>
-            </w:tcMar>
-          </w:tcPr>
-          <w:p>
-            <w:pPr>
-              <w:spacing w:after="40"/>
-              <w:jc w:val="center"/>
-            </w:pPr>
-            <w:r>
-              <w:rPr>
-                <w:b/>
-                <w:color w:val="64748B"/>
-                <w:sz w:val="18"/>
-              </w:rPr>
-              <w:t>SCREENSHOT</w:t>
-            </w:r>
-          </w:p>
-          <w:p>
-            <w:pPr>
-              <w:spacing w:after="0"/>
-              <w:jc w:val="center"/>
-            </w:pPr>
-            <w:r>
-              <w:rPr>
-                <w:i/>
-                <w:color w:val="64748B"/>
-                <w:sz w:val="20"/>
-              </w:rPr>
-              <w:t>The New Issue page showing the ✨ Suggest with AI button</w:t>
-            </w:r>
-          </w:p>
-        </w:tc>
-      </w:tr>
-    </w:tbl>
-    <w:p>
-      <w:pPr>
-        <w:spacing w:after="80"/>
-      </w:pPr>
-    </w:p>
     <w:p>
       <w:pPr>
         <w:pStyle w:val="Heading1"/>
@@ -6159,73 +7403,6 @@
         <w:tc>
           <w:tcPr>
             <w:tcW w:type="dxa" w:w="9360"/>
-            <w:shd w:val="clear" w:color="auto" w:fill="F1F5F9"/>
-            <w:tcBorders>
-              <w:top w:val="dashed" w:sz="8" w:space="0" w:color="94A3B8"/>
-              <w:left w:val="dashed" w:sz="8" w:space="0" w:color="94A3B8"/>
-              <w:bottom w:val="dashed" w:sz="8" w:space="0" w:color="94A3B8"/>
-              <w:right w:val="dashed" w:sz="8" w:space="0" w:color="94A3B8"/>
-            </w:tcBorders>
-            <w:tcMar>
-              <w:top w:w="220" w:type="dxa"/>
-              <w:start w:w="170" w:type="dxa"/>
-              <w:bottom w:w="220" w:type="dxa"/>
-              <w:end w:w="170" w:type="dxa"/>
-            </w:tcMar>
-          </w:tcPr>
-          <w:p>
-            <w:pPr>
-              <w:spacing w:after="40"/>
-              <w:jc w:val="center"/>
-            </w:pPr>
-            <w:r>
-              <w:rPr>
-                <w:b/>
-                <w:color w:val="64748B"/>
-                <w:sz w:val="18"/>
-              </w:rPr>
-              <w:t>SCREENSHOT</w:t>
-            </w:r>
-          </w:p>
-          <w:p>
-            <w:pPr>
-              <w:spacing w:after="0"/>
-              <w:jc w:val="center"/>
-            </w:pPr>
-            <w:r>
-              <w:rPr>
-                <w:i/>
-                <w:color w:val="64748B"/>
-                <w:sz w:val="20"/>
-              </w:rPr>
-              <w:t>The Windows desktop app Settings showing the server address field</w:t>
-            </w:r>
-          </w:p>
-        </w:tc>
-      </w:tr>
-    </w:tbl>
-    <w:p>
-      <w:pPr>
-        <w:spacing w:after="80"/>
-      </w:pPr>
-    </w:p>
-    <w:tbl>
-      <w:tblPr>
-        <w:tblW w:type="auto" w:w="0"/>
-        <w:jc w:val="center"/>
-        <w:tblLayout w:type="fixed"/>
-        <w:tblLook w:firstColumn="1" w:firstRow="1" w:lastColumn="0" w:lastRow="0" w:noHBand="0" w:noVBand="1" w:val="04A0"/>
-      </w:tblPr>
-      <w:tblGrid>
-        <w:gridCol w:w="9360"/>
-      </w:tblGrid>
-      <w:tr>
-        <w:trPr>
-          <w:cantSplit/>
-        </w:trPr>
-        <w:tc>
-          <w:tcPr>
-            <w:tcW w:type="dxa" w:w="9360"/>
             <w:shd w:val="clear" w:color="auto" w:fill="E8F5E9"/>
             <w:tcBorders>
               <w:top w:val="single" w:sz="4" w:space="0" w:color="43A047"/>
@@ -7199,73 +8376,6 @@
         <w:t>Sign in with your account. Done — the Mac now shows the same data as everything else.</w:t>
       </w:r>
     </w:p>
-    <w:tbl>
-      <w:tblPr>
-        <w:tblW w:type="auto" w:w="0"/>
-        <w:jc w:val="center"/>
-        <w:tblLayout w:type="fixed"/>
-        <w:tblLook w:firstColumn="1" w:firstRow="1" w:lastColumn="0" w:lastRow="0" w:noHBand="0" w:noVBand="1" w:val="04A0"/>
-      </w:tblPr>
-      <w:tblGrid>
-        <w:gridCol w:w="9360"/>
-      </w:tblGrid>
-      <w:tr>
-        <w:trPr>
-          <w:cantSplit/>
-        </w:trPr>
-        <w:tc>
-          <w:tcPr>
-            <w:tcW w:type="dxa" w:w="9360"/>
-            <w:shd w:val="clear" w:color="auto" w:fill="F1F5F9"/>
-            <w:tcBorders>
-              <w:top w:val="dashed" w:sz="8" w:space="0" w:color="94A3B8"/>
-              <w:left w:val="dashed" w:sz="8" w:space="0" w:color="94A3B8"/>
-              <w:bottom w:val="dashed" w:sz="8" w:space="0" w:color="94A3B8"/>
-              <w:right w:val="dashed" w:sz="8" w:space="0" w:color="94A3B8"/>
-            </w:tcBorders>
-            <w:tcMar>
-              <w:top w:w="220" w:type="dxa"/>
-              <w:start w:w="170" w:type="dxa"/>
-              <w:bottom w:w="220" w:type="dxa"/>
-              <w:end w:w="170" w:type="dxa"/>
-            </w:tcMar>
-          </w:tcPr>
-          <w:p>
-            <w:pPr>
-              <w:spacing w:after="40"/>
-              <w:jc w:val="center"/>
-            </w:pPr>
-            <w:r>
-              <w:rPr>
-                <w:b/>
-                <w:color w:val="64748B"/>
-                <w:sz w:val="18"/>
-              </w:rPr>
-              <w:t>SCREENSHOT</w:t>
-            </w:r>
-          </w:p>
-          <w:p>
-            <w:pPr>
-              <w:spacing w:after="0"/>
-              <w:jc w:val="center"/>
-            </w:pPr>
-            <w:r>
-              <w:rPr>
-                <w:i/>
-                <w:color w:val="64748B"/>
-                <w:sz w:val="20"/>
-              </w:rPr>
-              <w:t>The macOS desktop app running, connected to the server</w:t>
-            </w:r>
-          </w:p>
-        </w:tc>
-      </w:tr>
-    </w:tbl>
-    <w:p>
-      <w:pPr>
-        <w:spacing w:after="80"/>
-      </w:pPr>
-    </w:p>
     <w:p>
       <w:r>
         <w:br w:type="page"/>
@@ -7673,73 +8783,6 @@
         <w:tc>
           <w:tcPr>
             <w:tcW w:type="dxa" w:w="9360"/>
-            <w:shd w:val="clear" w:color="auto" w:fill="F1F5F9"/>
-            <w:tcBorders>
-              <w:top w:val="dashed" w:sz="8" w:space="0" w:color="94A3B8"/>
-              <w:left w:val="dashed" w:sz="8" w:space="0" w:color="94A3B8"/>
-              <w:bottom w:val="dashed" w:sz="8" w:space="0" w:color="94A3B8"/>
-              <w:right w:val="dashed" w:sz="8" w:space="0" w:color="94A3B8"/>
-            </w:tcBorders>
-            <w:tcMar>
-              <w:top w:w="220" w:type="dxa"/>
-              <w:start w:w="170" w:type="dxa"/>
-              <w:bottom w:w="220" w:type="dxa"/>
-              <w:end w:w="170" w:type="dxa"/>
-            </w:tcMar>
-          </w:tcPr>
-          <w:p>
-            <w:pPr>
-              <w:spacing w:after="40"/>
-              <w:jc w:val="center"/>
-            </w:pPr>
-            <w:r>
-              <w:rPr>
-                <w:b/>
-                <w:color w:val="64748B"/>
-                <w:sz w:val="18"/>
-              </w:rPr>
-              <w:t>SCREENSHOT</w:t>
-            </w:r>
-          </w:p>
-          <w:p>
-            <w:pPr>
-              <w:spacing w:after="0"/>
-              <w:jc w:val="center"/>
-            </w:pPr>
-            <w:r>
-              <w:rPr>
-                <w:i/>
-                <w:color w:val="64748B"/>
-                <w:sz w:val="20"/>
-              </w:rPr>
-              <w:t>OpenTrack added to an iPad home screen, opened full-screen</w:t>
-            </w:r>
-          </w:p>
-        </w:tc>
-      </w:tr>
-    </w:tbl>
-    <w:p>
-      <w:pPr>
-        <w:spacing w:after="80"/>
-      </w:pPr>
-    </w:p>
-    <w:tbl>
-      <w:tblPr>
-        <w:tblW w:type="auto" w:w="0"/>
-        <w:jc w:val="center"/>
-        <w:tblLayout w:type="fixed"/>
-        <w:tblLook w:firstColumn="1" w:firstRow="1" w:lastColumn="0" w:lastRow="0" w:noHBand="0" w:noVBand="1" w:val="04A0"/>
-      </w:tblPr>
-      <w:tblGrid>
-        <w:gridCol w:w="9360"/>
-      </w:tblGrid>
-      <w:tr>
-        <w:trPr>
-          <w:cantSplit/>
-        </w:trPr>
-        <w:tc>
-          <w:tcPr>
-            <w:tcW w:type="dxa" w:w="9360"/>
             <w:shd w:val="clear" w:color="auto" w:fill="E8F5E9"/>
             <w:tcBorders>
               <w:top w:val="single" w:sz="4" w:space="0" w:color="43A047"/>
@@ -8044,73 +9087,6 @@
         <w:t>.</w:t>
       </w:r>
     </w:p>
-    <w:tbl>
-      <w:tblPr>
-        <w:tblW w:type="auto" w:w="0"/>
-        <w:jc w:val="center"/>
-        <w:tblLayout w:type="fixed"/>
-        <w:tblLook w:firstColumn="1" w:firstRow="1" w:lastColumn="0" w:lastRow="0" w:noHBand="0" w:noVBand="1" w:val="04A0"/>
-      </w:tblPr>
-      <w:tblGrid>
-        <w:gridCol w:w="9360"/>
-      </w:tblGrid>
-      <w:tr>
-        <w:trPr>
-          <w:cantSplit/>
-        </w:trPr>
-        <w:tc>
-          <w:tcPr>
-            <w:tcW w:type="dxa" w:w="9360"/>
-            <w:shd w:val="clear" w:color="auto" w:fill="F1F5F9"/>
-            <w:tcBorders>
-              <w:top w:val="dashed" w:sz="8" w:space="0" w:color="94A3B8"/>
-              <w:left w:val="dashed" w:sz="8" w:space="0" w:color="94A3B8"/>
-              <w:bottom w:val="dashed" w:sz="8" w:space="0" w:color="94A3B8"/>
-              <w:right w:val="dashed" w:sz="8" w:space="0" w:color="94A3B8"/>
-            </w:tcBorders>
-            <w:tcMar>
-              <w:top w:w="220" w:type="dxa"/>
-              <w:start w:w="170" w:type="dxa"/>
-              <w:bottom w:w="220" w:type="dxa"/>
-              <w:end w:w="170" w:type="dxa"/>
-            </w:tcMar>
-          </w:tcPr>
-          <w:p>
-            <w:pPr>
-              <w:spacing w:after="40"/>
-              <w:jc w:val="center"/>
-            </w:pPr>
-            <w:r>
-              <w:rPr>
-                <w:b/>
-                <w:color w:val="64748B"/>
-                <w:sz w:val="18"/>
-              </w:rPr>
-              <w:t>SCREENSHOT</w:t>
-            </w:r>
-          </w:p>
-          <w:p>
-            <w:pPr>
-              <w:spacing w:after="0"/>
-              <w:jc w:val="center"/>
-            </w:pPr>
-            <w:r>
-              <w:rPr>
-                <w:i/>
-                <w:color w:val="64748B"/>
-                <w:sz w:val="20"/>
-              </w:rPr>
-              <w:t>Creating a new project</w:t>
-            </w:r>
-          </w:p>
-        </w:tc>
-      </w:tr>
-    </w:tbl>
-    <w:p>
-      <w:pPr>
-        <w:spacing w:after="80"/>
-      </w:pPr>
-    </w:p>
     <w:p>
       <w:pPr>
         <w:pStyle w:val="Heading1"/>
@@ -8159,73 +9135,6 @@
       <w:r>
         <w:t xml:space="preserve"> (runs the whole instance).</w:t>
       </w:r>
-    </w:p>
-    <w:tbl>
-      <w:tblPr>
-        <w:tblW w:type="auto" w:w="0"/>
-        <w:jc w:val="center"/>
-        <w:tblLayout w:type="fixed"/>
-        <w:tblLook w:firstColumn="1" w:firstRow="1" w:lastColumn="0" w:lastRow="0" w:noHBand="0" w:noVBand="1" w:val="04A0"/>
-      </w:tblPr>
-      <w:tblGrid>
-        <w:gridCol w:w="9360"/>
-      </w:tblGrid>
-      <w:tr>
-        <w:trPr>
-          <w:cantSplit/>
-        </w:trPr>
-        <w:tc>
-          <w:tcPr>
-            <w:tcW w:type="dxa" w:w="9360"/>
-            <w:shd w:val="clear" w:color="auto" w:fill="F1F5F9"/>
-            <w:tcBorders>
-              <w:top w:val="dashed" w:sz="8" w:space="0" w:color="94A3B8"/>
-              <w:left w:val="dashed" w:sz="8" w:space="0" w:color="94A3B8"/>
-              <w:bottom w:val="dashed" w:sz="8" w:space="0" w:color="94A3B8"/>
-              <w:right w:val="dashed" w:sz="8" w:space="0" w:color="94A3B8"/>
-            </w:tcBorders>
-            <w:tcMar>
-              <w:top w:w="220" w:type="dxa"/>
-              <w:start w:w="170" w:type="dxa"/>
-              <w:bottom w:w="220" w:type="dxa"/>
-              <w:end w:w="170" w:type="dxa"/>
-            </w:tcMar>
-          </w:tcPr>
-          <w:p>
-            <w:pPr>
-              <w:spacing w:after="40"/>
-              <w:jc w:val="center"/>
-            </w:pPr>
-            <w:r>
-              <w:rPr>
-                <w:b/>
-                <w:color w:val="64748B"/>
-                <w:sz w:val="18"/>
-              </w:rPr>
-              <w:t>SCREENSHOT</w:t>
-            </w:r>
-          </w:p>
-          <w:p>
-            <w:pPr>
-              <w:spacing w:after="0"/>
-              <w:jc w:val="center"/>
-            </w:pPr>
-            <w:r>
-              <w:rPr>
-                <w:i/>
-                <w:color w:val="64748B"/>
-                <w:sz w:val="20"/>
-              </w:rPr>
-              <w:t>The project members / roles screen</w:t>
-            </w:r>
-          </w:p>
-        </w:tc>
-      </w:tr>
-    </w:tbl>
-    <w:p>
-      <w:pPr>
-        <w:spacing w:after="80"/>
-      </w:pPr>
     </w:p>
     <w:p>
       <w:pPr>
@@ -9567,33 +10476,32 @@
       </w:r>
     </w:p>
     <w:p>
-      <w:pPr>
-        <w:tabs>
-          <w:tab w:pos="547" w:val="left"/>
-        </w:tabs>
-        <w:spacing w:after="100"/>
-        <w:ind w:left="547" w:hanging="547"/>
-      </w:pPr>
+      <w:r>
+        <w:t xml:space="preserve">Easiest: </w:t>
+      </w:r>
       <w:r>
         <w:rPr>
           <w:b/>
-          <w:color w:val="1F3A5F"/>
         </w:rPr>
-        <w:t>1.</w:t>
-        <w:tab/>
-      </w:r>
-      <w:r>
-        <w:t xml:space="preserve">In </w:t>
+        <w:t>re-run the setup script</w:t>
+      </w:r>
+      <w:r>
+        <w:t xml:space="preserve"> from Chapter 2 (</w:t>
       </w:r>
       <w:r>
         <w:rPr>
           <w:rFonts w:ascii="Consolas" w:hAnsi="Consolas"/>
           <w:sz w:val="19"/>
         </w:rPr>
-        <w:t>C:\OpenTrack\OpenTrack</w:t>
-      </w:r>
-      <w:r>
-        <w:t xml:space="preserve">, pull the latest code: </w:t>
+        <w:t>Install-OpenTrackServer.ps1</w:t>
+      </w:r>
+      <w:r>
+        <w:t>). It pulls the latest code, rebuilds both programs, and restarts them — the database upgrades itself on first start, with no manual database steps.</w:t>
+      </w:r>
+    </w:p>
+    <w:p>
+      <w:r>
+        <w:t xml:space="preserve">By hand instead: in your OpenTrack folder run </w:t>
       </w:r>
       <w:r>
         <w:rPr>
@@ -9603,47 +10511,7 @@
         <w:t>git pull</w:t>
       </w:r>
       <w:r>
-        <w:t>.</w:t>
-      </w:r>
-    </w:p>
-    <w:p>
-      <w:pPr>
-        <w:tabs>
-          <w:tab w:pos="547" w:val="left"/>
-        </w:tabs>
-        <w:spacing w:after="100"/>
-        <w:ind w:left="547" w:hanging="547"/>
-      </w:pPr>
-      <w:r>
-        <w:rPr>
-          <w:b/>
-          <w:color w:val="1F3A5F"/>
-        </w:rPr>
-        <w:t>2.</w:t>
-        <w:tab/>
-      </w:r>
-      <w:r>
-        <w:t>Re-publish both programs (Chapter 2, Step D).</w:t>
-      </w:r>
-    </w:p>
-    <w:p>
-      <w:pPr>
-        <w:tabs>
-          <w:tab w:pos="547" w:val="left"/>
-        </w:tabs>
-        <w:spacing w:after="100"/>
-        <w:ind w:left="547" w:hanging="547"/>
-      </w:pPr>
-      <w:r>
-        <w:rPr>
-          <w:b/>
-          <w:color w:val="1F3A5F"/>
-        </w:rPr>
-        <w:t>3.</w:t>
-        <w:tab/>
-      </w:r>
-      <w:r>
-        <w:t>Restart the web app and API. The database upgrades itself automatically on first start — no manual database steps.</w:t>
+        <w:t>, re-publish both programs (Chapter 2's manual Step D), and restart the web app and API.</w:t>
       </w:r>
     </w:p>
     <w:p>

</xml_diff>

<commit_message>
scripts: interactive setup wizard + smarter data-location prompt
Run either setup script bare and it now asks a few plain questions (data
location, local AI, first administrator, ports), each with a default accepted by
pressing Enter, then a summary + confirm. Any flag or --config/-ConfigFile (or
--non-interactive/-NonInteractive) skips the prompts for an unattended install.

The data question guides the user: it explains that a second drive means the data
survives a Windows reinstall, asks whether the PC has one, and suggests
D:\OpenTrack\Data (2 drives, letter normalized + existence-warned) or
C:\OpenTrack\data (1 drive). The Mac script gets a matching plain-language tip.

Installation Guide Chapter 2 reworked to match: "Run it" describes the questions;
the settings-file section is reframed as the optional unattended install.

Co-Authored-By: Claude Opus 4.8 <noreply@anthropic.com>
</commit_message>
<xml_diff>
--- a/docs/guides/OpenTrack_Installation_Guide.docx
+++ b/docs/guides/OpenTrack_Installation_Guide.docx
@@ -2812,7 +2812,25 @@
     </w:p>
     <w:p>
       <w:r>
-        <w:t xml:space="preserve">Watch it work. When it finishes, it prints the </w:t>
+        <w:t xml:space="preserve">The script first </w:t>
+      </w:r>
+      <w:r>
+        <w:rPr>
+          <w:b/>
+        </w:rPr>
+        <w:t>asks you a few simple questions</w:t>
+      </w:r>
+      <w:r>
+        <w:t xml:space="preserve"> — where to keep the data, whether to install the local AI now, and whether to set up the first administrator — each with a sensible default you accept by just pressing </w:t>
+      </w:r>
+      <w:r>
+        <w:rPr>
+          <w:b/>
+        </w:rPr>
+        <w:t>Enter</w:t>
+      </w:r>
+      <w:r>
+        <w:t xml:space="preserve">. Then it does everything automatically. When it finishes, it prints the </w:t>
       </w:r>
       <w:r>
         <w:rPr>
@@ -2821,17 +2839,1038 @@
         <w:t>web address</w:t>
       </w:r>
       <w:r>
-        <w:t xml:space="preserve"> to open and how to create the </w:t>
+        <w:t xml:space="preserve"> to open.</w:t>
+      </w:r>
+    </w:p>
+    <w:tbl>
+      <w:tblPr>
+        <w:tblW w:type="auto" w:w="0"/>
+        <w:jc w:val="center"/>
+        <w:tblLayout w:type="fixed"/>
+        <w:tblLook w:firstColumn="1" w:firstRow="1" w:lastColumn="0" w:lastRow="0" w:noHBand="0" w:noVBand="1" w:val="04A0"/>
+      </w:tblPr>
+      <w:tblGrid>
+        <w:gridCol w:w="9360"/>
+      </w:tblGrid>
+      <w:tr>
+        <w:trPr>
+          <w:cantSplit/>
+        </w:trPr>
+        <w:tc>
+          <w:tcPr>
+            <w:tcW w:type="dxa" w:w="9360"/>
+            <w:shd w:val="clear" w:color="auto" w:fill="E7F0FA"/>
+            <w:tcBorders>
+              <w:top w:val="single" w:sz="4" w:space="0" w:color="2E6DA4"/>
+              <w:left w:val="single" w:sz="30" w:space="0" w:color="2E6DA4"/>
+              <w:bottom w:val="single" w:sz="4" w:space="0" w:color="2E6DA4"/>
+              <w:right w:val="single" w:sz="4" w:space="0" w:color="2E6DA4"/>
+            </w:tcBorders>
+            <w:tcMar>
+              <w:top w:w="110" w:type="dxa"/>
+              <w:start w:w="170" w:type="dxa"/>
+              <w:bottom w:w="110" w:type="dxa"/>
+              <w:end w:w="170" w:type="dxa"/>
+            </w:tcMar>
+          </w:tcPr>
+          <w:p>
+            <w:pPr>
+              <w:spacing w:after="0"/>
+            </w:pPr>
+            <w:r>
+              <w:rPr>
+                <w:b/>
+                <w:color w:val="1F3A5F"/>
+                <w:sz w:val="21"/>
+              </w:rPr>
+              <w:t xml:space="preserve">THE QUESTIONS IT ASKS   </w:t>
+            </w:r>
+            <w:r>
+              <w:rPr>
+                <w:color w:val="222B38"/>
+              </w:rPr>
+              <w:t xml:space="preserve">In order: </w:t>
+            </w:r>
+            <w:r>
+              <w:rPr>
+                <w:b/>
+                <w:color w:val="222B38"/>
+              </w:rPr>
+              <w:t>where to keep the database</w:t>
+            </w:r>
+            <w:r>
+              <w:rPr>
+                <w:color w:val="222B38"/>
+              </w:rPr>
+              <w:t xml:space="preserve"> — on Windows it first asks whether the PC has a </w:t>
+            </w:r>
+            <w:r>
+              <w:rPr>
+                <w:b/>
+                <w:color w:val="222B38"/>
+              </w:rPr>
+              <w:t>second drive</w:t>
+            </w:r>
+            <w:r>
+              <w:rPr>
+                <w:color w:val="222B38"/>
+              </w:rPr>
+              <w:t xml:space="preserve"> and, if so, suggests putting the data there (so it survives a Windows reinstall); </w:t>
+            </w:r>
+            <w:r>
+              <w:rPr>
+                <w:b/>
+                <w:color w:val="222B38"/>
+              </w:rPr>
+              <w:t>install the free local AI?</w:t>
+            </w:r>
+            <w:r>
+              <w:rPr>
+                <w:color w:val="222B38"/>
+              </w:rPr>
+              <w:t xml:space="preserve"> (default No); </w:t>
+            </w:r>
+            <w:r>
+              <w:rPr>
+                <w:b/>
+                <w:color w:val="222B38"/>
+              </w:rPr>
+              <w:t>set up the first administrator now?</w:t>
+            </w:r>
+            <w:r>
+              <w:rPr>
+                <w:color w:val="222B38"/>
+              </w:rPr>
+              <w:t xml:space="preserve"> (default Yes — then it asks for an email and password); and </w:t>
+            </w:r>
+            <w:r>
+              <w:rPr>
+                <w:b/>
+                <w:color w:val="222B38"/>
+              </w:rPr>
+              <w:t>use the standard ports?</w:t>
+            </w:r>
+            <w:r>
+              <w:rPr>
+                <w:color w:val="222B38"/>
+              </w:rPr>
+              <w:t xml:space="preserve"> (default Yes). It shows a summary and asks you to confirm before changing anything. Accept every default and you'll have a working server — you just register the first account afterward.</w:t>
+            </w:r>
+          </w:p>
+        </w:tc>
+      </w:tr>
+    </w:tbl>
+    <w:p>
+      <w:pPr>
+        <w:spacing w:after="80"/>
+      </w:pPr>
+    </w:p>
+    <w:p>
+      <w:pPr>
+        <w:pStyle w:val="Heading2"/>
+      </w:pPr>
+      <w:r>
+        <w:t>Optional: an unattended install (settings file)</w:t>
+      </w:r>
+    </w:p>
+    <w:p>
+      <w:r>
+        <w:t xml:space="preserve">Because the script </w:t>
       </w:r>
       <w:r>
         <w:rPr>
           <w:b/>
         </w:rPr>
-        <w:t>first administrator</w:t>
-      </w:r>
-      <w:r>
-        <w:t xml:space="preserve"> — skip to “Create the first administrator” below.</w:t>
-      </w:r>
+        <w:t>asks</w:t>
+      </w:r>
+      <w:r>
+        <w:t xml:space="preserve"> about the data location, the local AI, and the first administrator, most people never need this. But if you'd rather </w:t>
+      </w:r>
+      <w:r>
+        <w:rPr>
+          <w:b/>
+        </w:rPr>
+        <w:t>not</w:t>
+      </w:r>
+      <w:r>
+        <w:t xml:space="preserve"> be asked — for a hands-off install, or to set up several servers the same way — you can put all the answers in a small </w:t>
+      </w:r>
+      <w:r>
+        <w:rPr>
+          <w:b/>
+        </w:rPr>
+        <w:t>settings file</w:t>
+      </w:r>
+      <w:r>
+        <w:t xml:space="preserve"> and the script will skip the questions and just run. The same file works on both Windows and a Mac.</w:t>
+      </w:r>
+    </w:p>
+    <w:p>
+      <w:pPr>
+        <w:tabs>
+          <w:tab w:pos="547" w:val="left"/>
+        </w:tabs>
+        <w:spacing w:after="100"/>
+        <w:ind w:left="547" w:hanging="547"/>
+      </w:pPr>
+      <w:r>
+        <w:rPr>
+          <w:b/>
+          <w:color w:val="1F3A5F"/>
+        </w:rPr>
+        <w:t>1.</w:t>
+        <w:tab/>
+      </w:r>
+      <w:r>
+        <w:t xml:space="preserve">In the </w:t>
+      </w:r>
+      <w:r>
+        <w:rPr>
+          <w:rFonts w:ascii="Consolas" w:hAnsi="Consolas"/>
+          <w:sz w:val="19"/>
+        </w:rPr>
+        <w:t>scripts</w:t>
+      </w:r>
+      <w:r>
+        <w:t xml:space="preserve"> folder, </w:t>
+      </w:r>
+      <w:r>
+        <w:rPr>
+          <w:b/>
+        </w:rPr>
+        <w:t>make a copy</w:t>
+      </w:r>
+      <w:r>
+        <w:t xml:space="preserve"> of the file </w:t>
+      </w:r>
+      <w:r>
+        <w:rPr>
+          <w:rFonts w:ascii="Consolas" w:hAnsi="Consolas"/>
+          <w:sz w:val="19"/>
+        </w:rPr>
+        <w:t>opentrack-server.sample.conf</w:t>
+      </w:r>
+      <w:r>
+        <w:t xml:space="preserve"> and name the copy </w:t>
+      </w:r>
+      <w:r>
+        <w:rPr>
+          <w:rFonts w:ascii="Consolas" w:hAnsi="Consolas"/>
+          <w:sz w:val="19"/>
+        </w:rPr>
+        <w:t>opentrack-server.conf</w:t>
+      </w:r>
+      <w:r>
+        <w:t>. (Copy, don't rename — keep the original sample as a reference.)</w:t>
+      </w:r>
+    </w:p>
+    <w:p>
+      <w:pPr>
+        <w:tabs>
+          <w:tab w:pos="547" w:val="left"/>
+        </w:tabs>
+        <w:spacing w:after="100"/>
+        <w:ind w:left="547" w:hanging="547"/>
+      </w:pPr>
+      <w:r>
+        <w:rPr>
+          <w:b/>
+          <w:color w:val="1F3A5F"/>
+        </w:rPr>
+        <w:t>2.</w:t>
+        <w:tab/>
+      </w:r>
+      <w:r>
+        <w:rPr>
+          <w:b/>
+        </w:rPr>
+        <w:t>Open</w:t>
+      </w:r>
+      <w:r>
+        <w:t xml:space="preserve"> </w:t>
+      </w:r>
+      <w:r>
+        <w:rPr>
+          <w:rFonts w:ascii="Consolas" w:hAnsi="Consolas"/>
+          <w:sz w:val="19"/>
+        </w:rPr>
+        <w:t>opentrack-server.conf</w:t>
+      </w:r>
+      <w:r>
+        <w:t xml:space="preserve"> in any plain-text editor: </w:t>
+      </w:r>
+      <w:r>
+        <w:rPr>
+          <w:b/>
+        </w:rPr>
+        <w:t>Notepad</w:t>
+      </w:r>
+      <w:r>
+        <w:t xml:space="preserve"> on Windows, or </w:t>
+      </w:r>
+      <w:r>
+        <w:rPr>
+          <w:b/>
+        </w:rPr>
+        <w:t>TextEdit</w:t>
+      </w:r>
+      <w:r>
+        <w:t xml:space="preserve"> on a Mac.</w:t>
+      </w:r>
+    </w:p>
+    <w:p>
+      <w:pPr>
+        <w:tabs>
+          <w:tab w:pos="547" w:val="left"/>
+        </w:tabs>
+        <w:spacing w:after="100"/>
+        <w:ind w:left="547" w:hanging="547"/>
+      </w:pPr>
+      <w:r>
+        <w:rPr>
+          <w:b/>
+          <w:color w:val="1F3A5F"/>
+        </w:rPr>
+        <w:t>3.</w:t>
+        <w:tab/>
+      </w:r>
+      <w:r>
+        <w:rPr>
+          <w:b/>
+        </w:rPr>
+        <w:t>Change only the line(s) you care about</w:t>
+      </w:r>
+      <w:r>
+        <w:t xml:space="preserve"> and leave the rest exactly as they are. Each line is </w:t>
+      </w:r>
+      <w:r>
+        <w:rPr>
+          <w:rFonts w:ascii="Consolas" w:hAnsi="Consolas"/>
+          <w:sz w:val="19"/>
+        </w:rPr>
+        <w:t>Setting = Value</w:t>
+      </w:r>
+      <w:r>
+        <w:t>. The most common changes:</w:t>
+      </w:r>
+    </w:p>
+    <w:tbl>
+      <w:tblPr>
+        <w:tblW w:type="auto" w:w="0"/>
+        <w:jc w:val="center"/>
+        <w:tblLayout w:type="fixed"/>
+        <w:tblLook w:firstColumn="1" w:firstRow="1" w:lastColumn="0" w:lastRow="0" w:noHBand="0" w:noVBand="1" w:val="04A0"/>
+        <w:tblBorders>
+          <w:top w:val="single" w:sz="4" w:space="0" w:color="D7DEE7"/>
+          <w:left w:val="single" w:sz="4" w:space="0" w:color="D7DEE7"/>
+          <w:bottom w:val="single" w:sz="4" w:space="0" w:color="D7DEE7"/>
+          <w:right w:val="single" w:sz="4" w:space="0" w:color="D7DEE7"/>
+          <w:insideH w:val="single" w:sz="4" w:space="0" w:color="D7DEE7"/>
+          <w:insideV w:val="single" w:sz="4" w:space="0" w:color="D7DEE7"/>
+        </w:tblBorders>
+      </w:tblPr>
+      <w:tblGrid>
+        <w:gridCol w:w="4680"/>
+        <w:gridCol w:w="4680"/>
+      </w:tblGrid>
+      <w:tr>
+        <w:trPr>
+          <w:cantSplit/>
+          <w:tblHeader/>
+        </w:trPr>
+        <w:tc>
+          <w:tcPr>
+            <w:tcW w:type="dxa" w:w="4752"/>
+            <w:shd w:val="clear" w:color="auto" w:fill="1F3A5F"/>
+            <w:tcMar>
+              <w:top w:w="70" w:type="dxa"/>
+              <w:start w:w="120" w:type="dxa"/>
+              <w:bottom w:w="70" w:type="dxa"/>
+              <w:end w:w="120" w:type="dxa"/>
+            </w:tcMar>
+          </w:tcPr>
+          <w:p>
+            <w:pPr>
+              <w:spacing w:after="0"/>
+              <w:keepNext/>
+              <w:keepLines/>
+            </w:pPr>
+            <w:r>
+              <w:rPr>
+                <w:rFonts w:ascii="Segoe UI Semibold" w:hAnsi="Segoe UI Semibold"/>
+                <w:b/>
+                <w:color w:val="FFFFFF"/>
+                <w:sz w:val="20"/>
+              </w:rPr>
+              <w:t>If you want to…</w:t>
+            </w:r>
+          </w:p>
+        </w:tc>
+        <w:tc>
+          <w:tcPr>
+            <w:tcW w:type="dxa" w:w="4608"/>
+            <w:shd w:val="clear" w:color="auto" w:fill="1F3A5F"/>
+            <w:tcMar>
+              <w:top w:w="70" w:type="dxa"/>
+              <w:start w:w="120" w:type="dxa"/>
+              <w:bottom w:w="70" w:type="dxa"/>
+              <w:end w:w="120" w:type="dxa"/>
+            </w:tcMar>
+          </w:tcPr>
+          <w:p>
+            <w:pPr>
+              <w:spacing w:after="0"/>
+              <w:keepNext/>
+              <w:keepLines/>
+            </w:pPr>
+            <w:r>
+              <w:rPr>
+                <w:rFonts w:ascii="Segoe UI Semibold" w:hAnsi="Segoe UI Semibold"/>
+                <w:b/>
+                <w:color w:val="FFFFFF"/>
+                <w:sz w:val="20"/>
+              </w:rPr>
+              <w:t>Change this line to…</w:t>
+            </w:r>
+          </w:p>
+        </w:tc>
+      </w:tr>
+      <w:tr>
+        <w:trPr>
+          <w:cantSplit/>
+        </w:trPr>
+        <w:tc>
+          <w:tcPr>
+            <w:tcW w:type="dxa" w:w="4752"/>
+            <w:tcMar>
+              <w:top w:w="60" w:type="dxa"/>
+              <w:start w:w="120" w:type="dxa"/>
+              <w:bottom w:w="60" w:type="dxa"/>
+              <w:end w:w="120" w:type="dxa"/>
+            </w:tcMar>
+          </w:tcPr>
+          <w:p>
+            <w:pPr>
+              <w:spacing w:after="0"/>
+              <w:keepNext/>
+              <w:keepLines/>
+            </w:pPr>
+            <w:r>
+              <w:rPr>
+                <w:sz w:val="19"/>
+              </w:rPr>
+              <w:t xml:space="preserve">Keep the database on the </w:t>
+            </w:r>
+            <w:r>
+              <w:rPr>
+                <w:b/>
+                <w:sz w:val="19"/>
+              </w:rPr>
+              <w:t>D: drive</w:t>
+            </w:r>
+            <w:r>
+              <w:rPr>
+                <w:sz w:val="19"/>
+              </w:rPr>
+              <w:t xml:space="preserve"> (Windows)</w:t>
+            </w:r>
+          </w:p>
+        </w:tc>
+        <w:tc>
+          <w:tcPr>
+            <w:tcW w:type="dxa" w:w="4608"/>
+            <w:tcMar>
+              <w:top w:w="60" w:type="dxa"/>
+              <w:start w:w="120" w:type="dxa"/>
+              <w:bottom w:w="60" w:type="dxa"/>
+              <w:end w:w="120" w:type="dxa"/>
+            </w:tcMar>
+          </w:tcPr>
+          <w:p>
+            <w:pPr>
+              <w:spacing w:after="0"/>
+              <w:keepNext/>
+              <w:keepLines/>
+            </w:pPr>
+            <w:r>
+              <w:rPr>
+                <w:rFonts w:ascii="Consolas" w:hAnsi="Consolas"/>
+                <w:sz w:val="19"/>
+              </w:rPr>
+              <w:t>DataDir = D:\OpenTrackData</w:t>
+            </w:r>
+          </w:p>
+        </w:tc>
+      </w:tr>
+      <w:tr>
+        <w:trPr>
+          <w:cantSplit/>
+        </w:trPr>
+        <w:tc>
+          <w:tcPr>
+            <w:tcW w:type="dxa" w:w="4752"/>
+            <w:shd w:val="clear" w:color="auto" w:fill="F3F6FA"/>
+            <w:tcMar>
+              <w:top w:w="60" w:type="dxa"/>
+              <w:start w:w="120" w:type="dxa"/>
+              <w:bottom w:w="60" w:type="dxa"/>
+              <w:end w:w="120" w:type="dxa"/>
+            </w:tcMar>
+          </w:tcPr>
+          <w:p>
+            <w:pPr>
+              <w:spacing w:after="0"/>
+              <w:keepNext/>
+              <w:keepLines/>
+            </w:pPr>
+            <w:r>
+              <w:rPr>
+                <w:sz w:val="19"/>
+              </w:rPr>
+              <w:t xml:space="preserve">Keep the database in a </w:t>
+            </w:r>
+            <w:r>
+              <w:rPr>
+                <w:b/>
+                <w:sz w:val="19"/>
+              </w:rPr>
+              <w:t>specific folder</w:t>
+            </w:r>
+            <w:r>
+              <w:rPr>
+                <w:sz w:val="19"/>
+              </w:rPr>
+              <w:t xml:space="preserve"> (Mac)</w:t>
+            </w:r>
+          </w:p>
+        </w:tc>
+        <w:tc>
+          <w:tcPr>
+            <w:tcW w:type="dxa" w:w="4608"/>
+            <w:shd w:val="clear" w:color="auto" w:fill="F3F6FA"/>
+            <w:tcMar>
+              <w:top w:w="60" w:type="dxa"/>
+              <w:start w:w="120" w:type="dxa"/>
+              <w:bottom w:w="60" w:type="dxa"/>
+              <w:end w:w="120" w:type="dxa"/>
+            </w:tcMar>
+          </w:tcPr>
+          <w:p>
+            <w:pPr>
+              <w:spacing w:after="0"/>
+              <w:keepNext/>
+              <w:keepLines/>
+            </w:pPr>
+            <w:r>
+              <w:rPr>
+                <w:rFonts w:ascii="Consolas" w:hAnsi="Consolas"/>
+                <w:sz w:val="19"/>
+              </w:rPr>
+              <w:t>DataDir = /Users/Shared/OpenTrack</w:t>
+            </w:r>
+          </w:p>
+        </w:tc>
+      </w:tr>
+      <w:tr>
+        <w:trPr>
+          <w:cantSplit/>
+        </w:trPr>
+        <w:tc>
+          <w:tcPr>
+            <w:tcW w:type="dxa" w:w="4752"/>
+            <w:tcMar>
+              <w:top w:w="60" w:type="dxa"/>
+              <w:start w:w="120" w:type="dxa"/>
+              <w:bottom w:w="60" w:type="dxa"/>
+              <w:end w:w="120" w:type="dxa"/>
+            </w:tcMar>
+          </w:tcPr>
+          <w:p>
+            <w:pPr>
+              <w:spacing w:after="0"/>
+              <w:keepNext/>
+              <w:keepLines/>
+            </w:pPr>
+            <w:r>
+              <w:rPr>
+                <w:sz w:val="19"/>
+              </w:rPr>
+              <w:t xml:space="preserve">Use a different </w:t>
+            </w:r>
+            <w:r>
+              <w:rPr>
+                <w:b/>
+                <w:sz w:val="19"/>
+              </w:rPr>
+              <w:t>browser</w:t>
+            </w:r>
+            <w:r>
+              <w:rPr>
+                <w:sz w:val="19"/>
+              </w:rPr>
+              <w:t xml:space="preserve"> port (default 5035)</w:t>
+            </w:r>
+          </w:p>
+        </w:tc>
+        <w:tc>
+          <w:tcPr>
+            <w:tcW w:type="dxa" w:w="4608"/>
+            <w:tcMar>
+              <w:top w:w="60" w:type="dxa"/>
+              <w:start w:w="120" w:type="dxa"/>
+              <w:bottom w:w="60" w:type="dxa"/>
+              <w:end w:w="120" w:type="dxa"/>
+            </w:tcMar>
+          </w:tcPr>
+          <w:p>
+            <w:pPr>
+              <w:spacing w:after="0"/>
+              <w:keepNext/>
+              <w:keepLines/>
+            </w:pPr>
+            <w:r>
+              <w:rPr>
+                <w:rFonts w:ascii="Consolas" w:hAnsi="Consolas"/>
+                <w:sz w:val="19"/>
+              </w:rPr>
+              <w:t>WebPort = 5035</w:t>
+            </w:r>
+          </w:p>
+        </w:tc>
+      </w:tr>
+      <w:tr>
+        <w:trPr>
+          <w:cantSplit/>
+        </w:trPr>
+        <w:tc>
+          <w:tcPr>
+            <w:tcW w:type="dxa" w:w="4752"/>
+            <w:shd w:val="clear" w:color="auto" w:fill="F3F6FA"/>
+            <w:tcMar>
+              <w:top w:w="60" w:type="dxa"/>
+              <w:start w:w="120" w:type="dxa"/>
+              <w:bottom w:w="60" w:type="dxa"/>
+              <w:end w:w="120" w:type="dxa"/>
+            </w:tcMar>
+          </w:tcPr>
+          <w:p>
+            <w:pPr>
+              <w:spacing w:after="0"/>
+              <w:keepNext/>
+              <w:keepLines/>
+            </w:pPr>
+            <w:r>
+              <w:rPr>
+                <w:sz w:val="19"/>
+              </w:rPr>
+              <w:t xml:space="preserve">Use a different </w:t>
+            </w:r>
+            <w:r>
+              <w:rPr>
+                <w:b/>
+                <w:sz w:val="19"/>
+              </w:rPr>
+              <w:t>desktop-app</w:t>
+            </w:r>
+            <w:r>
+              <w:rPr>
+                <w:sz w:val="19"/>
+              </w:rPr>
+              <w:t xml:space="preserve"> port (default 5003)</w:t>
+            </w:r>
+          </w:p>
+        </w:tc>
+        <w:tc>
+          <w:tcPr>
+            <w:tcW w:type="dxa" w:w="4608"/>
+            <w:shd w:val="clear" w:color="auto" w:fill="F3F6FA"/>
+            <w:tcMar>
+              <w:top w:w="60" w:type="dxa"/>
+              <w:start w:w="120" w:type="dxa"/>
+              <w:bottom w:w="60" w:type="dxa"/>
+              <w:end w:w="120" w:type="dxa"/>
+            </w:tcMar>
+          </w:tcPr>
+          <w:p>
+            <w:pPr>
+              <w:spacing w:after="0"/>
+              <w:keepNext/>
+              <w:keepLines/>
+            </w:pPr>
+            <w:r>
+              <w:rPr>
+                <w:rFonts w:ascii="Consolas" w:hAnsi="Consolas"/>
+                <w:sz w:val="19"/>
+              </w:rPr>
+              <w:t>ApiPort = 5003</w:t>
+            </w:r>
+          </w:p>
+        </w:tc>
+      </w:tr>
+      <w:tr>
+        <w:trPr>
+          <w:cantSplit/>
+        </w:trPr>
+        <w:tc>
+          <w:tcPr>
+            <w:tcW w:type="dxa" w:w="4752"/>
+            <w:tcMar>
+              <w:top w:w="60" w:type="dxa"/>
+              <w:start w:w="120" w:type="dxa"/>
+              <w:bottom w:w="60" w:type="dxa"/>
+              <w:end w:w="120" w:type="dxa"/>
+            </w:tcMar>
+          </w:tcPr>
+          <w:p>
+            <w:pPr>
+              <w:spacing w:after="0"/>
+              <w:keepNext/>
+              <w:keepLines/>
+            </w:pPr>
+            <w:r>
+              <w:rPr>
+                <w:b/>
+                <w:sz w:val="19"/>
+              </w:rPr>
+              <w:t>Install the free local AI</w:t>
+            </w:r>
+            <w:r>
+              <w:rPr>
+                <w:sz w:val="19"/>
+              </w:rPr>
+              <w:t xml:space="preserve"> at the same time</w:t>
+            </w:r>
+          </w:p>
+        </w:tc>
+        <w:tc>
+          <w:tcPr>
+            <w:tcW w:type="dxa" w:w="4608"/>
+            <w:tcMar>
+              <w:top w:w="60" w:type="dxa"/>
+              <w:start w:w="120" w:type="dxa"/>
+              <w:bottom w:w="60" w:type="dxa"/>
+              <w:end w:w="120" w:type="dxa"/>
+            </w:tcMar>
+          </w:tcPr>
+          <w:p>
+            <w:pPr>
+              <w:spacing w:after="0"/>
+              <w:keepNext/>
+              <w:keepLines/>
+            </w:pPr>
+            <w:r>
+              <w:rPr>
+                <w:rFonts w:ascii="Consolas" w:hAnsi="Consolas"/>
+                <w:sz w:val="19"/>
+              </w:rPr>
+              <w:t>InstallAi = true</w:t>
+            </w:r>
+          </w:p>
+        </w:tc>
+      </w:tr>
+      <w:tr>
+        <w:trPr>
+          <w:cantSplit/>
+        </w:trPr>
+        <w:tc>
+          <w:tcPr>
+            <w:tcW w:type="dxa" w:w="4752"/>
+            <w:shd w:val="clear" w:color="auto" w:fill="F3F6FA"/>
+            <w:tcMar>
+              <w:top w:w="60" w:type="dxa"/>
+              <w:start w:w="120" w:type="dxa"/>
+              <w:bottom w:w="60" w:type="dxa"/>
+              <w:end w:w="120" w:type="dxa"/>
+            </w:tcMar>
+          </w:tcPr>
+          <w:p>
+            <w:pPr>
+              <w:spacing w:after="0"/>
+            </w:pPr>
+            <w:r>
+              <w:rPr>
+                <w:b/>
+                <w:sz w:val="19"/>
+              </w:rPr>
+              <w:t>Set the first administrator</w:t>
+            </w:r>
+            <w:r>
+              <w:rPr>
+                <w:sz w:val="19"/>
+              </w:rPr>
+              <w:t xml:space="preserve"> automatically</w:t>
+            </w:r>
+          </w:p>
+        </w:tc>
+        <w:tc>
+          <w:tcPr>
+            <w:tcW w:type="dxa" w:w="4608"/>
+            <w:shd w:val="clear" w:color="auto" w:fill="F3F6FA"/>
+            <w:tcMar>
+              <w:top w:w="60" w:type="dxa"/>
+              <w:start w:w="120" w:type="dxa"/>
+              <w:bottom w:w="60" w:type="dxa"/>
+              <w:end w:w="120" w:type="dxa"/>
+            </w:tcMar>
+          </w:tcPr>
+          <w:p>
+            <w:pPr>
+              <w:spacing w:after="0"/>
+            </w:pPr>
+            <w:r>
+              <w:rPr>
+                <w:rFonts w:ascii="Consolas" w:hAnsi="Consolas"/>
+                <w:sz w:val="19"/>
+              </w:rPr>
+              <w:t>AdminEmail = you@example.com</w:t>
+            </w:r>
+            <w:r>
+              <w:rPr>
+                <w:sz w:val="19"/>
+              </w:rPr>
+              <w:t xml:space="preserve"> (and </w:t>
+            </w:r>
+            <w:r>
+              <w:rPr>
+                <w:rFonts w:ascii="Consolas" w:hAnsi="Consolas"/>
+                <w:sz w:val="19"/>
+              </w:rPr>
+              <w:t>AdminPassword = a-strong-password</w:t>
+            </w:r>
+            <w:r>
+              <w:rPr>
+                <w:sz w:val="19"/>
+              </w:rPr>
+              <w:t>)</w:t>
+            </w:r>
+          </w:p>
+        </w:tc>
+      </w:tr>
+    </w:tbl>
+    <w:p>
+      <w:pPr>
+        <w:spacing w:after="40"/>
+      </w:pPr>
+    </w:p>
+    <w:p>
+      <w:pPr>
+        <w:tabs>
+          <w:tab w:pos="547" w:val="left"/>
+        </w:tabs>
+        <w:spacing w:after="100"/>
+        <w:ind w:left="547" w:hanging="547"/>
+      </w:pPr>
+      <w:r>
+        <w:rPr>
+          <w:b/>
+          <w:color w:val="1F3A5F"/>
+        </w:rPr>
+        <w:t>1.</w:t>
+        <w:tab/>
+      </w:r>
+      <w:r>
+        <w:rPr>
+          <w:b/>
+        </w:rPr>
+        <w:t>Save</w:t>
+      </w:r>
+      <w:r>
+        <w:t xml:space="preserve"> the file.</w:t>
+      </w:r>
+    </w:p>
+    <w:p>
+      <w:pPr>
+        <w:tabs>
+          <w:tab w:pos="547" w:val="left"/>
+        </w:tabs>
+        <w:spacing w:after="100"/>
+        <w:ind w:left="547" w:hanging="547"/>
+      </w:pPr>
+      <w:r>
+        <w:rPr>
+          <w:b/>
+          <w:color w:val="1F3A5F"/>
+        </w:rPr>
+        <w:t>2.</w:t>
+        <w:tab/>
+      </w:r>
+      <w:r>
+        <w:rPr>
+          <w:b/>
+        </w:rPr>
+        <w:t>Run the script the same way as before, but add your settings file</w:t>
+      </w:r>
+      <w:r>
+        <w:t xml:space="preserve"> at the end. On </w:t>
+      </w:r>
+      <w:r>
+        <w:rPr>
+          <w:b/>
+        </w:rPr>
+        <w:t>Windows</w:t>
+      </w:r>
+      <w:r>
+        <w:t>:</w:t>
+      </w:r>
+    </w:p>
+    <w:tbl>
+      <w:tblPr>
+        <w:tblW w:type="auto" w:w="0"/>
+        <w:jc w:val="center"/>
+        <w:tblLayout w:type="fixed"/>
+        <w:tblLook w:firstColumn="1" w:firstRow="1" w:lastColumn="0" w:lastRow="0" w:noHBand="0" w:noVBand="1" w:val="04A0"/>
+      </w:tblPr>
+      <w:tblGrid>
+        <w:gridCol w:w="9360"/>
+      </w:tblGrid>
+      <w:tr>
+        <w:trPr>
+          <w:cantSplit/>
+        </w:trPr>
+        <w:tc>
+          <w:tcPr>
+            <w:tcW w:type="dxa" w:w="9360"/>
+            <w:shd w:val="clear" w:color="auto" w:fill="F3F4F6"/>
+            <w:tcBorders>
+              <w:top w:val="single" w:sz="2" w:space="0" w:color="CBD5E1"/>
+              <w:left w:val="single" w:sz="18" w:space="0" w:color="B7C0CC"/>
+              <w:bottom w:val="single" w:sz="2" w:space="0" w:color="CBD5E1"/>
+              <w:right w:val="single" w:sz="2" w:space="0" w:color="CBD5E1"/>
+            </w:tcBorders>
+            <w:tcMar>
+              <w:top w:w="80" w:type="dxa"/>
+              <w:start w:w="150" w:type="dxa"/>
+              <w:bottom w:w="80" w:type="dxa"/>
+              <w:end w:w="150" w:type="dxa"/>
+            </w:tcMar>
+          </w:tcPr>
+          <w:p>
+            <w:pPr>
+              <w:spacing w:after="0"/>
+            </w:pPr>
+            <w:r>
+              <w:rPr>
+                <w:rFonts w:ascii="Consolas" w:hAnsi="Consolas"/>
+                <w:color w:val="222B38"/>
+                <w:sz w:val="19"/>
+              </w:rPr>
+              <w:t>cd C:\OpenTrack\OpenTrack\scripts</w:t>
+            </w:r>
+          </w:p>
+          <w:p>
+            <w:pPr>
+              <w:spacing w:after="0"/>
+            </w:pPr>
+            <w:r>
+              <w:rPr>
+                <w:rFonts w:ascii="Consolas" w:hAnsi="Consolas"/>
+                <w:color w:val="222B38"/>
+                <w:sz w:val="19"/>
+              </w:rPr>
+              <w:t>powershell -ExecutionPolicy Bypass -File .\Install-OpenTrackServer.ps1 -ConfigFile .\opentrack-server.conf</w:t>
+            </w:r>
+          </w:p>
+        </w:tc>
+      </w:tr>
+    </w:tbl>
+    <w:p>
+      <w:pPr>
+        <w:spacing w:after="60"/>
+      </w:pPr>
+    </w:p>
+    <w:p>
+      <w:pPr>
+        <w:tabs>
+          <w:tab w:pos="547" w:val="left"/>
+        </w:tabs>
+        <w:spacing w:after="100"/>
+        <w:ind w:left="547" w:hanging="547"/>
+      </w:pPr>
+      <w:r>
+        <w:rPr>
+          <w:b/>
+          <w:color w:val="1F3A5F"/>
+        </w:rPr>
+        <w:t>1.</w:t>
+        <w:tab/>
+      </w:r>
+      <w:r>
+        <w:t xml:space="preserve">On a </w:t>
+      </w:r>
+      <w:r>
+        <w:rPr>
+          <w:b/>
+        </w:rPr>
+        <w:t>Mac</w:t>
+      </w:r>
+      <w:r>
+        <w:t>:</w:t>
+      </w:r>
+    </w:p>
+    <w:tbl>
+      <w:tblPr>
+        <w:tblW w:type="auto" w:w="0"/>
+        <w:jc w:val="center"/>
+        <w:tblLayout w:type="fixed"/>
+        <w:tblLook w:firstColumn="1" w:firstRow="1" w:lastColumn="0" w:lastRow="0" w:noHBand="0" w:noVBand="1" w:val="04A0"/>
+      </w:tblPr>
+      <w:tblGrid>
+        <w:gridCol w:w="9360"/>
+      </w:tblGrid>
+      <w:tr>
+        <w:trPr>
+          <w:cantSplit/>
+        </w:trPr>
+        <w:tc>
+          <w:tcPr>
+            <w:tcW w:type="dxa" w:w="9360"/>
+            <w:shd w:val="clear" w:color="auto" w:fill="F3F4F6"/>
+            <w:tcBorders>
+              <w:top w:val="single" w:sz="2" w:space="0" w:color="CBD5E1"/>
+              <w:left w:val="single" w:sz="18" w:space="0" w:color="B7C0CC"/>
+              <w:bottom w:val="single" w:sz="2" w:space="0" w:color="CBD5E1"/>
+              <w:right w:val="single" w:sz="2" w:space="0" w:color="CBD5E1"/>
+            </w:tcBorders>
+            <w:tcMar>
+              <w:top w:w="80" w:type="dxa"/>
+              <w:start w:w="150" w:type="dxa"/>
+              <w:bottom w:w="80" w:type="dxa"/>
+              <w:end w:w="150" w:type="dxa"/>
+            </w:tcMar>
+          </w:tcPr>
+          <w:p>
+            <w:pPr>
+              <w:spacing w:after="0"/>
+            </w:pPr>
+            <w:r>
+              <w:rPr>
+                <w:rFonts w:ascii="Consolas" w:hAnsi="Consolas"/>
+                <w:color w:val="222B38"/>
+                <w:sz w:val="19"/>
+              </w:rPr>
+              <w:t>cd ~/OpenTrack/OpenTrack/scripts</w:t>
+            </w:r>
+          </w:p>
+          <w:p>
+            <w:pPr>
+              <w:spacing w:after="0"/>
+            </w:pPr>
+            <w:r>
+              <w:rPr>
+                <w:rFonts w:ascii="Consolas" w:hAnsi="Consolas"/>
+                <w:color w:val="222B38"/>
+                <w:sz w:val="19"/>
+              </w:rPr>
+              <w:t>./install-opentrack-server.sh --config ./opentrack-server.conf</w:t>
+            </w:r>
+          </w:p>
+        </w:tc>
+      </w:tr>
+    </w:tbl>
+    <w:p>
+      <w:pPr>
+        <w:spacing w:after="60"/>
+      </w:pPr>
     </w:p>
     <w:tbl>
       <w:tblPr>
@@ -2874,83 +3913,26 @@
                 <w:color w:val="2E7D32"/>
                 <w:sz w:val="21"/>
               </w:rPr>
-              <w:t xml:space="preserve">CHANGE PORTS, DATA LOCATION, OR ADD AI   </w:t>
+              <w:t xml:space="preserve">SHORTCUT IF YOU ONLY WANT THE AI   </w:t>
             </w:r>
             <w:r>
               <w:rPr>
                 <w:color w:val="222B38"/>
               </w:rPr>
-              <w:t xml:space="preserve">To change anything — the ports, where the database lives (for example put it on a D: drive), or to install the local AI at the same time — copy </w:t>
+              <w:t xml:space="preserve">If the </w:t>
             </w:r>
             <w:r>
               <w:rPr>
-                <w:rFonts w:ascii="Consolas" w:hAnsi="Consolas"/>
+                <w:b/>
                 <w:color w:val="222B38"/>
-                <w:sz w:val="19"/>
               </w:rPr>
-              <w:t>opentrack-server.sample.conf</w:t>
+              <w:t>only</w:t>
             </w:r>
             <w:r>
               <w:rPr>
                 <w:color w:val="222B38"/>
               </w:rPr>
-              <w:t xml:space="preserve"> to </w:t>
-            </w:r>
-            <w:r>
-              <w:rPr>
-                <w:rFonts w:ascii="Consolas" w:hAnsi="Consolas"/>
-                <w:color w:val="222B38"/>
-                <w:sz w:val="19"/>
-              </w:rPr>
-              <w:t>opentrack-server.conf</w:t>
-            </w:r>
-            <w:r>
-              <w:rPr>
-                <w:color w:val="222B38"/>
-              </w:rPr>
-              <w:t xml:space="preserve">, edit the values, and add </w:t>
-            </w:r>
-            <w:r>
-              <w:rPr>
-                <w:rFonts w:ascii="Consolas" w:hAnsi="Consolas"/>
-                <w:color w:val="222B38"/>
-                <w:sz w:val="19"/>
-              </w:rPr>
-              <w:t>-ConfigFile .\opentrack-server.conf</w:t>
-            </w:r>
-            <w:r>
-              <w:rPr>
-                <w:color w:val="222B38"/>
-              </w:rPr>
-              <w:t xml:space="preserve"> to the command. For example set </w:t>
-            </w:r>
-            <w:r>
-              <w:rPr>
-                <w:rFonts w:ascii="Consolas" w:hAnsi="Consolas"/>
-                <w:color w:val="222B38"/>
-                <w:sz w:val="19"/>
-              </w:rPr>
-              <w:t>DataDir = D:\OpenTrackData</w:t>
-            </w:r>
-            <w:r>
-              <w:rPr>
-                <w:color w:val="222B38"/>
-              </w:rPr>
-              <w:t xml:space="preserve"> to keep data on the D: drive, or </w:t>
-            </w:r>
-            <w:r>
-              <w:rPr>
-                <w:rFonts w:ascii="Consolas" w:hAnsi="Consolas"/>
-                <w:color w:val="222B38"/>
-                <w:sz w:val="19"/>
-              </w:rPr>
-              <w:t>InstallAi = true</w:t>
-            </w:r>
-            <w:r>
-              <w:rPr>
-                <w:color w:val="222B38"/>
-              </w:rPr>
-              <w:t xml:space="preserve"> to also set up the free local AI (Chapter 3). On Windows add the </w:t>
+              <w:t xml:space="preserve"> thing you want to change is turning on the local AI, you don't even need the settings file — just add </w:t>
             </w:r>
             <w:r>
               <w:rPr>
@@ -2964,7 +3946,7 @@
               <w:rPr>
                 <w:color w:val="222B38"/>
               </w:rPr>
-              <w:t xml:space="preserve"> switch; on a Mac use </w:t>
+              <w:t xml:space="preserve"> on Windows (or </w:t>
             </w:r>
             <w:r>
               <w:rPr>
@@ -2978,35 +3960,7 @@
               <w:rPr>
                 <w:color w:val="222B38"/>
               </w:rPr>
-              <w:t xml:space="preserve"> (and </w:t>
-            </w:r>
-            <w:r>
-              <w:rPr>
-                <w:rFonts w:ascii="Consolas" w:hAnsi="Consolas"/>
-                <w:color w:val="222B38"/>
-                <w:sz w:val="19"/>
-              </w:rPr>
-              <w:t>--config</w:t>
-            </w:r>
-            <w:r>
-              <w:rPr>
-                <w:color w:val="222B38"/>
-              </w:rPr>
-              <w:t xml:space="preserve"> instead of </w:t>
-            </w:r>
-            <w:r>
-              <w:rPr>
-                <w:rFonts w:ascii="Consolas" w:hAnsi="Consolas"/>
-                <w:color w:val="222B38"/>
-                <w:sz w:val="19"/>
-              </w:rPr>
-              <w:t>-ConfigFile</w:t>
-            </w:r>
-            <w:r>
-              <w:rPr>
-                <w:color w:val="222B38"/>
-              </w:rPr>
-              <w:t>). The same settings file works for both.</w:t>
+              <w:t xml:space="preserve"> on a Mac) to the end of the normal command from the previous section.</w:t>
             </w:r>
           </w:p>
         </w:tc>

</xml_diff>

<commit_message>
docs: correct the data-folder bullet to match the interactive wizard
The "What the script sets up" bullet said the DB default is C:\OpenTrack\data
and to "change it with DataDir" - stale now that the script asks where to keep
the data. Reworded to reflect the prompt (suggests C:\OpenTrack\data or a second
drive on Windows, /usr/local/opentrack/data on a Mac).

Co-Authored-By: Claude Opus 4.8 <noreply@anthropic.com>
</commit_message>
<xml_diff>
--- a/docs/guides/OpenTrack_Installation_Guide.docx
+++ b/docs/guides/OpenTrack_Installation_Guide.docx
@@ -4065,7 +4065,7 @@
         <w:t>One shared database</w:t>
       </w:r>
       <w:r>
-        <w:t xml:space="preserve"> in your data folder (default </w:t>
+        <w:t xml:space="preserve"> in the data folder you chose when it asked (its suggestion is </w:t>
       </w:r>
       <w:r>
         <w:rPr>
@@ -4075,17 +4075,27 @@
         <w:t>C:\OpenTrack\data</w:t>
       </w:r>
       <w:r>
-        <w:t xml:space="preserve"> — change it with </w:t>
+        <w:t xml:space="preserve">, or a second drive like </w:t>
       </w:r>
       <w:r>
         <w:rPr>
           <w:rFonts w:ascii="Consolas" w:hAnsi="Consolas"/>
           <w:sz w:val="19"/>
         </w:rPr>
-        <w:t>DataDir</w:t>
-      </w:r>
-      <w:r>
-        <w:t>).</w:t>
+        <w:t>D:\OpenTrack\Data</w:t>
+      </w:r>
+      <w:r>
+        <w:t xml:space="preserve">, on Windows; </w:t>
+      </w:r>
+      <w:r>
+        <w:rPr>
+          <w:rFonts w:ascii="Consolas" w:hAnsi="Consolas"/>
+          <w:sz w:val="19"/>
+        </w:rPr>
+        <w:t>/usr/local/opentrack/data</w:t>
+      </w:r>
+      <w:r>
+        <w:t xml:space="preserve"> on a Mac).</w:t>
       </w:r>
     </w:p>
     <w:p>

</xml_diff>

<commit_message>
docs: rewrite install guide for lazy/non-technical readers
Chapter 2 install path made foolproof: an "in a nutshell" summary, every click
spelled out (Step 1/2/3), the real GitHub folder name (OpenTrack-main), and the
"drag the scripts folder into the window" trick so nobody mistypes a path.

Kill the SERVER-IP literal trap everywhere a user acts on it: the admin step,
the Windows/Mac "point the app at the server" steps, the tablet browser step,
and the by-hand check all now say "the same number as the web address, ending
in :5003/:5035" with a concrete example instead of the literal placeholder.

Co-Authored-By: Claude Opus 4.8 <noreply@anthropic.com>
</commit_message>
<xml_diff>
--- a/docs/guides/OpenTrack_Installation_Guide.docx
+++ b/docs/guides/OpenTrack_Installation_Guide.docx
@@ -2053,7 +2053,17 @@
         <w:t>192.168.1.50</w:t>
       </w:r>
       <w:r>
-        <w:t>).</w:t>
+        <w:t xml:space="preserve">) — so wherever you see </w:t>
+      </w:r>
+      <w:r>
+        <w:rPr>
+          <w:rFonts w:ascii="Consolas" w:hAnsi="Consolas"/>
+          <w:sz w:val="19"/>
+        </w:rPr>
+        <w:t>SERVER-IP</w:t>
+      </w:r>
+      <w:r>
+        <w:t>, type that actual number in its place, not the letters “SERVER-IP.”</w:t>
       </w:r>
     </w:p>
     <w:p>
@@ -2251,7 +2261,7 @@
     </w:p>
     <w:p>
       <w:r>
-        <w:t xml:space="preserve">Almost everything in this chapter is automated by a </w:t>
+        <w:t xml:space="preserve">You do not have to be technical to do this. OpenTrack comes with a </w:t>
       </w:r>
       <w:r>
         <w:rPr>
@@ -2260,56 +2270,134 @@
         <w:t>setup script</w:t>
       </w:r>
       <w:r>
-        <w:t xml:space="preserve"> that ships with OpenTrack — a PowerShell script for </w:t>
+        <w:t xml:space="preserve"> that does almost everything for you — it installs the tools it needs, downloads and builds OpenTrack, sets it up to run for your whole network, and starts it. There is a Windows version and a Mac version. You run it once, answer a few simple questions (mostly by just pressing </w:t>
       </w:r>
       <w:r>
         <w:rPr>
           <w:b/>
         </w:rPr>
-        <w:t>Windows</w:t>
-      </w:r>
-      <w:r>
-        <w:t xml:space="preserve"> (</w:t>
-      </w:r>
-      <w:r>
-        <w:rPr>
-          <w:rFonts w:ascii="Consolas" w:hAnsi="Consolas"/>
-          <w:sz w:val="19"/>
-        </w:rPr>
-        <w:t>Install-OpenTrackServer.ps1</w:t>
-      </w:r>
-      <w:r>
-        <w:t xml:space="preserve">) and a bash script for </w:t>
-      </w:r>
-      <w:r>
-        <w:rPr>
-          <w:b/>
-        </w:rPr>
-        <w:t>macOS</w:t>
-      </w:r>
-      <w:r>
-        <w:t xml:space="preserve"> (</w:t>
-      </w:r>
-      <w:r>
-        <w:rPr>
-          <w:rFonts w:ascii="Consolas" w:hAnsi="Consolas"/>
-          <w:sz w:val="19"/>
-        </w:rPr>
-        <w:t>install-opentrack-server.sh</w:t>
-      </w:r>
-      <w:r>
-        <w:t xml:space="preserve">), both in the </w:t>
-      </w:r>
-      <w:r>
-        <w:rPr>
-          <w:rFonts w:ascii="Consolas" w:hAnsi="Consolas"/>
-          <w:sz w:val="19"/>
-        </w:rPr>
-        <w:t>scripts</w:t>
-      </w:r>
-      <w:r>
-        <w:t xml:space="preserve"> folder. Either one installs the tools it needs (the .NET 10 Software Development Kit and Git), downloads and builds OpenTrack, points the web app and the API at one shared database, sets up networking, and registers both programs to start automatically at boot. You run it once; re-run it anytime to update.</w:t>
-      </w:r>
+        <w:t>Enter</w:t>
+      </w:r>
+      <w:r>
+        <w:t>), and you're done.</w:t>
+      </w:r>
+    </w:p>
+    <w:tbl>
+      <w:tblPr>
+        <w:tblW w:type="auto" w:w="0"/>
+        <w:jc w:val="center"/>
+        <w:tblLayout w:type="fixed"/>
+        <w:tblLook w:firstColumn="1" w:firstRow="1" w:lastColumn="0" w:lastRow="0" w:noHBand="0" w:noVBand="1" w:val="04A0"/>
+      </w:tblPr>
+      <w:tblGrid>
+        <w:gridCol w:w="9360"/>
+      </w:tblGrid>
+      <w:tr>
+        <w:trPr>
+          <w:cantSplit/>
+        </w:trPr>
+        <w:tc>
+          <w:tcPr>
+            <w:tcW w:type="dxa" w:w="9360"/>
+            <w:shd w:val="clear" w:color="auto" w:fill="E8F5E9"/>
+            <w:tcBorders>
+              <w:top w:val="single" w:sz="4" w:space="0" w:color="43A047"/>
+              <w:left w:val="single" w:sz="30" w:space="0" w:color="43A047"/>
+              <w:bottom w:val="single" w:sz="4" w:space="0" w:color="43A047"/>
+              <w:right w:val="single" w:sz="4" w:space="0" w:color="43A047"/>
+            </w:tcBorders>
+            <w:tcMar>
+              <w:top w:w="110" w:type="dxa"/>
+              <w:start w:w="170" w:type="dxa"/>
+              <w:bottom w:w="110" w:type="dxa"/>
+              <w:end w:w="170" w:type="dxa"/>
+            </w:tcMar>
+          </w:tcPr>
+          <w:p>
+            <w:pPr>
+              <w:spacing w:after="0"/>
+            </w:pPr>
+            <w:r>
+              <w:rPr>
+                <w:b/>
+                <w:color w:val="2E7D32"/>
+                <w:sz w:val="21"/>
+              </w:rPr>
+              <w:t xml:space="preserve">IN A NUTSHELL   </w:t>
+            </w:r>
+            <w:r>
+              <w:rPr>
+                <w:b/>
+                <w:color w:val="222B38"/>
+              </w:rPr>
+              <w:t>(1)</w:t>
+            </w:r>
+            <w:r>
+              <w:rPr>
+                <w:color w:val="222B38"/>
+              </w:rPr>
+              <w:t xml:space="preserve"> Download the OpenTrack code and unzip it. </w:t>
+            </w:r>
+            <w:r>
+              <w:rPr>
+                <w:b/>
+                <w:color w:val="222B38"/>
+              </w:rPr>
+              <w:t>(2)</w:t>
+            </w:r>
+            <w:r>
+              <w:rPr>
+                <w:color w:val="222B38"/>
+              </w:rPr>
+              <w:t xml:space="preserve"> Run the one setup script. </w:t>
+            </w:r>
+            <w:r>
+              <w:rPr>
+                <w:b/>
+                <w:color w:val="222B38"/>
+              </w:rPr>
+              <w:t>(3)</w:t>
+            </w:r>
+            <w:r>
+              <w:rPr>
+                <w:color w:val="222B38"/>
+              </w:rPr>
+              <w:t xml:space="preserve"> Answer a few questions — or just press </w:t>
+            </w:r>
+            <w:r>
+              <w:rPr>
+                <w:b/>
+                <w:color w:val="222B38"/>
+              </w:rPr>
+              <w:t>Enter</w:t>
+            </w:r>
+            <w:r>
+              <w:rPr>
+                <w:color w:val="222B38"/>
+              </w:rPr>
+              <w:t xml:space="preserve"> for each. </w:t>
+            </w:r>
+            <w:r>
+              <w:rPr>
+                <w:b/>
+                <w:color w:val="222B38"/>
+              </w:rPr>
+              <w:t>(4)</w:t>
+            </w:r>
+            <w:r>
+              <w:rPr>
+                <w:color w:val="222B38"/>
+              </w:rPr>
+              <w:t xml:space="preserve"> Open the web address it prints, and register. That is the whole install; the steps below just walk you through it slowly.</w:t>
+            </w:r>
+          </w:p>
+        </w:tc>
+      </w:tr>
+    </w:tbl>
+    <w:p>
+      <w:pPr>
+        <w:spacing w:after="80"/>
+      </w:pPr>
     </w:p>
     <w:tbl>
       <w:tblPr>
@@ -2371,34 +2459,7 @@
               <w:rPr>
                 <w:color w:val="222B38"/>
               </w:rPr>
-              <w:t xml:space="preserve"> macOS 13+ machine, an internet connection, and about 10–15 minutes. The script needs elevated rights (it runs as </w:t>
-            </w:r>
-            <w:r>
-              <w:rPr>
-                <w:b/>
-                <w:color w:val="222B38"/>
-              </w:rPr>
-              <w:t>Administrator</w:t>
-            </w:r>
-            <w:r>
-              <w:rPr>
-                <w:color w:val="222B38"/>
-              </w:rPr>
-              <w:t xml:space="preserve"> on Windows, or asks for your password for </w:t>
-            </w:r>
-            <w:r>
-              <w:rPr>
-                <w:rFonts w:ascii="Consolas" w:hAnsi="Consolas"/>
-                <w:color w:val="222B38"/>
-                <w:sz w:val="19"/>
-              </w:rPr>
-              <w:t>sudo</w:t>
-            </w:r>
-            <w:r>
-              <w:rPr>
-                <w:color w:val="222B38"/>
-              </w:rPr>
-              <w:t xml:space="preserve"> on a Mac) to set up networking and auto-start. It installs the .NET SDK and Git for you if they're missing.</w:t>
+              <w:t xml:space="preserve"> macOS 13+ computer, an internet connection, and about 10–15 minutes. That is it — the script installs everything else it needs.</w:t>
             </w:r>
           </w:p>
         </w:tc>
@@ -2418,6 +2479,14 @@
       </w:r>
     </w:p>
     <w:p>
+      <w:r>
+        <w:rPr>
+          <w:b/>
+        </w:rPr>
+        <w:t>Step 1 — Download and unzip the OpenTrack code.</w:t>
+      </w:r>
+    </w:p>
+    <w:p>
       <w:pPr>
         <w:tabs>
           <w:tab w:pos="547" w:val="left"/>
@@ -2434,42 +2503,13 @@
         <w:tab/>
       </w:r>
       <w:r>
-        <w:t xml:space="preserve">Get the OpenTrack code onto the server: on the project's GitHub page click the green </w:t>
+        <w:t xml:space="preserve">In a web browser, go to </w:t>
       </w:r>
       <w:r>
         <w:rPr>
           <w:b/>
         </w:rPr>
-        <w:t>Code</w:t>
-      </w:r>
-      <w:r>
-        <w:t xml:space="preserve"> button → </w:t>
-      </w:r>
-      <w:r>
-        <w:rPr>
-          <w:b/>
-        </w:rPr>
-        <w:t>Download ZIP</w:t>
-      </w:r>
-      <w:r>
-        <w:t xml:space="preserve">, then unzip it (for example to </w:t>
-      </w:r>
-      <w:r>
-        <w:rPr>
-          <w:rFonts w:ascii="Consolas" w:hAnsi="Consolas"/>
-          <w:sz w:val="19"/>
-        </w:rPr>
-        <w:t>C:\OpenTrack</w:t>
-      </w:r>
-      <w:r>
-        <w:t xml:space="preserve">). Or, if you already have Git, </w:t>
-      </w:r>
-      <w:r>
-        <w:rPr>
-          <w:rFonts w:ascii="Consolas" w:hAnsi="Consolas"/>
-          <w:sz w:val="19"/>
-        </w:rPr>
-        <w:t>git clone https://github.com/KE4CON/OpenTrack.git</w:t>
+        <w:t>`https://github.com/KE4CON/OpenTrack`</w:t>
       </w:r>
       <w:r>
         <w:t>.</w:t>
@@ -2492,34 +2532,43 @@
         <w:tab/>
       </w:r>
       <w:r>
-        <w:t xml:space="preserve">Open </w:t>
+        <w:t xml:space="preserve">Click the green </w:t>
       </w:r>
       <w:r>
         <w:rPr>
           <w:b/>
         </w:rPr>
-        <w:t>PowerShell as Administrator</w:t>
-      </w:r>
-      <w:r>
-        <w:t xml:space="preserve">: right-click the Start button → </w:t>
+        <w:t>Code</w:t>
+      </w:r>
+      <w:r>
+        <w:t xml:space="preserve"> button, then click </w:t>
       </w:r>
       <w:r>
         <w:rPr>
           <w:b/>
         </w:rPr>
-        <w:t>Terminal (Admin)</w:t>
-      </w:r>
-      <w:r>
-        <w:t xml:space="preserve"> (or </w:t>
+        <w:t>Download ZIP</w:t>
+      </w:r>
+      <w:r>
+        <w:t xml:space="preserve">. A file called </w:t>
       </w:r>
       <w:r>
         <w:rPr>
           <w:b/>
         </w:rPr>
-        <w:t>Windows PowerShell (Admin)</w:t>
-      </w:r>
-      <w:r>
-        <w:t>).</w:t>
+        <w:t>OpenTrack-main.zip</w:t>
+      </w:r>
+      <w:r>
+        <w:t xml:space="preserve"> downloads to your </w:t>
+      </w:r>
+      <w:r>
+        <w:rPr>
+          <w:b/>
+        </w:rPr>
+        <w:t>Downloads</w:t>
+      </w:r>
+      <w:r>
+        <w:t xml:space="preserve"> folder.</w:t>
       </w:r>
     </w:p>
     <w:p>
@@ -2539,17 +2588,331 @@
         <w:tab/>
       </w:r>
       <w:r>
-        <w:t xml:space="preserve">Go to the </w:t>
-      </w:r>
-      <w:r>
-        <w:rPr>
-          <w:rFonts w:ascii="Consolas" w:hAnsi="Consolas"/>
-          <w:sz w:val="19"/>
+        <w:t xml:space="preserve">Open your </w:t>
+      </w:r>
+      <w:r>
+        <w:rPr>
+          <w:b/>
+        </w:rPr>
+        <w:t>Downloads</w:t>
+      </w:r>
+      <w:r>
+        <w:t xml:space="preserve"> folder, </w:t>
+      </w:r>
+      <w:r>
+        <w:rPr>
+          <w:b/>
+        </w:rPr>
+        <w:t>right-click</w:t>
+      </w:r>
+      <w:r>
+        <w:t xml:space="preserve"> the file </w:t>
+      </w:r>
+      <w:r>
+        <w:rPr>
+          <w:b/>
+        </w:rPr>
+        <w:t>OpenTrack-main.zip</w:t>
+      </w:r>
+      <w:r>
+        <w:t xml:space="preserve">, choose </w:t>
+      </w:r>
+      <w:r>
+        <w:rPr>
+          <w:b/>
+        </w:rPr>
+        <w:t>Extract All…</w:t>
+      </w:r>
+      <w:r>
+        <w:t xml:space="preserve">, then click </w:t>
+      </w:r>
+      <w:r>
+        <w:rPr>
+          <w:b/>
+        </w:rPr>
+        <w:t>Extract</w:t>
+      </w:r>
+      <w:r>
+        <w:t xml:space="preserve">. This creates a folder called </w:t>
+      </w:r>
+      <w:r>
+        <w:rPr>
+          <w:b/>
+        </w:rPr>
+        <w:t>OpenTrack-main</w:t>
+      </w:r>
+      <w:r>
+        <w:t>.</w:t>
+      </w:r>
+    </w:p>
+    <w:p>
+      <w:pPr>
+        <w:tabs>
+          <w:tab w:pos="547" w:val="left"/>
+        </w:tabs>
+        <w:spacing w:after="100"/>
+        <w:ind w:left="547" w:hanging="547"/>
+      </w:pPr>
+      <w:r>
+        <w:rPr>
+          <w:b/>
+          <w:color w:val="1F3A5F"/>
+        </w:rPr>
+        <w:t>4.</w:t>
+        <w:tab/>
+      </w:r>
+      <w:r>
+        <w:t xml:space="preserve">Open the </w:t>
+      </w:r>
+      <w:r>
+        <w:rPr>
+          <w:b/>
+        </w:rPr>
+        <w:t>OpenTrack-main</w:t>
+      </w:r>
+      <w:r>
+        <w:t xml:space="preserve"> folder, then open the </w:t>
+      </w:r>
+      <w:r>
+        <w:rPr>
+          <w:b/>
         </w:rPr>
         <w:t>scripts</w:t>
       </w:r>
       <w:r>
-        <w:t xml:space="preserve"> folder inside the code you just unzipped, and run the setup script:</w:t>
+        <w:t xml:space="preserve"> folder inside it. Leave this window open — you will need it in the next steps.</w:t>
+      </w:r>
+    </w:p>
+    <w:p>
+      <w:r>
+        <w:rPr>
+          <w:b/>
+        </w:rPr>
+        <w:t>Step 2 — Open PowerShell as Administrator.</w:t>
+      </w:r>
+    </w:p>
+    <w:p>
+      <w:pPr>
+        <w:tabs>
+          <w:tab w:pos="547" w:val="left"/>
+        </w:tabs>
+        <w:spacing w:after="100"/>
+        <w:ind w:left="547" w:hanging="547"/>
+      </w:pPr>
+      <w:r>
+        <w:rPr>
+          <w:b/>
+          <w:color w:val="1F3A5F"/>
+        </w:rPr>
+        <w:t>1.</w:t>
+        <w:tab/>
+      </w:r>
+      <w:r>
+        <w:rPr>
+          <w:b/>
+        </w:rPr>
+        <w:t>Right-click the Start button</w:t>
+      </w:r>
+      <w:r>
+        <w:t xml:space="preserve"> (the Windows logo in the bottom-left corner of the screen).</w:t>
+      </w:r>
+    </w:p>
+    <w:p>
+      <w:pPr>
+        <w:tabs>
+          <w:tab w:pos="547" w:val="left"/>
+        </w:tabs>
+        <w:spacing w:after="100"/>
+        <w:ind w:left="547" w:hanging="547"/>
+      </w:pPr>
+      <w:r>
+        <w:rPr>
+          <w:b/>
+          <w:color w:val="1F3A5F"/>
+        </w:rPr>
+        <w:t>2.</w:t>
+        <w:tab/>
+      </w:r>
+      <w:r>
+        <w:t xml:space="preserve">Click </w:t>
+      </w:r>
+      <w:r>
+        <w:rPr>
+          <w:b/>
+        </w:rPr>
+        <w:t>Terminal (Admin)</w:t>
+      </w:r>
+      <w:r>
+        <w:t xml:space="preserve"> — or </w:t>
+      </w:r>
+      <w:r>
+        <w:rPr>
+          <w:b/>
+        </w:rPr>
+        <w:t>Windows PowerShell (Admin)</w:t>
+      </w:r>
+      <w:r>
+        <w:t xml:space="preserve"> on older Windows. If Windows asks “Do you want to allow this app to make changes?”, click </w:t>
+      </w:r>
+      <w:r>
+        <w:rPr>
+          <w:b/>
+        </w:rPr>
+        <w:t>Yes</w:t>
+      </w:r>
+      <w:r>
+        <w:t>.</w:t>
+      </w:r>
+    </w:p>
+    <w:p>
+      <w:pPr>
+        <w:tabs>
+          <w:tab w:pos="547" w:val="left"/>
+        </w:tabs>
+        <w:spacing w:after="100"/>
+        <w:ind w:left="547" w:hanging="547"/>
+      </w:pPr>
+      <w:r>
+        <w:rPr>
+          <w:b/>
+          <w:color w:val="1F3A5F"/>
+        </w:rPr>
+        <w:t>3.</w:t>
+        <w:tab/>
+      </w:r>
+      <w:r>
+        <w:t>A dark window with a blinking cursor opens. That is where the next commands go.</w:t>
+      </w:r>
+    </w:p>
+    <w:p>
+      <w:r>
+        <w:rPr>
+          <w:b/>
+        </w:rPr>
+        <w:t>Step 3 — Run the setup script.</w:t>
+      </w:r>
+    </w:p>
+    <w:p>
+      <w:pPr>
+        <w:tabs>
+          <w:tab w:pos="547" w:val="left"/>
+        </w:tabs>
+        <w:spacing w:after="100"/>
+        <w:ind w:left="547" w:hanging="547"/>
+      </w:pPr>
+      <w:r>
+        <w:rPr>
+          <w:b/>
+          <w:color w:val="1F3A5F"/>
+        </w:rPr>
+        <w:t>1.</w:t>
+        <w:tab/>
+      </w:r>
+      <w:r>
+        <w:t xml:space="preserve">In the dark window, type </w:t>
+      </w:r>
+      <w:r>
+        <w:rPr>
+          <w:b/>
+        </w:rPr>
+        <w:t>cd</w:t>
+      </w:r>
+      <w:r>
+        <w:t xml:space="preserve"> followed by </w:t>
+      </w:r>
+      <w:r>
+        <w:rPr>
+          <w:b/>
+        </w:rPr>
+        <w:t>one space</w:t>
+      </w:r>
+      <w:r>
+        <w:t xml:space="preserve"> — but do </w:t>
+      </w:r>
+      <w:r>
+        <w:rPr>
+          <w:b/>
+        </w:rPr>
+        <w:t>not</w:t>
+      </w:r>
+      <w:r>
+        <w:t xml:space="preserve"> press Enter yet.</w:t>
+      </w:r>
+    </w:p>
+    <w:p>
+      <w:pPr>
+        <w:tabs>
+          <w:tab w:pos="547" w:val="left"/>
+        </w:tabs>
+        <w:spacing w:after="100"/>
+        <w:ind w:left="547" w:hanging="547"/>
+      </w:pPr>
+      <w:r>
+        <w:rPr>
+          <w:b/>
+          <w:color w:val="1F3A5F"/>
+        </w:rPr>
+        <w:t>2.</w:t>
+        <w:tab/>
+      </w:r>
+      <w:r>
+        <w:t xml:space="preserve">Now </w:t>
+      </w:r>
+      <w:r>
+        <w:rPr>
+          <w:b/>
+        </w:rPr>
+        <w:t>drag the `scripts` folder</w:t>
+      </w:r>
+      <w:r>
+        <w:t xml:space="preserve"> (from the window you left open in Step 1) </w:t>
+      </w:r>
+      <w:r>
+        <w:rPr>
+          <w:b/>
+        </w:rPr>
+        <w:t>into the dark window</w:t>
+      </w:r>
+      <w:r>
+        <w:t xml:space="preserve">. It types the folder's location for you, so you can't mistype it. Press </w:t>
+      </w:r>
+      <w:r>
+        <w:rPr>
+          <w:b/>
+        </w:rPr>
+        <w:t>Enter</w:t>
+      </w:r>
+      <w:r>
+        <w:t>.</w:t>
+      </w:r>
+    </w:p>
+    <w:p>
+      <w:pPr>
+        <w:tabs>
+          <w:tab w:pos="547" w:val="left"/>
+        </w:tabs>
+        <w:spacing w:after="100"/>
+        <w:ind w:left="547" w:hanging="547"/>
+      </w:pPr>
+      <w:r>
+        <w:rPr>
+          <w:b/>
+          <w:color w:val="1F3A5F"/>
+        </w:rPr>
+        <w:t>3.</w:t>
+        <w:tab/>
+      </w:r>
+      <w:r>
+        <w:t xml:space="preserve">Type (or copy and paste) the line below exactly as shown, then press </w:t>
+      </w:r>
+      <w:r>
+        <w:rPr>
+          <w:b/>
+        </w:rPr>
+        <w:t>Enter</w:t>
+      </w:r>
+      <w:r>
+        <w:t>:</w:t>
       </w:r>
     </w:p>
     <w:tbl>
@@ -2593,19 +2956,6 @@
                 <w:color w:val="222B38"/>
                 <w:sz w:val="19"/>
               </w:rPr>
-              <w:t>cd C:\OpenTrack\OpenTrack\scripts</w:t>
-            </w:r>
-          </w:p>
-          <w:p>
-            <w:pPr>
-              <w:spacing w:after="0"/>
-            </w:pPr>
-            <w:r>
-              <w:rPr>
-                <w:rFonts w:ascii="Consolas" w:hAnsi="Consolas"/>
-                <w:color w:val="222B38"/>
-                <w:sz w:val="19"/>
-              </w:rPr>
               <w:t>powershell -ExecutionPolicy Bypass -File .\Install-OpenTrackServer.ps1</w:t>
             </w:r>
           </w:p>
@@ -2617,12 +2967,105 @@
         <w:spacing w:after="60"/>
       </w:pPr>
     </w:p>
+    <w:tbl>
+      <w:tblPr>
+        <w:tblW w:type="auto" w:w="0"/>
+        <w:jc w:val="center"/>
+        <w:tblLayout w:type="fixed"/>
+        <w:tblLook w:firstColumn="1" w:firstRow="1" w:lastColumn="0" w:lastRow="0" w:noHBand="0" w:noVBand="1" w:val="04A0"/>
+      </w:tblPr>
+      <w:tblGrid>
+        <w:gridCol w:w="9360"/>
+      </w:tblGrid>
+      <w:tr>
+        <w:trPr>
+          <w:cantSplit/>
+        </w:trPr>
+        <w:tc>
+          <w:tcPr>
+            <w:tcW w:type="dxa" w:w="9360"/>
+            <w:shd w:val="clear" w:color="auto" w:fill="E7F0FA"/>
+            <w:tcBorders>
+              <w:top w:val="single" w:sz="4" w:space="0" w:color="2E6DA4"/>
+              <w:left w:val="single" w:sz="30" w:space="0" w:color="2E6DA4"/>
+              <w:bottom w:val="single" w:sz="4" w:space="0" w:color="2E6DA4"/>
+              <w:right w:val="single" w:sz="4" w:space="0" w:color="2E6DA4"/>
+            </w:tcBorders>
+            <w:tcMar>
+              <w:top w:w="110" w:type="dxa"/>
+              <w:start w:w="170" w:type="dxa"/>
+              <w:bottom w:w="110" w:type="dxa"/>
+              <w:end w:w="170" w:type="dxa"/>
+            </w:tcMar>
+          </w:tcPr>
+          <w:p>
+            <w:pPr>
+              <w:spacing w:after="0"/>
+            </w:pPr>
+            <w:r>
+              <w:rPr>
+                <w:b/>
+                <w:color w:val="1F3A5F"/>
+                <w:sz w:val="21"/>
+              </w:rPr>
+              <w:t xml:space="preserve">IF IT MENTIONS “RUNNING SCRIPTS IS DISABLED”   </w:t>
+            </w:r>
+            <w:r>
+              <w:rPr>
+                <w:color w:val="222B38"/>
+              </w:rPr>
+              <w:t xml:space="preserve">The </w:t>
+            </w:r>
+            <w:r>
+              <w:rPr>
+                <w:rFonts w:ascii="Consolas" w:hAnsi="Consolas"/>
+                <w:color w:val="222B38"/>
+                <w:sz w:val="19"/>
+              </w:rPr>
+              <w:t>-ExecutionPolicy Bypass</w:t>
+            </w:r>
+            <w:r>
+              <w:rPr>
+                <w:color w:val="222B38"/>
+              </w:rPr>
+              <w:t xml:space="preserve"> part of that line is what prevents that message, so make sure you typed the </w:t>
+            </w:r>
+            <w:r>
+              <w:rPr>
+                <w:b/>
+                <w:color w:val="222B38"/>
+              </w:rPr>
+              <w:t>whole</w:t>
+            </w:r>
+            <w:r>
+              <w:rPr>
+                <w:color w:val="222B38"/>
+              </w:rPr>
+              <w:t xml:space="preserve"> line, including that part.</w:t>
+            </w:r>
+          </w:p>
+        </w:tc>
+      </w:tr>
+    </w:tbl>
     <w:p>
       <w:pPr>
+        <w:spacing w:after="80"/>
+      </w:pPr>
+    </w:p>
+    <w:p>
+      <w:pPr>
         <w:pStyle w:val="Heading2"/>
       </w:pPr>
       <w:r>
         <w:t>On a Mac</w:t>
+      </w:r>
+    </w:p>
+    <w:p>
+      <w:r>
+        <w:rPr>
+          <w:b/>
+        </w:rPr>
+        <w:t>Step 1 — Download and unzip the OpenTrack code.</w:t>
       </w:r>
     </w:p>
     <w:p>
@@ -2642,35 +3085,70 @@
         <w:tab/>
       </w:r>
       <w:r>
-        <w:t xml:space="preserve">Get the OpenTrack code onto the Mac the same way — </w:t>
+        <w:t xml:space="preserve">In Safari, go to </w:t>
       </w:r>
       <w:r>
         <w:rPr>
           <w:b/>
         </w:rPr>
+        <w:t>`https://github.com/KE4CON/OpenTrack`</w:t>
+      </w:r>
+      <w:r>
+        <w:t xml:space="preserve">, click the green </w:t>
+      </w:r>
+      <w:r>
+        <w:rPr>
+          <w:b/>
+        </w:rPr>
+        <w:t>Code</w:t>
+      </w:r>
+      <w:r>
+        <w:t xml:space="preserve"> button, then </w:t>
+      </w:r>
+      <w:r>
+        <w:rPr>
+          <w:b/>
+        </w:rPr>
         <w:t>Download ZIP</w:t>
       </w:r>
       <w:r>
-        <w:t xml:space="preserve"> from the GitHub </w:t>
+        <w:t xml:space="preserve">. Safari usually unzips it for you into </w:t>
       </w:r>
       <w:r>
         <w:rPr>
           <w:b/>
         </w:rPr>
-        <w:t>Code</w:t>
-      </w:r>
-      <w:r>
-        <w:t xml:space="preserve"> button and unzip it (into your home folder, say), or </w:t>
+        <w:t>Downloads</w:t>
+      </w:r>
+      <w:r>
+        <w:t xml:space="preserve">, leaving a folder called </w:t>
+      </w:r>
+      <w:r>
+        <w:rPr>
+          <w:b/>
+        </w:rPr>
+        <w:t>OpenTrack-main</w:t>
+      </w:r>
+      <w:r>
+        <w:t xml:space="preserve"> (if it does not, double-click the </w:t>
       </w:r>
       <w:r>
         <w:rPr>
           <w:rFonts w:ascii="Consolas" w:hAnsi="Consolas"/>
           <w:sz w:val="19"/>
         </w:rPr>
-        <w:t>git clone</w:t>
-      </w:r>
-      <w:r>
-        <w:t xml:space="preserve"> it if you have Git.</w:t>
+        <w:t>.zip</w:t>
+      </w:r>
+      <w:r>
+        <w:t xml:space="preserve"> file to unzip it).</w:t>
+      </w:r>
+    </w:p>
+    <w:p>
+      <w:r>
+        <w:rPr>
+          <w:b/>
+        </w:rPr>
+        <w:t>Step 2 — Open Terminal and run the script.</w:t>
       </w:r>
     </w:p>
     <w:p>
@@ -2686,7 +3164,7 @@
           <w:b/>
           <w:color w:val="1F3A5F"/>
         </w:rPr>
-        <w:t>2.</w:t>
+        <w:t>1.</w:t>
         <w:tab/>
       </w:r>
       <w:r>
@@ -2699,7 +3177,34 @@
         <w:t>Terminal</w:t>
       </w:r>
       <w:r>
-        <w:t xml:space="preserve"> app (Applications → Utilities → Terminal).</w:t>
+        <w:t xml:space="preserve"> app: press </w:t>
+      </w:r>
+      <w:r>
+        <w:rPr>
+          <w:b/>
+        </w:rPr>
+        <w:t>Cmd+Space</w:t>
+      </w:r>
+      <w:r>
+        <w:t xml:space="preserve">, type </w:t>
+      </w:r>
+      <w:r>
+        <w:rPr>
+          <w:b/>
+        </w:rPr>
+        <w:t>Terminal</w:t>
+      </w:r>
+      <w:r>
+        <w:t xml:space="preserve">, and press </w:t>
+      </w:r>
+      <w:r>
+        <w:rPr>
+          <w:b/>
+        </w:rPr>
+        <w:t>Enter</w:t>
+      </w:r>
+      <w:r>
+        <w:t>.</w:t>
       </w:r>
     </w:p>
     <w:p>
@@ -2715,21 +3220,103 @@
           <w:b/>
           <w:color w:val="1F3A5F"/>
         </w:rPr>
+        <w:t>2.</w:t>
+        <w:tab/>
+      </w:r>
+      <w:r>
+        <w:t xml:space="preserve">Type </w:t>
+      </w:r>
+      <w:r>
+        <w:rPr>
+          <w:b/>
+        </w:rPr>
+        <w:t>cd</w:t>
+      </w:r>
+      <w:r>
+        <w:t xml:space="preserve"> and a </w:t>
+      </w:r>
+      <w:r>
+        <w:rPr>
+          <w:b/>
+        </w:rPr>
+        <w:t>space</w:t>
+      </w:r>
+      <w:r>
+        <w:t xml:space="preserve"> (do not press Enter yet), then </w:t>
+      </w:r>
+      <w:r>
+        <w:rPr>
+          <w:b/>
+        </w:rPr>
+        <w:t>drag the `scripts` folder</w:t>
+      </w:r>
+      <w:r>
+        <w:t xml:space="preserve"> (inside </w:t>
+      </w:r>
+      <w:r>
+        <w:rPr>
+          <w:b/>
+        </w:rPr>
+        <w:t>OpenTrack-main</w:t>
+      </w:r>
+      <w:r>
+        <w:t xml:space="preserve">, in your Downloads) </w:t>
+      </w:r>
+      <w:r>
+        <w:rPr>
+          <w:b/>
+        </w:rPr>
+        <w:t>into the Terminal window</w:t>
+      </w:r>
+      <w:r>
+        <w:t xml:space="preserve"> to fill in its location, and press </w:t>
+      </w:r>
+      <w:r>
+        <w:rPr>
+          <w:b/>
+        </w:rPr>
+        <w:t>Enter</w:t>
+      </w:r>
+      <w:r>
+        <w:t>.</w:t>
+      </w:r>
+    </w:p>
+    <w:p>
+      <w:pPr>
+        <w:tabs>
+          <w:tab w:pos="547" w:val="left"/>
+        </w:tabs>
+        <w:spacing w:after="100"/>
+        <w:ind w:left="547" w:hanging="547"/>
+      </w:pPr>
+      <w:r>
+        <w:rPr>
+          <w:b/>
+          <w:color w:val="1F3A5F"/>
+        </w:rPr>
         <w:t>3.</w:t>
         <w:tab/>
       </w:r>
       <w:r>
-        <w:t xml:space="preserve">Go to the </w:t>
-      </w:r>
-      <w:r>
-        <w:rPr>
-          <w:rFonts w:ascii="Consolas" w:hAnsi="Consolas"/>
-          <w:sz w:val="19"/>
-        </w:rPr>
-        <w:t>scripts</w:t>
-      </w:r>
-      <w:r>
-        <w:t xml:space="preserve"> folder, make the script executable, and run it. It asks for your password once, for the always-on setup:</w:t>
+        <w:t xml:space="preserve">Type the two lines below, pressing </w:t>
+      </w:r>
+      <w:r>
+        <w:rPr>
+          <w:b/>
+        </w:rPr>
+        <w:t>Enter</w:t>
+      </w:r>
+      <w:r>
+        <w:t xml:space="preserve"> after each. It will ask for your Mac password once — the typing stays invisible, which is normal; just type it and press </w:t>
+      </w:r>
+      <w:r>
+        <w:rPr>
+          <w:b/>
+        </w:rPr>
+        <w:t>Enter</w:t>
+      </w:r>
+      <w:r>
+        <w:t>:</w:t>
       </w:r>
     </w:p>
     <w:tbl>
@@ -2763,19 +3350,6 @@
               <w:end w:w="150" w:type="dxa"/>
             </w:tcMar>
           </w:tcPr>
-          <w:p>
-            <w:pPr>
-              <w:spacing w:after="0"/>
-            </w:pPr>
-            <w:r>
-              <w:rPr>
-                <w:rFonts w:ascii="Consolas" w:hAnsi="Consolas"/>
-                <w:color w:val="222B38"/>
-                <w:sz w:val="19"/>
-              </w:rPr>
-              <w:t>cd ~/OpenTrack/OpenTrack/scripts</w:t>
-            </w:r>
-          </w:p>
           <w:p>
             <w:pPr>
               <w:spacing w:after="0"/>
@@ -4207,16 +4781,26 @@
         <w:tab/>
       </w:r>
       <w:r>
-        <w:t xml:space="preserve">On any computer on the network, open the web address the script printed: </w:t>
+        <w:t xml:space="preserve">Look at the lines the script printed when it finished — it shows the </w:t>
       </w:r>
       <w:r>
         <w:rPr>
           <w:b/>
         </w:rPr>
-        <w:t>http://SERVER-IP:5035</w:t>
-      </w:r>
-      <w:r>
-        <w:t>.</w:t>
+        <w:t>exact</w:t>
+      </w:r>
+      <w:r>
+        <w:t xml:space="preserve"> web address to open, something like </w:t>
+      </w:r>
+      <w:r>
+        <w:rPr>
+          <w:rFonts w:ascii="Consolas" w:hAnsi="Consolas"/>
+          <w:sz w:val="19"/>
+        </w:rPr>
+        <w:t>http://192.168.1.50:5035</w:t>
+      </w:r>
+      <w:r>
+        <w:t xml:space="preserve"> (your number will be different).</w:t>
       </w:r>
     </w:p>
     <w:p>
@@ -4236,6 +4820,45 @@
         <w:tab/>
       </w:r>
       <w:r>
+        <w:t xml:space="preserve">On any computer on the same network, type </w:t>
+      </w:r>
+      <w:r>
+        <w:rPr>
+          <w:b/>
+        </w:rPr>
+        <w:t>that exact address</w:t>
+      </w:r>
+      <w:r>
+        <w:t xml:space="preserve"> into a web browser and press Enter. (On the server itself, </w:t>
+      </w:r>
+      <w:r>
+        <w:rPr>
+          <w:rFonts w:ascii="Consolas" w:hAnsi="Consolas"/>
+          <w:sz w:val="19"/>
+        </w:rPr>
+        <w:t>http://localhost:5035</w:t>
+      </w:r>
+      <w:r>
+        <w:t xml:space="preserve"> also works.)</w:t>
+      </w:r>
+    </w:p>
+    <w:p>
+      <w:pPr>
+        <w:tabs>
+          <w:tab w:pos="547" w:val="left"/>
+        </w:tabs>
+        <w:spacing w:after="100"/>
+        <w:ind w:left="547" w:hanging="547"/>
+      </w:pPr>
+      <w:r>
+        <w:rPr>
+          <w:b/>
+          <w:color w:val="1F3A5F"/>
+        </w:rPr>
+        <w:t>3.</w:t>
+        <w:tab/>
+      </w:r>
+      <w:r>
         <w:t xml:space="preserve">Choose </w:t>
       </w:r>
       <w:r>
@@ -4265,6 +4888,126 @@
       <w:r>
         <w:t>. Do this soon, before anyone else.</w:t>
       </w:r>
+    </w:p>
+    <w:tbl>
+      <w:tblPr>
+        <w:tblW w:type="auto" w:w="0"/>
+        <w:jc w:val="center"/>
+        <w:tblLayout w:type="fixed"/>
+        <w:tblLook w:firstColumn="1" w:firstRow="1" w:lastColumn="0" w:lastRow="0" w:noHBand="0" w:noVBand="1" w:val="04A0"/>
+      </w:tblPr>
+      <w:tblGrid>
+        <w:gridCol w:w="9360"/>
+      </w:tblGrid>
+      <w:tr>
+        <w:trPr>
+          <w:cantSplit/>
+        </w:trPr>
+        <w:tc>
+          <w:tcPr>
+            <w:tcW w:type="dxa" w:w="9360"/>
+            <w:shd w:val="clear" w:color="auto" w:fill="FFF4CC"/>
+            <w:tcBorders>
+              <w:top w:val="single" w:sz="4" w:space="0" w:color="E0A800"/>
+              <w:left w:val="single" w:sz="30" w:space="0" w:color="E0A800"/>
+              <w:bottom w:val="single" w:sz="4" w:space="0" w:color="E0A800"/>
+              <w:right w:val="single" w:sz="4" w:space="0" w:color="E0A800"/>
+            </w:tcBorders>
+            <w:tcMar>
+              <w:top w:w="110" w:type="dxa"/>
+              <w:start w:w="170" w:type="dxa"/>
+              <w:bottom w:w="110" w:type="dxa"/>
+              <w:end w:w="170" w:type="dxa"/>
+            </w:tcMar>
+          </w:tcPr>
+          <w:p>
+            <w:pPr>
+              <w:spacing w:after="0"/>
+            </w:pPr>
+            <w:r>
+              <w:rPr>
+                <w:b/>
+                <w:color w:val="8A6D00"/>
+                <w:sz w:val="21"/>
+              </w:rPr>
+              <w:t xml:space="preserve">DON'T TYPE “SERVER-IP” LITERALLY   </w:t>
+            </w:r>
+            <w:r>
+              <w:rPr>
+                <w:color w:val="222B38"/>
+              </w:rPr>
+              <w:t xml:space="preserve">In this guide, </w:t>
+            </w:r>
+            <w:r>
+              <w:rPr>
+                <w:b/>
+                <w:color w:val="222B38"/>
+              </w:rPr>
+              <w:t>SERVER-IP</w:t>
+            </w:r>
+            <w:r>
+              <w:rPr>
+                <w:color w:val="222B38"/>
+              </w:rPr>
+              <w:t xml:space="preserve"> is just a stand-in for your server's own network address — a number like </w:t>
+            </w:r>
+            <w:r>
+              <w:rPr>
+                <w:rFonts w:ascii="Consolas" w:hAnsi="Consolas"/>
+                <w:color w:val="222B38"/>
+                <w:sz w:val="19"/>
+              </w:rPr>
+              <w:t>192.168.1.50</w:t>
+            </w:r>
+            <w:r>
+              <w:rPr>
+                <w:color w:val="222B38"/>
+              </w:rPr>
+              <w:t xml:space="preserve">. Wherever you see something like </w:t>
+            </w:r>
+            <w:r>
+              <w:rPr>
+                <w:rFonts w:ascii="Consolas" w:hAnsi="Consolas"/>
+                <w:color w:val="222B38"/>
+                <w:sz w:val="19"/>
+              </w:rPr>
+              <w:t>http://SERVER-IP:5035</w:t>
+            </w:r>
+            <w:r>
+              <w:rPr>
+                <w:color w:val="222B38"/>
+              </w:rPr>
+              <w:t xml:space="preserve">, type your server's actual number in place of the words </w:t>
+            </w:r>
+            <w:r>
+              <w:rPr>
+                <w:rFonts w:ascii="Consolas" w:hAnsi="Consolas"/>
+                <w:color w:val="222B38"/>
+                <w:sz w:val="19"/>
+              </w:rPr>
+              <w:t>SERVER-IP</w:t>
+            </w:r>
+            <w:r>
+              <w:rPr>
+                <w:color w:val="222B38"/>
+              </w:rPr>
+              <w:t xml:space="preserve">. The easiest way to get it right: </w:t>
+            </w:r>
+            <w:r>
+              <w:rPr>
+                <w:b/>
+                <w:color w:val="222B38"/>
+              </w:rPr>
+              <w:t>copy the exact address the setup script printed.</w:t>
+            </w:r>
+          </w:p>
+        </w:tc>
+      </w:tr>
+    </w:tbl>
+    <w:p>
+      <w:pPr>
+        <w:spacing w:after="80"/>
+      </w:pPr>
     </w:p>
     <w:tbl>
       <w:tblPr>
@@ -5776,16 +6519,27 @@
     </w:p>
     <w:p>
       <w:r>
-        <w:t xml:space="preserve">Now from another computer on the same network, browse to </w:t>
-      </w:r>
-      <w:r>
-        <w:rPr>
-          <w:b/>
-        </w:rPr>
-        <w:t>http://SERVER-IP:5035</w:t>
-      </w:r>
-      <w:r>
-        <w:t xml:space="preserve"> (using the server's address). If the sign-in page loads, your server is reachable. 🎉</w:t>
+        <w:t xml:space="preserve">Now from another computer on the same network, browse to your server's address with </w:t>
+      </w:r>
+      <w:r>
+        <w:rPr>
+          <w:rFonts w:ascii="Consolas" w:hAnsi="Consolas"/>
+          <w:sz w:val="19"/>
+        </w:rPr>
+        <w:t>:5035</w:t>
+      </w:r>
+      <w:r>
+        <w:t xml:space="preserve"> on the end (type the server's actual number, for example </w:t>
+      </w:r>
+      <w:r>
+        <w:rPr>
+          <w:rFonts w:ascii="Consolas" w:hAnsi="Consolas"/>
+          <w:sz w:val="19"/>
+        </w:rPr>
+        <w:t>http://192.168.1.50:5035</w:t>
+      </w:r>
+      <w:r>
+        <w:t>). If the sign-in page loads, your server is reachable. 🎉</w:t>
       </w:r>
     </w:p>
     <w:p>
@@ -8318,16 +9072,54 @@
         <w:t>server address</w:t>
       </w:r>
       <w:r>
-        <w:t xml:space="preserve"> to your Application Programming Interface (API) endpoint: </w:t>
+        <w:t xml:space="preserve">. Use your server's number ending in </w:t>
       </w:r>
       <w:r>
         <w:rPr>
           <w:b/>
         </w:rPr>
-        <w:t>http://SERVER-IP:5003</w:t>
-      </w:r>
-      <w:r>
-        <w:t xml:space="preserve"> (the API port from Chapter 2).</w:t>
+        <w:t>:5003</w:t>
+      </w:r>
+      <w:r>
+        <w:t xml:space="preserve"> — the </w:t>
+      </w:r>
+      <w:r>
+        <w:rPr>
+          <w:b/>
+        </w:rPr>
+        <w:t>same</w:t>
+      </w:r>
+      <w:r>
+        <w:t xml:space="preserve"> number as the web address the setup script printed, just ending in </w:t>
+      </w:r>
+      <w:r>
+        <w:rPr>
+          <w:b/>
+        </w:rPr>
+        <w:t>5003</w:t>
+      </w:r>
+      <w:r>
+        <w:t xml:space="preserve"> instead of 5035. For example, if the web address was </w:t>
+      </w:r>
+      <w:r>
+        <w:rPr>
+          <w:rFonts w:ascii="Consolas" w:hAnsi="Consolas"/>
+          <w:sz w:val="19"/>
+        </w:rPr>
+        <w:t>http://192.168.1.50:5035</w:t>
+      </w:r>
+      <w:r>
+        <w:t xml:space="preserve">, type </w:t>
+      </w:r>
+      <w:r>
+        <w:rPr>
+          <w:rFonts w:ascii="Consolas" w:hAnsi="Consolas"/>
+          <w:sz w:val="19"/>
+        </w:rPr>
+        <w:t>http://192.168.1.50:5003</w:t>
+      </w:r>
+      <w:r>
+        <w:t xml:space="preserve"> here.</w:t>
       </w:r>
     </w:p>
     <w:p>
@@ -9308,16 +10100,44 @@
         <w:t>server address</w:t>
       </w:r>
       <w:r>
-        <w:t xml:space="preserve"> to your Application Programming Interface (API) endpoint: </w:t>
+        <w:t xml:space="preserve"> to your server's number ending in </w:t>
       </w:r>
       <w:r>
         <w:rPr>
           <w:b/>
         </w:rPr>
-        <w:t>http://SERVER-IP:5003</w:t>
-      </w:r>
-      <w:r>
-        <w:t>.</w:t>
+        <w:t>:5003</w:t>
+      </w:r>
+      <w:r>
+        <w:t xml:space="preserve"> — the </w:t>
+      </w:r>
+      <w:r>
+        <w:rPr>
+          <w:b/>
+        </w:rPr>
+        <w:t>same</w:t>
+      </w:r>
+      <w:r>
+        <w:t xml:space="preserve"> number as the web address the setup script printed, just ending in </w:t>
+      </w:r>
+      <w:r>
+        <w:rPr>
+          <w:b/>
+        </w:rPr>
+        <w:t>5003</w:t>
+      </w:r>
+      <w:r>
+        <w:t xml:space="preserve"> instead of 5035 (for example </w:t>
+      </w:r>
+      <w:r>
+        <w:rPr>
+          <w:rFonts w:ascii="Consolas" w:hAnsi="Consolas"/>
+          <w:sz w:val="19"/>
+        </w:rPr>
+        <w:t>http://192.168.1.50:5003</w:t>
+      </w:r>
+      <w:r>
+        <w:t>).</w:t>
       </w:r>
     </w:p>
     <w:p>
@@ -9531,7 +10351,16 @@
         <w:t>no install at all</w:t>
       </w:r>
       <w:r>
-        <w:t>. Just open a browser to:</w:t>
+        <w:t xml:space="preserve">. Just open a browser and go to the </w:t>
+      </w:r>
+      <w:r>
+        <w:rPr>
+          <w:b/>
+        </w:rPr>
+        <w:t>exact same web address the setup script printed</w:t>
+      </w:r>
+      <w:r>
+        <w:t xml:space="preserve"> — the one you used to register on the server. It looks like this (your number will be different):</w:t>
       </w:r>
     </w:p>
     <w:tbl>
@@ -9575,7 +10404,7 @@
                 <w:color w:val="222B38"/>
                 <w:sz w:val="19"/>
               </w:rPr>
-              <w:t>http://SERVER-IP:5035</w:t>
+              <w:t>http://192.168.1.50:5035</w:t>
             </w:r>
           </w:p>
         </w:tc>
@@ -9584,6 +10413,85 @@
     <w:p>
       <w:pPr>
         <w:spacing w:after="60"/>
+      </w:pPr>
+    </w:p>
+    <w:tbl>
+      <w:tblPr>
+        <w:tblW w:type="auto" w:w="0"/>
+        <w:jc w:val="center"/>
+        <w:tblLayout w:type="fixed"/>
+        <w:tblLook w:firstColumn="1" w:firstRow="1" w:lastColumn="0" w:lastRow="0" w:noHBand="0" w:noVBand="1" w:val="04A0"/>
+      </w:tblPr>
+      <w:tblGrid>
+        <w:gridCol w:w="9360"/>
+      </w:tblGrid>
+      <w:tr>
+        <w:trPr>
+          <w:cantSplit/>
+        </w:trPr>
+        <w:tc>
+          <w:tcPr>
+            <w:tcW w:type="dxa" w:w="9360"/>
+            <w:shd w:val="clear" w:color="auto" w:fill="E7F0FA"/>
+            <w:tcBorders>
+              <w:top w:val="single" w:sz="4" w:space="0" w:color="2E6DA4"/>
+              <w:left w:val="single" w:sz="30" w:space="0" w:color="2E6DA4"/>
+              <w:bottom w:val="single" w:sz="4" w:space="0" w:color="2E6DA4"/>
+              <w:right w:val="single" w:sz="4" w:space="0" w:color="2E6DA4"/>
+            </w:tcBorders>
+            <w:tcMar>
+              <w:top w:w="110" w:type="dxa"/>
+              <w:start w:w="170" w:type="dxa"/>
+              <w:bottom w:w="110" w:type="dxa"/>
+              <w:end w:w="170" w:type="dxa"/>
+            </w:tcMar>
+          </w:tcPr>
+          <w:p>
+            <w:pPr>
+              <w:spacing w:after="0"/>
+            </w:pPr>
+            <w:r>
+              <w:rPr>
+                <w:b/>
+                <w:color w:val="1F3A5F"/>
+                <w:sz w:val="21"/>
+              </w:rPr>
+              <w:t xml:space="preserve">USE YOUR SERVER'S REAL NUMBER   </w:t>
+            </w:r>
+            <w:r>
+              <w:rPr>
+                <w:rFonts w:ascii="Consolas" w:hAnsi="Consolas"/>
+                <w:color w:val="222B38"/>
+                <w:sz w:val="19"/>
+              </w:rPr>
+              <w:t>192.168.1.50</w:t>
+            </w:r>
+            <w:r>
+              <w:rPr>
+                <w:color w:val="222B38"/>
+              </w:rPr>
+              <w:t xml:space="preserve"> above is just an example. Type </w:t>
+            </w:r>
+            <w:r>
+              <w:rPr>
+                <w:b/>
+                <w:color w:val="222B38"/>
+              </w:rPr>
+              <w:t>your</w:t>
+            </w:r>
+            <w:r>
+              <w:rPr>
+                <w:color w:val="222B38"/>
+              </w:rPr>
+              <w:t xml:space="preserve"> server's number (the one the setup script printed), not this one. Same address on every device.</w:t>
+            </w:r>
+          </w:p>
+        </w:tc>
+      </w:tr>
+    </w:tbl>
+    <w:p>
+      <w:pPr>
+        <w:spacing w:after="80"/>
       </w:pPr>
     </w:p>
     <w:p>

</xml_diff>

<commit_message>
docs: finish lazy-proofing the install guide (first-run + backups)
First-Run chapter: reassure "you only need to do two things," spell out the
clicks to create a project and add members, and tell readers the optional power
features can wait (pointing to the User Manual, not scattered guides).

Backups chapter: lead with the one-click "Backup & export" that anyone can do;
frame scheduled snapshots as optional/technical; replace hard-coded D:\ paths
with "your data folder"; de-jargon the troubleshooting table (server's actual
number, re-run the script to restore auto-start, API port :5003 vs :5035).

Co-Authored-By: Claude Opus 4.8 <noreply@anthropic.com>
</commit_message>
<xml_diff>
--- a/docs/guides/OpenTrack_Installation_Guide.docx
+++ b/docs/guides/OpenTrack_Installation_Guide.docx
@@ -10856,6 +10856,20 @@
       </w:pPr>
     </w:p>
     <w:p>
+      <w:r>
+        <w:t xml:space="preserve">You now have a working server — nice work. There are only </w:t>
+      </w:r>
+      <w:r>
+        <w:rPr>
+          <w:b/>
+        </w:rPr>
+        <w:t>two things you actually need to do</w:t>
+      </w:r>
+      <w:r>
+        <w:t xml:space="preserve"> here: create a project, and add the people who'll use it. Everything else on this page is optional; turn it on only if you want it.</w:t>
+      </w:r>
+    </w:p>
+    <w:p>
       <w:pPr>
         <w:pStyle w:val="Heading1"/>
       </w:pPr>
@@ -10880,7 +10894,7 @@
         <w:tab/>
       </w:r>
       <w:r>
-        <w:t>Sign in as the administrator.</w:t>
+        <w:t>Sign in with the administrator account you registered earlier.</w:t>
       </w:r>
     </w:p>
     <w:p>
@@ -10900,16 +10914,34 @@
         <w:tab/>
       </w:r>
       <w:r>
-        <w:t xml:space="preserve">Go to </w:t>
+        <w:t xml:space="preserve">In the menu on the </w:t>
       </w:r>
       <w:r>
         <w:rPr>
           <w:b/>
         </w:rPr>
-        <w:t>Projects → New project</w:t>
-      </w:r>
-      <w:r>
-        <w:t>, give it a name (e.g. the name of the software or system you're tracking bugs for), and save.</w:t>
+        <w:t>left side of the screen</w:t>
+      </w:r>
+      <w:r>
+        <w:t xml:space="preserve">, click </w:t>
+      </w:r>
+      <w:r>
+        <w:rPr>
+          <w:b/>
+        </w:rPr>
+        <w:t>Projects</w:t>
+      </w:r>
+      <w:r>
+        <w:t xml:space="preserve">, then click the </w:t>
+      </w:r>
+      <w:r>
+        <w:rPr>
+          <w:b/>
+        </w:rPr>
+        <w:t>New project</w:t>
+      </w:r>
+      <w:r>
+        <w:t xml:space="preserve"> button.</w:t>
       </w:r>
     </w:p>
     <w:p>
@@ -10929,47 +10961,85 @@
         <w:tab/>
       </w:r>
       <w:r>
-        <w:t xml:space="preserve">Open the project and add a couple of </w:t>
+        <w:t xml:space="preserve">Give it a </w:t>
       </w:r>
       <w:r>
         <w:rPr>
           <w:b/>
         </w:rPr>
-        <w:t>categories</w:t>
-      </w:r>
-      <w:r>
-        <w:t xml:space="preserve"> and, if you use them, </w:t>
+        <w:t>name</w:t>
+      </w:r>
+      <w:r>
+        <w:t xml:space="preserve"> (usually the software, system, or thing you're tracking bugs for) and click </w:t>
       </w:r>
       <w:r>
         <w:rPr>
           <w:b/>
         </w:rPr>
-        <w:t>versions</w:t>
-      </w:r>
-      <w:r>
-        <w:t xml:space="preserve"> under </w:t>
-      </w:r>
-      <w:r>
-        <w:rPr>
-          <w:b/>
-        </w:rPr>
-        <w:t>Settings</w:t>
-      </w:r>
-      <w:r>
-        <w:t>.</w:t>
+        <w:t>Create</w:t>
+      </w:r>
+      <w:r>
+        <w:t>. That's the minimum — you have a project now.</w:t>
       </w:r>
     </w:p>
     <w:p>
       <w:pPr>
-        <w:pStyle w:val="Heading1"/>
-      </w:pPr>
-      <w:r>
-        <w:t>Add people and roles</w:t>
+        <w:tabs>
+          <w:tab w:pos="547" w:val="left"/>
+        </w:tabs>
+        <w:spacing w:after="100"/>
+        <w:ind w:left="547" w:hanging="547"/>
+      </w:pPr>
+      <w:r>
+        <w:rPr>
+          <w:b/>
+          <w:color w:val="1F3A5F"/>
+        </w:rPr>
+        <w:t>4.</w:t>
+        <w:tab/>
+      </w:r>
+      <w:r>
+        <w:t xml:space="preserve">Optional: open the project, click </w:t>
+      </w:r>
+      <w:r>
+        <w:rPr>
+          <w:b/>
+        </w:rPr>
+        <w:t>Settings</w:t>
+      </w:r>
+      <w:r>
+        <w:t xml:space="preserve">, and add a few </w:t>
+      </w:r>
+      <w:r>
+        <w:rPr>
+          <w:b/>
+        </w:rPr>
+        <w:t>categories</w:t>
+      </w:r>
+      <w:r>
+        <w:t xml:space="preserve"> (buckets like “User Interface” or “Database”) and, if you track releases, </w:t>
+      </w:r>
+      <w:r>
+        <w:rPr>
+          <w:b/>
+        </w:rPr>
+        <w:t>versions</w:t>
+      </w:r>
+      <w:r>
+        <w:t>.</w:t>
       </w:r>
     </w:p>
     <w:p>
-      <w:r>
-        <w:t xml:space="preserve">Invite the people who'll use OpenTrack and give each the right </w:t>
+      <w:pPr>
+        <w:pStyle w:val="Heading1"/>
+      </w:pPr>
+      <w:r>
+        <w:t>Add the people who'll use it</w:t>
+      </w:r>
+    </w:p>
+    <w:p>
+      <w:r>
+        <w:t xml:space="preserve">Everyone needs their own account, and you give each person a </w:t>
       </w:r>
       <w:r>
         <w:rPr>
@@ -10978,25 +11048,124 @@
         <w:t>role</w:t>
       </w:r>
       <w:r>
-        <w:t xml:space="preserve"> on each project. Roles range from </w:t>
-      </w:r>
+        <w:t xml:space="preserve"> on each project — the role decides what they're allowed to do.</w:t>
+      </w:r>
+    </w:p>
+    <w:p>
+      <w:pPr>
+        <w:tabs>
+          <w:tab w:pos="547" w:val="left"/>
+        </w:tabs>
+        <w:spacing w:after="100"/>
+        <w:ind w:left="547" w:hanging="547"/>
+      </w:pPr>
       <w:r>
         <w:rPr>
           <w:b/>
+          <w:color w:val="1F3A5F"/>
+        </w:rPr>
+        <w:t>1.</w:t>
+        <w:tab/>
+      </w:r>
+      <w:r>
+        <w:t xml:space="preserve">Have each person open your server's web address in a browser and click </w:t>
+      </w:r>
+      <w:r>
+        <w:rPr>
+          <w:b/>
+        </w:rPr>
+        <w:t>Register</w:t>
+      </w:r>
+      <w:r>
+        <w:t xml:space="preserve"> to make an account (or you can do it for them).</w:t>
+      </w:r>
+    </w:p>
+    <w:p>
+      <w:pPr>
+        <w:tabs>
+          <w:tab w:pos="547" w:val="left"/>
+        </w:tabs>
+        <w:spacing w:after="100"/>
+        <w:ind w:left="547" w:hanging="547"/>
+      </w:pPr>
+      <w:r>
+        <w:rPr>
+          <w:b/>
+          <w:color w:val="1F3A5F"/>
+        </w:rPr>
+        <w:t>2.</w:t>
+        <w:tab/>
+      </w:r>
+      <w:r>
+        <w:t xml:space="preserve">Open the project, click </w:t>
+      </w:r>
+      <w:r>
+        <w:rPr>
+          <w:b/>
+        </w:rPr>
+        <w:t>Members</w:t>
+      </w:r>
+      <w:r>
+        <w:t xml:space="preserve">, type the person's </w:t>
+      </w:r>
+      <w:r>
+        <w:rPr>
+          <w:b/>
+        </w:rPr>
+        <w:t>email</w:t>
+      </w:r>
+      <w:r>
+        <w:t xml:space="preserve">, pick a </w:t>
+      </w:r>
+      <w:r>
+        <w:rPr>
+          <w:b/>
+        </w:rPr>
+        <w:t>role</w:t>
+      </w:r>
+      <w:r>
+        <w:t xml:space="preserve">, and click </w:t>
+      </w:r>
+      <w:r>
+        <w:rPr>
+          <w:b/>
+        </w:rPr>
+        <w:t>Add</w:t>
+      </w:r>
+      <w:r>
+        <w:t>.</w:t>
+      </w:r>
+    </w:p>
+    <w:p>
+      <w:r>
+        <w:t xml:space="preserve">Roles go from </w:t>
+      </w:r>
+      <w:r>
+        <w:rPr>
+          <w:b/>
         </w:rPr>
         <w:t>Reporter</w:t>
       </w:r>
       <w:r>
-        <w:t xml:space="preserve"> (can file issues) up through </w:t>
+        <w:t xml:space="preserve"> (can file issues), up through </w:t>
       </w:r>
       <w:r>
         <w:rPr>
           <w:b/>
         </w:rPr>
+        <w:t>Developer</w:t>
+      </w:r>
+      <w:r>
+        <w:t xml:space="preserve"> (can be assigned work), </w:t>
+      </w:r>
+      <w:r>
+        <w:rPr>
+          <w:b/>
+        </w:rPr>
         <w:t>Manager</w:t>
       </w:r>
       <w:r>
-        <w:t xml:space="preserve"> (can configure the project) and </w:t>
+        <w:t xml:space="preserve"> (can change the project's settings), and </w:t>
       </w:r>
       <w:r>
         <w:rPr>
@@ -11005,7 +11174,16 @@
         <w:t>Administrator</w:t>
       </w:r>
       <w:r>
-        <w:t xml:space="preserve"> (runs the whole instance).</w:t>
+        <w:t xml:space="preserve"> (runs everything). A good rule: give each person the </w:t>
+      </w:r>
+      <w:r>
+        <w:rPr>
+          <w:b/>
+        </w:rPr>
+        <w:t>lowest</w:t>
+      </w:r>
+      <w:r>
+        <w:t xml:space="preserve"> role that still lets them do their job.</w:t>
       </w:r>
     </w:p>
     <w:p>
@@ -11499,26 +11677,39 @@
                 <w:color w:val="1F3A5F"/>
                 <w:sz w:val="21"/>
               </w:rPr>
-              <w:t xml:space="preserve">EACH HAS ITS OWN GUIDE   </w:t>
+              <w:t xml:space="preserve">DON'T WORRY ABOUT THESE YET   </w:t>
             </w:r>
             <w:r>
               <w:rPr>
                 <w:color w:val="222B38"/>
               </w:rPr>
-              <w:t xml:space="preserve">The full how-to for the public trouble-ticket intake is in docs/guides/PUBLIC_TICKETS.md, and AI is in docs/guides/AI_ASSIST.md. The upcoming </w:t>
+              <w:t xml:space="preserve">You do </w:t>
             </w:r>
             <w:r>
               <w:rPr>
                 <w:b/>
                 <w:color w:val="222B38"/>
               </w:rPr>
+              <w:t>not</w:t>
+            </w:r>
+            <w:r>
+              <w:rPr>
+                <w:color w:val="222B38"/>
+              </w:rPr>
+              <w:t xml:space="preserve"> need any of these to start using OpenTrack — skip them for now and come back if you ever want them. The </w:t>
+            </w:r>
+            <w:r>
+              <w:rPr>
+                <w:b/>
+                <w:color w:val="222B38"/>
+              </w:rPr>
               <w:t>User Manual</w:t>
             </w:r>
             <w:r>
               <w:rPr>
                 <w:color w:val="222B38"/>
               </w:rPr>
-              <w:t xml:space="preserve"> covers every feature in depth.</w:t>
+              <w:t xml:space="preserve"> explains each one, step by step, when you're ready.</w:t>
             </w:r>
           </w:p>
         </w:tc>
@@ -11701,26 +11892,97 @@
         <w:spacing w:after="40"/>
       </w:pPr>
     </w:p>
+    <w:tbl>
+      <w:tblPr>
+        <w:tblW w:type="auto" w:w="0"/>
+        <w:jc w:val="center"/>
+        <w:tblLayout w:type="fixed"/>
+        <w:tblLook w:firstColumn="1" w:firstRow="1" w:lastColumn="0" w:lastRow="0" w:noHBand="0" w:noVBand="1" w:val="04A0"/>
+      </w:tblPr>
+      <w:tblGrid>
+        <w:gridCol w:w="9360"/>
+      </w:tblGrid>
+      <w:tr>
+        <w:trPr>
+          <w:cantSplit/>
+        </w:trPr>
+        <w:tc>
+          <w:tcPr>
+            <w:tcW w:type="dxa" w:w="9360"/>
+            <w:shd w:val="clear" w:color="auto" w:fill="E8F5E9"/>
+            <w:tcBorders>
+              <w:top w:val="single" w:sz="4" w:space="0" w:color="43A047"/>
+              <w:left w:val="single" w:sz="30" w:space="0" w:color="43A047"/>
+              <w:bottom w:val="single" w:sz="4" w:space="0" w:color="43A047"/>
+              <w:right w:val="single" w:sz="4" w:space="0" w:color="43A047"/>
+            </w:tcBorders>
+            <w:tcMar>
+              <w:top w:w="110" w:type="dxa"/>
+              <w:start w:w="170" w:type="dxa"/>
+              <w:bottom w:w="110" w:type="dxa"/>
+              <w:end w:w="170" w:type="dxa"/>
+            </w:tcMar>
+          </w:tcPr>
+          <w:p>
+            <w:pPr>
+              <w:spacing w:after="0"/>
+            </w:pPr>
+            <w:r>
+              <w:rPr>
+                <w:b/>
+                <w:color w:val="2E7D32"/>
+                <w:sz w:val="21"/>
+              </w:rPr>
+              <w:t xml:space="preserve">THE EASIEST BACKUP — ANYONE CAN DO IT   </w:t>
+            </w:r>
+            <w:r>
+              <w:rPr>
+                <w:color w:val="222B38"/>
+              </w:rPr>
+              <w:t xml:space="preserve">At any time, sign in and click </w:t>
+            </w:r>
+            <w:r>
+              <w:rPr>
+                <w:b/>
+                <w:color w:val="222B38"/>
+              </w:rPr>
+              <w:t>Backup &amp; export</w:t>
+            </w:r>
+            <w:r>
+              <w:rPr>
+                <w:color w:val="222B38"/>
+              </w:rPr>
+              <w:t xml:space="preserve"> in the left menu to download a full copy of your data. No setup, no typing — just click and save the file somewhere safe (do it before any big change). The automatic option below is nicer, but this one click is the simplest safety net.</w:t>
+            </w:r>
+          </w:p>
+        </w:tc>
+      </w:tr>
+    </w:tbl>
     <w:p>
       <w:pPr>
-        <w:pStyle w:val="Heading1"/>
-      </w:pPr>
-      <w:r>
-        <w:t>Turn on automatic backups</w:t>
-      </w:r>
+        <w:spacing w:after="80"/>
+      </w:pPr>
     </w:p>
     <w:p>
-      <w:r>
-        <w:t xml:space="preserve">OpenTrack can write a </w:t>
+      <w:pPr>
+        <w:pStyle w:val="Heading1"/>
+      </w:pPr>
+      <w:r>
+        <w:t>Turn on automatic backups (optional, a bit technical)</w:t>
+      </w:r>
+    </w:p>
+    <w:p>
+      <w:r>
+        <w:t xml:space="preserve">For hands-off safety, OpenTrack can also write a </w:t>
       </w:r>
       <w:r>
         <w:rPr>
           <w:b/>
         </w:rPr>
-        <w:t>consistent snapshot</w:t>
-      </w:r>
-      <w:r>
-        <w:t xml:space="preserve"> of the database on a schedule (safe to run while the app is live). Set these system environment variables on the server and restart the web app:</w:t>
+        <w:t>snapshot</w:t>
+      </w:r>
+      <w:r>
+        <w:t xml:space="preserve"> of the database on a schedule (safe while the app is running). This one is more technical: set these system environment variables on the server and restart the web app. Not comfortable with that? The one-click export above is plenty.</w:t>
       </w:r>
     </w:p>
     <w:tbl>
@@ -12041,10 +12303,9 @@
             </w:pPr>
             <w:r>
               <w:rPr>
-                <w:rFonts w:ascii="Consolas" w:hAnsi="Consolas"/>
                 <w:sz w:val="19"/>
               </w:rPr>
-              <w:t>D:\OpenTrackData\backups</w:t>
+              <w:t>(leave blank)</w:t>
             </w:r>
           </w:p>
         </w:tc>
@@ -12068,7 +12329,20 @@
               <w:rPr>
                 <w:sz w:val="19"/>
               </w:rPr>
-              <w:t>Where snapshots go</w:t>
+              <w:t xml:space="preserve">Where snapshots go — blank means a </w:t>
+            </w:r>
+            <w:r>
+              <w:rPr>
+                <w:rFonts w:ascii="Consolas" w:hAnsi="Consolas"/>
+                <w:sz w:val="19"/>
+              </w:rPr>
+              <w:t>backups</w:t>
+            </w:r>
+            <w:r>
+              <w:rPr>
+                <w:sz w:val="19"/>
+              </w:rPr>
+              <w:t xml:space="preserve"> folder next to your database</w:t>
             </w:r>
           </w:p>
         </w:tc>
@@ -12167,16 +12441,7 @@
         <w:t>opentrack-20260812-013000.db</w:t>
       </w:r>
       <w:r>
-        <w:t xml:space="preserve">. Keeping them on </w:t>
-      </w:r>
-      <w:r>
-        <w:rPr>
-          <w:b/>
-        </w:rPr>
-        <w:t>D:</w:t>
-      </w:r>
-      <w:r>
-        <w:t xml:space="preserve"> puts your app *and* its backups on the drive that survives a Windows reinstall.</w:t>
+        <w:t xml:space="preserve"> and land in your data folder (right next to the database) unless you set a different folder above.</w:t>
       </w:r>
     </w:p>
     <w:p>
@@ -12224,27 +12489,36 @@
         <w:tab/>
       </w:r>
       <w:r>
-        <w:t xml:space="preserve">Copy the snapshot you want over the live database, e.g. copy </w:t>
+        <w:t xml:space="preserve">In your data folder, find the snapshot you want (a file named like </w:t>
       </w:r>
       <w:r>
         <w:rPr>
           <w:rFonts w:ascii="Consolas" w:hAnsi="Consolas"/>
           <w:sz w:val="19"/>
         </w:rPr>
-        <w:t>D:\OpenTrackData\backups\opentrack-YYYYMMDD-HHMMSS.db</w:t>
-      </w:r>
-      <w:r>
-        <w:t xml:space="preserve"> to </w:t>
+        <w:t>opentrack-YYYYMMDD-HHMMSS.db</w:t>
+      </w:r>
+      <w:r>
+        <w:t xml:space="preserve">) and </w:t>
+      </w:r>
+      <w:r>
+        <w:rPr>
+          <w:b/>
+        </w:rPr>
+        <w:t>copy it over</w:t>
+      </w:r>
+      <w:r>
+        <w:t xml:space="preserve"> the live </w:t>
       </w:r>
       <w:r>
         <w:rPr>
           <w:rFonts w:ascii="Consolas" w:hAnsi="Consolas"/>
           <w:sz w:val="19"/>
         </w:rPr>
-        <w:t>D:\OpenTrackData\opentrack.db</w:t>
-      </w:r>
-      <w:r>
-        <w:t xml:space="preserve"> (replacing it).</w:t>
+        <w:t>opentrack.db</w:t>
+      </w:r>
+      <w:r>
+        <w:t>, replacing it.</w:t>
       </w:r>
     </w:p>
     <w:p>
@@ -12308,27 +12582,26 @@
                 <w:color w:val="A32A2A"/>
                 <w:sz w:val="21"/>
               </w:rPr>
-              <w:t xml:space="preserve">BACK UP OFF THE BEELINK TOO   </w:t>
+              <w:t xml:space="preserve">KEEP A COPY OFF THE SERVER   </w:t>
             </w:r>
             <w:r>
               <w:rPr>
                 <w:color w:val="222B38"/>
               </w:rPr>
-              <w:t xml:space="preserve">Scheduled snapshots protect against mistakes and corruption, but they're on the same machine. For real safety, periodically copy the </w:t>
-            </w:r>
-            <w:r>
-              <w:rPr>
-                <w:rFonts w:ascii="Consolas" w:hAnsi="Consolas"/>
+              <w:t xml:space="preserve">Snapshots protect against mistakes and corruption, but they sit on the </w:t>
+            </w:r>
+            <w:r>
+              <w:rPr>
+                <w:b/>
                 <w:color w:val="222B38"/>
-                <w:sz w:val="19"/>
-              </w:rPr>
-              <w:t>backups</w:t>
+              </w:rPr>
+              <w:t>same machine</w:t>
             </w:r>
             <w:r>
               <w:rPr>
                 <w:color w:val="222B38"/>
               </w:rPr>
-              <w:t xml:space="preserve"> folder to another drive or a cloud folder — so a dead server doesn't take your data with it.</w:t>
+              <w:t>. For real safety, every so often copy a snapshot (or a one-click export) to another drive or a cloud folder — so if the whole server ever dies, your data doesn't die with it.</w:t>
             </w:r>
           </w:p>
         </w:tc>
@@ -12523,20 +12796,20 @@
               <w:rPr>
                 <w:sz w:val="19"/>
               </w:rPr>
-              <w:t xml:space="preserve">Firewall rules added (Ch. 2 Step G); using the right </w:t>
+              <w:t xml:space="preserve">You're using the server's </w:t>
             </w:r>
             <w:r>
               <w:rPr>
                 <w:b/>
                 <w:sz w:val="19"/>
               </w:rPr>
-              <w:t>SERVER-IP</w:t>
+              <w:t>actual number</w:t>
             </w:r>
             <w:r>
               <w:rPr>
                 <w:sz w:val="19"/>
               </w:rPr>
-              <w:t xml:space="preserve"> and port; both devices on the same network</w:t>
+              <w:t xml:space="preserve"> (not the words “SERVER-IP”) with the right port; both devices are on the same network; the firewall was opened for both ports</w:t>
             </w:r>
           </w:p>
         </w:tc>
@@ -12566,7 +12839,7 @@
               <w:rPr>
                 <w:sz w:val="19"/>
               </w:rPr>
-              <w:t>Web app loads on the server but not elsewhere</w:t>
+              <w:t>Web app loads on the server but not on other devices</w:t>
             </w:r>
           </w:p>
         </w:tc>
@@ -12591,7 +12864,7 @@
               <w:rPr>
                 <w:sz w:val="19"/>
               </w:rPr>
-              <w:t xml:space="preserve">Programs started with </w:t>
+              <w:t xml:space="preserve">The server must listen on </w:t>
             </w:r>
             <w:r>
               <w:rPr>
@@ -12604,7 +12877,7 @@
               <w:rPr>
                 <w:sz w:val="19"/>
               </w:rPr>
-              <w:t xml:space="preserve"> URLs, not </w:t>
+              <w:t xml:space="preserve">, not </w:t>
             </w:r>
             <w:r>
               <w:rPr>
@@ -12612,6 +12885,12 @@
                 <w:sz w:val="19"/>
               </w:rPr>
               <w:t>localhost</w:t>
+            </w:r>
+            <w:r>
+              <w:rPr>
+                <w:sz w:val="19"/>
+              </w:rPr>
+              <w:t xml:space="preserve"> (the setup script does this automatically — re-run it if unsure)</w:t>
             </w:r>
           </w:p>
         </w:tc>
@@ -12664,7 +12943,7 @@
               <w:rPr>
                 <w:sz w:val="19"/>
               </w:rPr>
-              <w:t xml:space="preserve">Its server address points at the </w:t>
+              <w:t xml:space="preserve">Its server address must end in the </w:t>
             </w:r>
             <w:r>
               <w:rPr>
@@ -12677,7 +12956,20 @@
               <w:rPr>
                 <w:sz w:val="19"/>
               </w:rPr>
-              <w:t xml:space="preserve"> port (5003), not the web port</w:t>
+              <w:t xml:space="preserve"> port </w:t>
+            </w:r>
+            <w:r>
+              <w:rPr>
+                <w:b/>
+                <w:sz w:val="19"/>
+              </w:rPr>
+              <w:t>:5003</w:t>
+            </w:r>
+            <w:r>
+              <w:rPr>
+                <w:sz w:val="19"/>
+              </w:rPr>
+              <w:t>, not the web port :5035</w:t>
             </w:r>
           </w:p>
         </w:tc>
@@ -12707,7 +12999,7 @@
               <w:rPr>
                 <w:sz w:val="19"/>
               </w:rPr>
-              <w:t>✨ AI button missing</w:t>
+              <w:t>✨ AI button is missing</w:t>
             </w:r>
           </w:p>
         </w:tc>
@@ -12730,16 +13022,22 @@
             </w:pPr>
             <w:r>
               <w:rPr>
-                <w:rFonts w:ascii="Consolas" w:hAnsi="Consolas"/>
                 <w:sz w:val="19"/>
               </w:rPr>
-              <w:t>OpenTrack__Ai__Enabled=true</w:t>
-            </w:r>
-            <w:r>
-              <w:rPr>
+              <w:t xml:space="preserve">AI wasn't turned on — re-run the setup script and answer </w:t>
+            </w:r>
+            <w:r>
+              <w:rPr>
+                <w:b/>
                 <w:sz w:val="19"/>
               </w:rPr>
-              <w:t xml:space="preserve"> and the model/endpoint set; app restarted</w:t>
+              <w:t>Yes</w:t>
+            </w:r>
+            <w:r>
+              <w:rPr>
+                <w:sz w:val="19"/>
+              </w:rPr>
+              <w:t xml:space="preserve"> to the local-AI question (or set it up in Chapter 3)</w:t>
             </w:r>
           </w:p>
         </w:tc>
@@ -12766,7 +13064,7 @@
               <w:rPr>
                 <w:sz w:val="19"/>
               </w:rPr>
-              <w:t>Server didn't come back after reboot</w:t>
+              <w:t>Server didn't come back after a reboot</w:t>
             </w:r>
           </w:p>
         </w:tc>
@@ -12788,7 +13086,7 @@
               <w:rPr>
                 <w:sz w:val="19"/>
               </w:rPr>
-              <w:t>The two scheduled tasks exist and set the port (Ch. 2 Step I)</w:t>
+              <w:t>The auto-start didn't register — just re-run the setup script; it puts it back</w:t>
             </w:r>
           </w:p>
         </w:tc>

</xml_diff>